<commit_message>
Learning Material PyPDF2,Sentence Transformers
</commit_message>
<xml_diff>
--- a/Learning_material.docx
+++ b/Learning_material.docx
@@ -3364,6 +3364,4226 @@
         </w:rPr>
         <w:t>) – Moves a file or folder from one place to another.</w:t>
       </w:r>
+    </w:p>
+    <w:p>
+      <w:pPr>
+        <w:pStyle w:val="ListParagraph"/>
+        <w:rPr>
+          <w:lang w:val="en-US"/>
+        </w:rPr>
+      </w:pPr>
+    </w:p>
+    <w:p>
+      <w:pPr>
+        <w:pStyle w:val="ListParagraph"/>
+        <w:rPr>
+          <w:b/>
+          <w:bCs/>
+          <w:sz w:val="28"/>
+          <w:szCs w:val="28"/>
+        </w:rPr>
+      </w:pPr>
+      <w:r>
+        <w:rPr>
+          <w:b/>
+          <w:bCs/>
+          <w:sz w:val="28"/>
+          <w:szCs w:val="28"/>
+        </w:rPr>
+        <w:t>What are Sentence Transformers?</w:t>
+      </w:r>
+    </w:p>
+    <w:p>
+      <w:pPr>
+        <w:pStyle w:val="ListParagraph"/>
+      </w:pPr>
+      <w:r>
+        <w:t>Sentence Transformers is a Python library for generating dense vector representations (embeddings) for whole sentences, paragraphs, or documents.</w:t>
+      </w:r>
+    </w:p>
+    <w:p>
+      <w:pPr>
+        <w:pStyle w:val="ListParagraph"/>
+      </w:pPr>
+      <w:r>
+        <w:t> </w:t>
+      </w:r>
+    </w:p>
+    <w:p>
+      <w:pPr>
+        <w:pStyle w:val="ListParagraph"/>
+      </w:pPr>
+      <w:r>
+        <w:rPr>
+          <w:rFonts w:ascii="Segoe UI Emoji" w:hAnsi="Segoe UI Emoji" w:cs="Segoe UI Emoji"/>
+        </w:rPr>
+        <w:t>👉</w:t>
+      </w:r>
+      <w:r>
+        <w:t xml:space="preserve"> Unlike standard BERT, which gives you embeddings for each token (word piece), Sentence Transformers combines those into a single fixed-size vector for the entire input.</w:t>
+      </w:r>
+    </w:p>
+    <w:p>
+      <w:pPr>
+        <w:pStyle w:val="ListParagraph"/>
+      </w:pPr>
+      <w:r>
+        <w:t> </w:t>
+      </w:r>
+    </w:p>
+    <w:p>
+      <w:pPr>
+        <w:pStyle w:val="ListParagraph"/>
+      </w:pPr>
+      <w:r>
+        <w:rPr>
+          <w:rFonts w:ascii="Segoe UI Emoji" w:hAnsi="Segoe UI Emoji" w:cs="Segoe UI Emoji"/>
+        </w:rPr>
+        <w:t>👉</w:t>
+      </w:r>
+      <w:r>
+        <w:t xml:space="preserve"> These embeddings capture meaning, so that:</w:t>
+      </w:r>
+    </w:p>
+    <w:p>
+      <w:pPr>
+        <w:pStyle w:val="ListParagraph"/>
+      </w:pPr>
+      <w:r>
+        <w:t> </w:t>
+      </w:r>
+    </w:p>
+    <w:p>
+      <w:pPr>
+        <w:pStyle w:val="ListParagraph"/>
+      </w:pPr>
+      <w:r>
+        <w:t>Similar sentences have embeddings that are close together in vector space.</w:t>
+      </w:r>
+    </w:p>
+    <w:p>
+      <w:pPr>
+        <w:pStyle w:val="ListParagraph"/>
+      </w:pPr>
+      <w:r>
+        <w:t> </w:t>
+      </w:r>
+    </w:p>
+    <w:p>
+      <w:pPr>
+        <w:pStyle w:val="ListParagraph"/>
+      </w:pPr>
+      <w:r>
+        <w:t>Dissimilar ones are far apart.</w:t>
+      </w:r>
+    </w:p>
+    <w:p>
+      <w:pPr>
+        <w:pStyle w:val="ListParagraph"/>
+      </w:pPr>
+      <w:r>
+        <w:t> </w:t>
+      </w:r>
+    </w:p>
+    <w:p>
+      <w:pPr>
+        <w:pStyle w:val="ListParagraph"/>
+      </w:pPr>
+      <w:r>
+        <w:t>It’s perfect for:</w:t>
+      </w:r>
+    </w:p>
+    <w:p>
+      <w:pPr>
+        <w:pStyle w:val="ListParagraph"/>
+      </w:pPr>
+      <w:r>
+        <w:rPr>
+          <w:rFonts w:ascii="Segoe UI Emoji" w:hAnsi="Segoe UI Emoji" w:cs="Segoe UI Emoji"/>
+        </w:rPr>
+        <w:t>✅</w:t>
+      </w:r>
+      <w:r>
+        <w:t xml:space="preserve"> Semantic similarity (e.g., “How similar are these two texts?”)</w:t>
+      </w:r>
+    </w:p>
+    <w:p>
+      <w:pPr>
+        <w:pStyle w:val="ListParagraph"/>
+      </w:pPr>
+      <w:r>
+        <w:rPr>
+          <w:rFonts w:ascii="Segoe UI Emoji" w:hAnsi="Segoe UI Emoji" w:cs="Segoe UI Emoji"/>
+        </w:rPr>
+        <w:t>✅</w:t>
+      </w:r>
+      <w:r>
+        <w:t xml:space="preserve"> Semantic search (finding text that matches a query by meaning)</w:t>
+      </w:r>
+    </w:p>
+    <w:p>
+      <w:pPr>
+        <w:pStyle w:val="ListParagraph"/>
+      </w:pPr>
+      <w:r>
+        <w:rPr>
+          <w:rFonts w:ascii="Segoe UI Emoji" w:hAnsi="Segoe UI Emoji" w:cs="Segoe UI Emoji"/>
+        </w:rPr>
+        <w:t>✅</w:t>
+      </w:r>
+      <w:r>
+        <w:t xml:space="preserve"> Clustering</w:t>
+      </w:r>
+    </w:p>
+    <w:p>
+      <w:pPr>
+        <w:pStyle w:val="ListParagraph"/>
+      </w:pPr>
+      <w:r>
+        <w:rPr>
+          <w:rFonts w:ascii="Segoe UI Emoji" w:hAnsi="Segoe UI Emoji" w:cs="Segoe UI Emoji"/>
+        </w:rPr>
+        <w:t>✅</w:t>
+      </w:r>
+      <w:r>
+        <w:t xml:space="preserve"> Paraphrase mining</w:t>
+      </w:r>
+    </w:p>
+    <w:p>
+      <w:pPr>
+        <w:pStyle w:val="ListParagraph"/>
+      </w:pPr>
+      <w:r>
+        <w:rPr>
+          <w:rFonts w:ascii="Segoe UI Emoji" w:hAnsi="Segoe UI Emoji" w:cs="Segoe UI Emoji"/>
+        </w:rPr>
+        <w:t>✅</w:t>
+      </w:r>
+      <w:r>
+        <w:t xml:space="preserve"> Information retrieval (like matching resumes to JDs!)</w:t>
+      </w:r>
+    </w:p>
+    <w:p>
+      <w:pPr>
+        <w:pStyle w:val="ListParagraph"/>
+      </w:pPr>
+      <w:r>
+        <w:t> </w:t>
+      </w:r>
+    </w:p>
+    <w:p>
+      <w:pPr>
+        <w:pStyle w:val="ListParagraph"/>
+      </w:pPr>
+      <w:r>
+        <w:rPr>
+          <w:rFonts w:ascii="Segoe UI Emoji" w:hAnsi="Segoe UI Emoji" w:cs="Segoe UI Emoji"/>
+        </w:rPr>
+        <w:t>📚</w:t>
+      </w:r>
+      <w:r>
+        <w:t xml:space="preserve"> How does it work?</w:t>
+      </w:r>
+    </w:p>
+    <w:p>
+      <w:pPr>
+        <w:pStyle w:val="ListParagraph"/>
+      </w:pPr>
+      <w:r>
+        <w:t xml:space="preserve">It uses a Transformer model (like BERT, </w:t>
+      </w:r>
+      <w:proofErr w:type="spellStart"/>
+      <w:r>
+        <w:t>RoBERTa</w:t>
+      </w:r>
+      <w:proofErr w:type="spellEnd"/>
+      <w:r>
+        <w:t xml:space="preserve">, or </w:t>
+      </w:r>
+      <w:proofErr w:type="spellStart"/>
+      <w:r>
+        <w:t>MiniLM</w:t>
+      </w:r>
+      <w:proofErr w:type="spellEnd"/>
+      <w:r>
+        <w:t>) trained to create embeddings that make semantic similarity tasks easy.</w:t>
+      </w:r>
+    </w:p>
+    <w:p>
+      <w:pPr>
+        <w:pStyle w:val="ListParagraph"/>
+      </w:pPr>
+      <w:r>
+        <w:t> </w:t>
+      </w:r>
+    </w:p>
+    <w:p>
+      <w:pPr>
+        <w:pStyle w:val="ListParagraph"/>
+      </w:pPr>
+      <w:r>
+        <w:t>You don’t need to build or train it from scratch — just use a pre-trained model!</w:t>
+      </w:r>
+    </w:p>
+    <w:p>
+      <w:pPr>
+        <w:pStyle w:val="ListParagraph"/>
+      </w:pPr>
+      <w:r>
+        <w:t> </w:t>
+      </w:r>
+    </w:p>
+    <w:p>
+      <w:pPr>
+        <w:pStyle w:val="ListParagraph"/>
+      </w:pPr>
+      <w:r>
+        <w:t>Common models: 'all-MiniLM-L6-v2' (small, fast, accurate) or 'paraphrase-MiniLM-L6-v2'.</w:t>
+      </w:r>
+    </w:p>
+    <w:p>
+      <w:pPr>
+        <w:pStyle w:val="ListParagraph"/>
+      </w:pPr>
+      <w:r>
+        <w:t> </w:t>
+      </w:r>
+    </w:p>
+    <w:p>
+      <w:pPr>
+        <w:pStyle w:val="ListParagraph"/>
+      </w:pPr>
+      <w:r>
+        <w:rPr>
+          <w:rFonts w:ascii="Segoe UI Emoji" w:hAnsi="Segoe UI Emoji" w:cs="Segoe UI Emoji"/>
+        </w:rPr>
+        <w:t>⚙️</w:t>
+      </w:r>
+      <w:r>
+        <w:t xml:space="preserve"> </w:t>
+      </w:r>
+      <w:r>
+        <w:rPr>
+          <w:b/>
+          <w:bCs/>
+        </w:rPr>
+        <w:t>How to install</w:t>
+      </w:r>
+    </w:p>
+    <w:p>
+      <w:pPr>
+        <w:pStyle w:val="ListParagraph"/>
+      </w:pPr>
+      <w:r>
+        <w:t>bash</w:t>
+      </w:r>
+    </w:p>
+    <w:p>
+      <w:pPr>
+        <w:pStyle w:val="ListParagraph"/>
+      </w:pPr>
+      <w:r>
+        <w:t>Copy code</w:t>
+      </w:r>
+    </w:p>
+    <w:p>
+      <w:pPr>
+        <w:pStyle w:val="ListParagraph"/>
+      </w:pPr>
+      <w:r>
+        <w:t>pip install sentence-transformers</w:t>
+      </w:r>
+    </w:p>
+    <w:p>
+      <w:pPr>
+        <w:pStyle w:val="ListParagraph"/>
+      </w:pPr>
+      <w:r>
+        <w:rPr>
+          <w:rFonts w:ascii="Segoe UI Emoji" w:hAnsi="Segoe UI Emoji" w:cs="Segoe UI Emoji"/>
+        </w:rPr>
+        <w:t>✅</w:t>
+      </w:r>
+      <w:r>
+        <w:t xml:space="preserve"> Basic Example</w:t>
+      </w:r>
+    </w:p>
+    <w:p>
+      <w:pPr>
+        <w:pStyle w:val="ListParagraph"/>
+      </w:pPr>
+      <w:r>
+        <w:rPr>
+          <w:rFonts w:ascii="Segoe UI Emoji" w:hAnsi="Segoe UI Emoji" w:cs="Segoe UI Emoji"/>
+        </w:rPr>
+        <w:t>👉</w:t>
+      </w:r>
+      <w:r>
+        <w:t xml:space="preserve"> Example 1: Compare two sentences</w:t>
+      </w:r>
+    </w:p>
+    <w:p>
+      <w:pPr>
+        <w:pStyle w:val="ListParagraph"/>
+      </w:pPr>
+      <w:r>
+        <w:t>python</w:t>
+      </w:r>
+    </w:p>
+    <w:p>
+      <w:pPr>
+        <w:pStyle w:val="ListParagraph"/>
+      </w:pPr>
+      <w:r>
+        <w:t>Copy code</w:t>
+      </w:r>
+    </w:p>
+    <w:p>
+      <w:pPr>
+        <w:pStyle w:val="ListParagraph"/>
+      </w:pPr>
+      <w:r>
+        <w:t xml:space="preserve">from </w:t>
+      </w:r>
+      <w:proofErr w:type="spellStart"/>
+      <w:r>
+        <w:t>sentence_transformers</w:t>
+      </w:r>
+      <w:proofErr w:type="spellEnd"/>
+      <w:r>
+        <w:t xml:space="preserve"> import </w:t>
+      </w:r>
+      <w:proofErr w:type="spellStart"/>
+      <w:r>
+        <w:t>SentenceTransformer</w:t>
+      </w:r>
+      <w:proofErr w:type="spellEnd"/>
+      <w:r>
+        <w:t>, util</w:t>
+      </w:r>
+    </w:p>
+    <w:p>
+      <w:pPr>
+        <w:pStyle w:val="ListParagraph"/>
+      </w:pPr>
+      <w:r>
+        <w:t> </w:t>
+      </w:r>
+    </w:p>
+    <w:p>
+      <w:pPr>
+        <w:pStyle w:val="ListParagraph"/>
+      </w:pPr>
+      <w:r>
+        <w:t># Load a pre-trained sentence transformer model</w:t>
+      </w:r>
+    </w:p>
+    <w:p>
+      <w:pPr>
+        <w:pStyle w:val="ListParagraph"/>
+      </w:pPr>
+      <w:r>
+        <w:t xml:space="preserve">model = </w:t>
+      </w:r>
+      <w:proofErr w:type="spellStart"/>
+      <w:r>
+        <w:t>SentenceTransformer</w:t>
+      </w:r>
+      <w:proofErr w:type="spellEnd"/>
+      <w:r>
+        <w:t>('all-MiniLM-L6-v2')</w:t>
+      </w:r>
+    </w:p>
+    <w:p>
+      <w:pPr>
+        <w:pStyle w:val="ListParagraph"/>
+      </w:pPr>
+      <w:r>
+        <w:t> </w:t>
+      </w:r>
+    </w:p>
+    <w:p>
+      <w:pPr>
+        <w:pStyle w:val="ListParagraph"/>
+      </w:pPr>
+      <w:r>
+        <w:lastRenderedPageBreak/>
+        <w:t># Two example sentences</w:t>
+      </w:r>
+    </w:p>
+    <w:p>
+      <w:pPr>
+        <w:pStyle w:val="ListParagraph"/>
+      </w:pPr>
+      <w:r>
+        <w:t>sentence1 = "I love machine learning and AI."</w:t>
+      </w:r>
+    </w:p>
+    <w:p>
+      <w:pPr>
+        <w:pStyle w:val="ListParagraph"/>
+      </w:pPr>
+      <w:r>
+        <w:t>sentence2 = "Artificial intelligence and machine learning are my passion."</w:t>
+      </w:r>
+    </w:p>
+    <w:p>
+      <w:pPr>
+        <w:pStyle w:val="ListParagraph"/>
+      </w:pPr>
+      <w:r>
+        <w:t> </w:t>
+      </w:r>
+    </w:p>
+    <w:p>
+      <w:pPr>
+        <w:pStyle w:val="ListParagraph"/>
+      </w:pPr>
+      <w:r>
+        <w:t># Encode sentences to get embeddings</w:t>
+      </w:r>
+    </w:p>
+    <w:p>
+      <w:pPr>
+        <w:pStyle w:val="ListParagraph"/>
+      </w:pPr>
+      <w:r>
+        <w:t xml:space="preserve">embedding1 = </w:t>
+      </w:r>
+      <w:proofErr w:type="spellStart"/>
+      <w:proofErr w:type="gramStart"/>
+      <w:r>
+        <w:t>model.encode</w:t>
+      </w:r>
+      <w:proofErr w:type="spellEnd"/>
+      <w:proofErr w:type="gramEnd"/>
+      <w:r>
+        <w:t>(sentence1)</w:t>
+      </w:r>
+    </w:p>
+    <w:p>
+      <w:pPr>
+        <w:pStyle w:val="ListParagraph"/>
+      </w:pPr>
+      <w:r>
+        <w:t xml:space="preserve">embedding2 = </w:t>
+      </w:r>
+      <w:proofErr w:type="spellStart"/>
+      <w:proofErr w:type="gramStart"/>
+      <w:r>
+        <w:t>model.encode</w:t>
+      </w:r>
+      <w:proofErr w:type="spellEnd"/>
+      <w:proofErr w:type="gramEnd"/>
+      <w:r>
+        <w:t>(sentence2)</w:t>
+      </w:r>
+    </w:p>
+    <w:p>
+      <w:pPr>
+        <w:pStyle w:val="ListParagraph"/>
+      </w:pPr>
+      <w:r>
+        <w:t> </w:t>
+      </w:r>
+    </w:p>
+    <w:p>
+      <w:pPr>
+        <w:pStyle w:val="ListParagraph"/>
+      </w:pPr>
+      <w:r>
+        <w:t># Compute cosine similarity</w:t>
+      </w:r>
+    </w:p>
+    <w:p>
+      <w:pPr>
+        <w:pStyle w:val="ListParagraph"/>
+      </w:pPr>
+      <w:proofErr w:type="spellStart"/>
+      <w:r>
+        <w:t>cosine_score</w:t>
+      </w:r>
+      <w:proofErr w:type="spellEnd"/>
+      <w:r>
+        <w:t xml:space="preserve"> = </w:t>
+      </w:r>
+      <w:proofErr w:type="spellStart"/>
+      <w:r>
+        <w:t>util.cos_</w:t>
+      </w:r>
+      <w:proofErr w:type="gramStart"/>
+      <w:r>
+        <w:t>sim</w:t>
+      </w:r>
+      <w:proofErr w:type="spellEnd"/>
+      <w:r>
+        <w:t>(</w:t>
+      </w:r>
+      <w:proofErr w:type="gramEnd"/>
+      <w:r>
+        <w:t>embedding1, embedding2)</w:t>
+      </w:r>
+    </w:p>
+    <w:p>
+      <w:pPr>
+        <w:pStyle w:val="ListParagraph"/>
+      </w:pPr>
+      <w:r>
+        <w:t> </w:t>
+      </w:r>
+    </w:p>
+    <w:p>
+      <w:pPr>
+        <w:pStyle w:val="ListParagraph"/>
+      </w:pPr>
+      <w:proofErr w:type="gramStart"/>
+      <w:r>
+        <w:t>print(</w:t>
+      </w:r>
+      <w:proofErr w:type="spellStart"/>
+      <w:proofErr w:type="gramEnd"/>
+      <w:r>
+        <w:t>f"Cosine</w:t>
+      </w:r>
+      <w:proofErr w:type="spellEnd"/>
+      <w:r>
+        <w:t xml:space="preserve"> Similarity: {</w:t>
+      </w:r>
+      <w:proofErr w:type="spellStart"/>
+      <w:r>
+        <w:t>cosine_score.item</w:t>
+      </w:r>
+      <w:proofErr w:type="spellEnd"/>
+      <w:r>
+        <w:t>():.4f}")</w:t>
+      </w:r>
+    </w:p>
+    <w:p>
+      <w:pPr>
+        <w:pStyle w:val="ListParagraph"/>
+      </w:pPr>
+      <w:r>
+        <w:t>Output:</w:t>
+      </w:r>
+    </w:p>
+    <w:p>
+      <w:pPr>
+        <w:pStyle w:val="ListParagraph"/>
+      </w:pPr>
+      <w:r>
+        <w:t> </w:t>
+      </w:r>
+    </w:p>
+    <w:p>
+      <w:pPr>
+        <w:pStyle w:val="ListParagraph"/>
+      </w:pPr>
+      <w:proofErr w:type="spellStart"/>
+      <w:r>
+        <w:t>sql</w:t>
+      </w:r>
+      <w:proofErr w:type="spellEnd"/>
+    </w:p>
+    <w:p>
+      <w:pPr>
+        <w:pStyle w:val="ListParagraph"/>
+      </w:pPr>
+      <w:r>
+        <w:t>Copy code</w:t>
+      </w:r>
+    </w:p>
+    <w:p>
+      <w:pPr>
+        <w:pStyle w:val="ListParagraph"/>
+      </w:pPr>
+      <w:r>
+        <w:t xml:space="preserve">Cosine Similarity: </w:t>
+      </w:r>
+      <w:proofErr w:type="gramStart"/>
+      <w:r>
+        <w:t>0.87  (</w:t>
+      </w:r>
+      <w:proofErr w:type="gramEnd"/>
+      <w:r>
+        <w:t>values near 1 mean very similar)</w:t>
+      </w:r>
+    </w:p>
+    <w:p>
+      <w:pPr>
+        <w:pStyle w:val="ListParagraph"/>
+      </w:pPr>
+      <w:r>
+        <w:rPr>
+          <w:rFonts w:ascii="Segoe UI Emoji" w:hAnsi="Segoe UI Emoji" w:cs="Segoe UI Emoji"/>
+        </w:rPr>
+        <w:t>👉</w:t>
+      </w:r>
+      <w:r>
+        <w:t xml:space="preserve"> Example 2: Find most similar sentence in a list</w:t>
+      </w:r>
+    </w:p>
+    <w:p>
+      <w:pPr>
+        <w:pStyle w:val="ListParagraph"/>
+      </w:pPr>
+      <w:r>
+        <w:t>python</w:t>
+      </w:r>
+    </w:p>
+    <w:p>
+      <w:pPr>
+        <w:pStyle w:val="ListParagraph"/>
+      </w:pPr>
+      <w:r>
+        <w:t>Copy code</w:t>
+      </w:r>
+    </w:p>
+    <w:p>
+      <w:pPr>
+        <w:pStyle w:val="ListParagraph"/>
+      </w:pPr>
+      <w:r>
+        <w:t xml:space="preserve">from </w:t>
+      </w:r>
+      <w:proofErr w:type="spellStart"/>
+      <w:r>
+        <w:t>sentence_transformers</w:t>
+      </w:r>
+      <w:proofErr w:type="spellEnd"/>
+      <w:r>
+        <w:t xml:space="preserve"> import </w:t>
+      </w:r>
+      <w:proofErr w:type="spellStart"/>
+      <w:r>
+        <w:t>SentenceTransformer</w:t>
+      </w:r>
+      <w:proofErr w:type="spellEnd"/>
+      <w:r>
+        <w:t>, util</w:t>
+      </w:r>
+    </w:p>
+    <w:p>
+      <w:pPr>
+        <w:pStyle w:val="ListParagraph"/>
+      </w:pPr>
+      <w:r>
+        <w:t> </w:t>
+      </w:r>
+    </w:p>
+    <w:p>
+      <w:pPr>
+        <w:pStyle w:val="ListParagraph"/>
+      </w:pPr>
+      <w:r>
+        <w:t xml:space="preserve">model = </w:t>
+      </w:r>
+      <w:proofErr w:type="spellStart"/>
+      <w:r>
+        <w:t>SentenceTransformer</w:t>
+      </w:r>
+      <w:proofErr w:type="spellEnd"/>
+      <w:r>
+        <w:t>('all-MiniLM-L6-v2')</w:t>
+      </w:r>
+    </w:p>
+    <w:p>
+      <w:pPr>
+        <w:pStyle w:val="ListParagraph"/>
+      </w:pPr>
+      <w:r>
+        <w:t> </w:t>
+      </w:r>
+    </w:p>
+    <w:p>
+      <w:pPr>
+        <w:pStyle w:val="ListParagraph"/>
+      </w:pPr>
+      <w:r>
+        <w:t># Your query</w:t>
+      </w:r>
+    </w:p>
+    <w:p>
+      <w:pPr>
+        <w:pStyle w:val="ListParagraph"/>
+      </w:pPr>
+      <w:r>
+        <w:t>query = "Looking for a developer with Python and Flask skills."</w:t>
+      </w:r>
+    </w:p>
+    <w:p>
+      <w:pPr>
+        <w:pStyle w:val="ListParagraph"/>
+      </w:pPr>
+      <w:r>
+        <w:t> </w:t>
+      </w:r>
+    </w:p>
+    <w:p>
+      <w:pPr>
+        <w:pStyle w:val="ListParagraph"/>
+      </w:pPr>
+      <w:r>
+        <w:t># Candidate sentences (like resumes, snippets, or job postings)</w:t>
+      </w:r>
+    </w:p>
+    <w:p>
+      <w:pPr>
+        <w:pStyle w:val="ListParagraph"/>
+      </w:pPr>
+      <w:r>
+        <w:t>candidates = [</w:t>
+      </w:r>
+    </w:p>
+    <w:p>
+      <w:pPr>
+        <w:pStyle w:val="ListParagraph"/>
+      </w:pPr>
+      <w:r>
+        <w:t>    "Experienced Python developer with Flask and Django.",</w:t>
+      </w:r>
+    </w:p>
+    <w:p>
+      <w:pPr>
+        <w:pStyle w:val="ListParagraph"/>
+      </w:pPr>
+      <w:r>
+        <w:t>    "Expert in JavaScript and React frontend.",</w:t>
+      </w:r>
+    </w:p>
+    <w:p>
+      <w:pPr>
+        <w:pStyle w:val="ListParagraph"/>
+      </w:pPr>
+      <w:r>
+        <w:t>    "Data analyst with SQL and Tableau experience."</w:t>
+      </w:r>
+    </w:p>
+    <w:p>
+      <w:pPr>
+        <w:pStyle w:val="ListParagraph"/>
+      </w:pPr>
+      <w:r>
+        <w:t>]</w:t>
+      </w:r>
+    </w:p>
+    <w:p>
+      <w:pPr>
+        <w:pStyle w:val="ListParagraph"/>
+      </w:pPr>
+      <w:r>
+        <w:t> </w:t>
+      </w:r>
+    </w:p>
+    <w:p>
+      <w:pPr>
+        <w:pStyle w:val="ListParagraph"/>
+      </w:pPr>
+      <w:r>
+        <w:t># Encode all sentences</w:t>
+      </w:r>
+    </w:p>
+    <w:p>
+      <w:pPr>
+        <w:pStyle w:val="ListParagraph"/>
+      </w:pPr>
+      <w:proofErr w:type="spellStart"/>
+      <w:r>
+        <w:t>query_embedding</w:t>
+      </w:r>
+      <w:proofErr w:type="spellEnd"/>
+      <w:r>
+        <w:t xml:space="preserve"> = </w:t>
+      </w:r>
+      <w:proofErr w:type="spellStart"/>
+      <w:proofErr w:type="gramStart"/>
+      <w:r>
+        <w:t>model.encode</w:t>
+      </w:r>
+      <w:proofErr w:type="spellEnd"/>
+      <w:proofErr w:type="gramEnd"/>
+      <w:r>
+        <w:t>(query)</w:t>
+      </w:r>
+    </w:p>
+    <w:p>
+      <w:pPr>
+        <w:pStyle w:val="ListParagraph"/>
+      </w:pPr>
+      <w:proofErr w:type="spellStart"/>
+      <w:r>
+        <w:t>candidate_embeddings</w:t>
+      </w:r>
+      <w:proofErr w:type="spellEnd"/>
+      <w:r>
+        <w:t xml:space="preserve"> = </w:t>
+      </w:r>
+      <w:proofErr w:type="spellStart"/>
+      <w:proofErr w:type="gramStart"/>
+      <w:r>
+        <w:t>model.encode</w:t>
+      </w:r>
+      <w:proofErr w:type="spellEnd"/>
+      <w:proofErr w:type="gramEnd"/>
+      <w:r>
+        <w:t>(candidates)</w:t>
+      </w:r>
+    </w:p>
+    <w:p>
+      <w:pPr>
+        <w:pStyle w:val="ListParagraph"/>
+      </w:pPr>
+      <w:r>
+        <w:t> </w:t>
+      </w:r>
+    </w:p>
+    <w:p>
+      <w:pPr>
+        <w:pStyle w:val="ListParagraph"/>
+      </w:pPr>
+      <w:r>
+        <w:t># Compute cosine similarities</w:t>
+      </w:r>
+    </w:p>
+    <w:p>
+      <w:pPr>
+        <w:pStyle w:val="ListParagraph"/>
+      </w:pPr>
+      <w:proofErr w:type="spellStart"/>
+      <w:r>
+        <w:t>cosine_scores</w:t>
+      </w:r>
+      <w:proofErr w:type="spellEnd"/>
+      <w:r>
+        <w:t xml:space="preserve"> = </w:t>
+      </w:r>
+      <w:proofErr w:type="spellStart"/>
+      <w:r>
+        <w:t>util.cos_</w:t>
+      </w:r>
+      <w:proofErr w:type="gramStart"/>
+      <w:r>
+        <w:t>sim</w:t>
+      </w:r>
+      <w:proofErr w:type="spellEnd"/>
+      <w:r>
+        <w:t>(</w:t>
+      </w:r>
+      <w:proofErr w:type="spellStart"/>
+      <w:proofErr w:type="gramEnd"/>
+      <w:r>
+        <w:t>query_embedding</w:t>
+      </w:r>
+      <w:proofErr w:type="spellEnd"/>
+      <w:r>
+        <w:t xml:space="preserve">, </w:t>
+      </w:r>
+      <w:proofErr w:type="spellStart"/>
+      <w:r>
+        <w:t>candidate_embeddings</w:t>
+      </w:r>
+      <w:proofErr w:type="spellEnd"/>
+      <w:r>
+        <w:t>)</w:t>
+      </w:r>
+    </w:p>
+    <w:p>
+      <w:pPr>
+        <w:pStyle w:val="ListParagraph"/>
+      </w:pPr>
+      <w:r>
+        <w:t> </w:t>
+      </w:r>
+    </w:p>
+    <w:p>
+      <w:pPr>
+        <w:pStyle w:val="ListParagraph"/>
+      </w:pPr>
+      <w:r>
+        <w:t># Show results</w:t>
+      </w:r>
+    </w:p>
+    <w:p>
+      <w:pPr>
+        <w:pStyle w:val="ListParagraph"/>
+      </w:pPr>
+      <w:r>
+        <w:t xml:space="preserve">for </w:t>
+      </w:r>
+      <w:proofErr w:type="spellStart"/>
+      <w:r>
+        <w:t>idx</w:t>
+      </w:r>
+      <w:proofErr w:type="spellEnd"/>
+      <w:r>
+        <w:t>, score in enumerate(</w:t>
+      </w:r>
+      <w:proofErr w:type="spellStart"/>
+      <w:r>
+        <w:t>cosine_</w:t>
+      </w:r>
+      <w:proofErr w:type="gramStart"/>
+      <w:r>
+        <w:t>scores</w:t>
+      </w:r>
+      <w:proofErr w:type="spellEnd"/>
+      <w:r>
+        <w:t>[</w:t>
+      </w:r>
+      <w:proofErr w:type="gramEnd"/>
+      <w:r>
+        <w:t>0]):</w:t>
+      </w:r>
+    </w:p>
+    <w:p>
+      <w:pPr>
+        <w:pStyle w:val="ListParagraph"/>
+      </w:pPr>
+      <w:r>
+        <w:lastRenderedPageBreak/>
+        <w:t>    </w:t>
+      </w:r>
+      <w:proofErr w:type="gramStart"/>
+      <w:r>
+        <w:t>print(</w:t>
+      </w:r>
+      <w:proofErr w:type="spellStart"/>
+      <w:proofErr w:type="gramEnd"/>
+      <w:r>
+        <w:t>f"Candidate</w:t>
+      </w:r>
+      <w:proofErr w:type="spellEnd"/>
+      <w:r>
+        <w:t xml:space="preserve"> {idx+1}: Score: {</w:t>
+      </w:r>
+      <w:proofErr w:type="spellStart"/>
+      <w:r>
+        <w:t>score.item</w:t>
+      </w:r>
+      <w:proofErr w:type="spellEnd"/>
+      <w:r>
+        <w:t>():.4f} -&gt; {candidates[</w:t>
+      </w:r>
+      <w:proofErr w:type="spellStart"/>
+      <w:r>
+        <w:t>idx</w:t>
+      </w:r>
+      <w:proofErr w:type="spellEnd"/>
+      <w:r>
+        <w:t>]}")</w:t>
+      </w:r>
+    </w:p>
+    <w:p>
+      <w:pPr>
+        <w:pStyle w:val="ListParagraph"/>
+      </w:pPr>
+      <w:r>
+        <w:rPr>
+          <w:rFonts w:ascii="Segoe UI Emoji" w:hAnsi="Segoe UI Emoji" w:cs="Segoe UI Emoji"/>
+        </w:rPr>
+        <w:t>👉</w:t>
+      </w:r>
+      <w:r>
+        <w:t xml:space="preserve"> Example 3: Batch encode for a corpus</w:t>
+      </w:r>
+    </w:p>
+    <w:p>
+      <w:pPr>
+        <w:pStyle w:val="ListParagraph"/>
+      </w:pPr>
+      <w:r>
+        <w:t>python</w:t>
+      </w:r>
+    </w:p>
+    <w:p>
+      <w:pPr>
+        <w:pStyle w:val="ListParagraph"/>
+      </w:pPr>
+      <w:r>
+        <w:t>Copy code</w:t>
+      </w:r>
+    </w:p>
+    <w:p>
+      <w:pPr>
+        <w:pStyle w:val="ListParagraph"/>
+      </w:pPr>
+      <w:r>
+        <w:t xml:space="preserve">from </w:t>
+      </w:r>
+      <w:proofErr w:type="spellStart"/>
+      <w:r>
+        <w:t>sentence_transformers</w:t>
+      </w:r>
+      <w:proofErr w:type="spellEnd"/>
+      <w:r>
+        <w:t xml:space="preserve"> import </w:t>
+      </w:r>
+      <w:proofErr w:type="spellStart"/>
+      <w:r>
+        <w:t>SentenceTransformer</w:t>
+      </w:r>
+      <w:proofErr w:type="spellEnd"/>
+    </w:p>
+    <w:p>
+      <w:pPr>
+        <w:pStyle w:val="ListParagraph"/>
+      </w:pPr>
+      <w:r>
+        <w:t> </w:t>
+      </w:r>
+    </w:p>
+    <w:p>
+      <w:pPr>
+        <w:pStyle w:val="ListParagraph"/>
+      </w:pPr>
+      <w:r>
+        <w:t xml:space="preserve">model = </w:t>
+      </w:r>
+      <w:proofErr w:type="spellStart"/>
+      <w:r>
+        <w:t>SentenceTransformer</w:t>
+      </w:r>
+      <w:proofErr w:type="spellEnd"/>
+      <w:r>
+        <w:t>('all-MiniLM-L6-v2')</w:t>
+      </w:r>
+    </w:p>
+    <w:p>
+      <w:pPr>
+        <w:pStyle w:val="ListParagraph"/>
+      </w:pPr>
+      <w:r>
+        <w:t> </w:t>
+      </w:r>
+    </w:p>
+    <w:p>
+      <w:pPr>
+        <w:pStyle w:val="ListParagraph"/>
+      </w:pPr>
+      <w:r>
+        <w:t># A batch of texts (e.g., resumes, documents)</w:t>
+      </w:r>
+    </w:p>
+    <w:p>
+      <w:pPr>
+        <w:pStyle w:val="ListParagraph"/>
+      </w:pPr>
+      <w:r>
+        <w:t>documents = [</w:t>
+      </w:r>
+    </w:p>
+    <w:p>
+      <w:pPr>
+        <w:pStyle w:val="ListParagraph"/>
+      </w:pPr>
+      <w:r>
+        <w:t>    "Senior backend developer with Python and Django.",</w:t>
+      </w:r>
+    </w:p>
+    <w:p>
+      <w:pPr>
+        <w:pStyle w:val="ListParagraph"/>
+      </w:pPr>
+      <w:r>
+        <w:t>    "Frontend engineer specializing in React and Vue.",</w:t>
+      </w:r>
+    </w:p>
+    <w:p>
+      <w:pPr>
+        <w:pStyle w:val="ListParagraph"/>
+      </w:pPr>
+      <w:r>
+        <w:t>    "DevOps engineer with AWS and Docker experience."</w:t>
+      </w:r>
+    </w:p>
+    <w:p>
+      <w:pPr>
+        <w:pStyle w:val="ListParagraph"/>
+      </w:pPr>
+      <w:r>
+        <w:t>]</w:t>
+      </w:r>
+    </w:p>
+    <w:p>
+      <w:pPr>
+        <w:pStyle w:val="ListParagraph"/>
+      </w:pPr>
+      <w:r>
+        <w:t> </w:t>
+      </w:r>
+    </w:p>
+    <w:p>
+      <w:pPr>
+        <w:pStyle w:val="ListParagraph"/>
+      </w:pPr>
+      <w:r>
+        <w:t># Get embeddings for all</w:t>
+      </w:r>
+    </w:p>
+    <w:p>
+      <w:pPr>
+        <w:pStyle w:val="ListParagraph"/>
+      </w:pPr>
+      <w:r>
+        <w:t xml:space="preserve">embeddings = </w:t>
+      </w:r>
+      <w:proofErr w:type="spellStart"/>
+      <w:proofErr w:type="gramStart"/>
+      <w:r>
+        <w:t>model.encode</w:t>
+      </w:r>
+      <w:proofErr w:type="spellEnd"/>
+      <w:proofErr w:type="gramEnd"/>
+      <w:r>
+        <w:t>(documents)</w:t>
+      </w:r>
+    </w:p>
+    <w:p>
+      <w:pPr>
+        <w:pStyle w:val="ListParagraph"/>
+      </w:pPr>
+      <w:r>
+        <w:t> </w:t>
+      </w:r>
+    </w:p>
+    <w:p>
+      <w:pPr>
+        <w:pStyle w:val="ListParagraph"/>
+      </w:pPr>
+      <w:proofErr w:type="gramStart"/>
+      <w:r>
+        <w:t>print(</w:t>
+      </w:r>
+      <w:proofErr w:type="spellStart"/>
+      <w:proofErr w:type="gramEnd"/>
+      <w:r>
+        <w:t>f"Shape</w:t>
+      </w:r>
+      <w:proofErr w:type="spellEnd"/>
+      <w:r>
+        <w:t xml:space="preserve"> of embeddings: {</w:t>
+      </w:r>
+      <w:proofErr w:type="spellStart"/>
+      <w:r>
+        <w:t>embeddings.shape</w:t>
+      </w:r>
+      <w:proofErr w:type="spellEnd"/>
+      <w:r>
+        <w:t>}")  # (3, 384) -&gt; 3 documents, 384-dim vectors</w:t>
+      </w:r>
+    </w:p>
+    <w:p>
+      <w:pPr>
+        <w:pStyle w:val="ListParagraph"/>
+      </w:pPr>
+      <w:r>
+        <w:rPr>
+          <w:rFonts w:ascii="Segoe UI Emoji" w:hAnsi="Segoe UI Emoji" w:cs="Segoe UI Emoji"/>
+        </w:rPr>
+        <w:t>✅</w:t>
+      </w:r>
+      <w:r>
+        <w:t xml:space="preserve"> Key Takeaways</w:t>
+      </w:r>
+    </w:p>
+    <w:p>
+      <w:pPr>
+        <w:pStyle w:val="ListParagraph"/>
+      </w:pPr>
+      <w:r>
+        <w:rPr>
+          <w:rFonts w:ascii="Segoe UI Emoji" w:hAnsi="Segoe UI Emoji" w:cs="Segoe UI Emoji"/>
+        </w:rPr>
+        <w:t>📌</w:t>
+      </w:r>
+      <w:r>
+        <w:t xml:space="preserve"> Sentence Transformers = one vector per sentence / paragraph that encodes meaning.</w:t>
+      </w:r>
+    </w:p>
+    <w:p>
+      <w:pPr>
+        <w:pStyle w:val="ListParagraph"/>
+      </w:pPr>
+      <w:r>
+        <w:rPr>
+          <w:rFonts w:ascii="Segoe UI Emoji" w:hAnsi="Segoe UI Emoji" w:cs="Segoe UI Emoji"/>
+        </w:rPr>
+        <w:t>📌</w:t>
+      </w:r>
+      <w:r>
+        <w:t xml:space="preserve"> They’re super useful for semantic search, ranking, clustering, and matching text by meaning.</w:t>
+      </w:r>
+    </w:p>
+    <w:p>
+      <w:pPr>
+        <w:pStyle w:val="ListParagraph"/>
+      </w:pPr>
+      <w:r>
+        <w:rPr>
+          <w:rFonts w:ascii="Segoe UI Emoji" w:hAnsi="Segoe UI Emoji" w:cs="Segoe UI Emoji"/>
+        </w:rPr>
+        <w:t>📌</w:t>
+      </w:r>
+      <w:r>
+        <w:t xml:space="preserve"> Hugging Face hosts many pre-trained models — you can just plug them in!</w:t>
+      </w:r>
+    </w:p>
+    <w:p>
+      <w:pPr>
+        <w:pStyle w:val="ListParagraph"/>
+      </w:pPr>
+      <w:r>
+        <w:t> </w:t>
+      </w:r>
+    </w:p>
+    <w:p>
+      <w:pPr>
+        <w:pStyle w:val="ListParagraph"/>
+      </w:pPr>
+      <w:r>
+        <w:rPr>
+          <w:rFonts w:ascii="Segoe UI Emoji" w:hAnsi="Segoe UI Emoji" w:cs="Segoe UI Emoji"/>
+        </w:rPr>
+        <w:t>🧠</w:t>
+      </w:r>
+      <w:r>
+        <w:t xml:space="preserve"> </w:t>
+      </w:r>
+      <w:r>
+        <w:rPr>
+          <w:i/>
+          <w:iCs/>
+        </w:rPr>
+        <w:t>Common models</w:t>
+      </w:r>
+    </w:p>
+    <w:p>
+      <w:pPr>
+        <w:pStyle w:val="ListParagraph"/>
+      </w:pPr>
+      <w:r>
+        <w:t>Model name Description</w:t>
+      </w:r>
+    </w:p>
+    <w:p>
+      <w:pPr>
+        <w:pStyle w:val="ListParagraph"/>
+      </w:pPr>
+      <w:r>
+        <w:t>'all-MiniLM-L6-v2' Fast, general-purpose, 384 dimensions</w:t>
+      </w:r>
+    </w:p>
+    <w:p>
+      <w:pPr>
+        <w:pStyle w:val="ListParagraph"/>
+      </w:pPr>
+      <w:r>
+        <w:t>'</w:t>
+      </w:r>
+      <w:proofErr w:type="gramStart"/>
+      <w:r>
+        <w:t>paraphrase</w:t>
+      </w:r>
+      <w:proofErr w:type="gramEnd"/>
+      <w:r>
+        <w:t>-MiniLM-L6-v2' Optimized for paraphrase similarity</w:t>
+      </w:r>
+    </w:p>
+    <w:p>
+      <w:pPr>
+        <w:pStyle w:val="ListParagraph"/>
+      </w:pPr>
+      <w:r>
+        <w:t>'all-mpnet-base-v2' Larger, more accurate, but slower</w:t>
+      </w:r>
+    </w:p>
+    <w:p>
+      <w:pPr>
+        <w:pStyle w:val="ListParagraph"/>
+      </w:pPr>
+      <w:r>
+        <w:t> </w:t>
+      </w:r>
+    </w:p>
+    <w:p>
+      <w:pPr>
+        <w:pStyle w:val="ListParagraph"/>
+      </w:pPr>
+      <w:r>
+        <w:rPr>
+          <w:rFonts w:ascii="Segoe UI Emoji" w:hAnsi="Segoe UI Emoji" w:cs="Segoe UI Emoji"/>
+        </w:rPr>
+        <w:t>✅</w:t>
+      </w:r>
+      <w:r>
+        <w:t xml:space="preserve"> Where you’re using it</w:t>
+      </w:r>
+    </w:p>
+    <w:p>
+      <w:pPr>
+        <w:pStyle w:val="ListParagraph"/>
+      </w:pPr>
+      <w:r>
+        <w:t>In your resume shortlisting app, you:</w:t>
+      </w:r>
+    </w:p>
+    <w:p>
+      <w:pPr>
+        <w:pStyle w:val="ListParagraph"/>
+      </w:pPr>
+      <w:r>
+        <w:t>1️</w:t>
+      </w:r>
+      <w:r>
+        <w:rPr>
+          <w:rFonts w:ascii="Segoe UI Symbol" w:hAnsi="Segoe UI Symbol" w:cs="Segoe UI Symbol"/>
+        </w:rPr>
+        <w:t>⃣</w:t>
+      </w:r>
+      <w:r>
+        <w:t xml:space="preserve"> Embed the Job Description</w:t>
+      </w:r>
+    </w:p>
+    <w:p>
+      <w:pPr>
+        <w:pStyle w:val="ListParagraph"/>
+      </w:pPr>
+      <w:r>
+        <w:t>2️</w:t>
+      </w:r>
+      <w:r>
+        <w:rPr>
+          <w:rFonts w:ascii="Segoe UI Symbol" w:hAnsi="Segoe UI Symbol" w:cs="Segoe UI Symbol"/>
+        </w:rPr>
+        <w:t>⃣</w:t>
+      </w:r>
+      <w:r>
+        <w:t xml:space="preserve"> Embed the Resume Text</w:t>
+      </w:r>
+    </w:p>
+    <w:p>
+      <w:pPr>
+        <w:pStyle w:val="ListParagraph"/>
+      </w:pPr>
+      <w:r>
+        <w:t>3️</w:t>
+      </w:r>
+      <w:r>
+        <w:rPr>
+          <w:rFonts w:ascii="Segoe UI Symbol" w:hAnsi="Segoe UI Symbol" w:cs="Segoe UI Symbol"/>
+        </w:rPr>
+        <w:t>⃣</w:t>
+      </w:r>
+      <w:r>
+        <w:t xml:space="preserve"> Use cosine similarity to see how close they are!</w:t>
+      </w:r>
+    </w:p>
+    <w:p>
+      <w:pPr>
+        <w:pStyle w:val="ListParagraph"/>
+      </w:pPr>
+      <w:r>
+        <w:t> </w:t>
+      </w:r>
+    </w:p>
+    <w:p>
+      <w:pPr>
+        <w:pStyle w:val="ListParagraph"/>
+      </w:pPr>
+      <w:r>
+        <w:t xml:space="preserve">That’s the magic! </w:t>
+      </w:r>
+      <w:r>
+        <w:rPr>
+          <w:rFonts w:ascii="Segoe UI Emoji" w:hAnsi="Segoe UI Emoji" w:cs="Segoe UI Emoji"/>
+        </w:rPr>
+        <w:t>🔍✨</w:t>
+      </w:r>
+    </w:p>
+    <w:p>
+      <w:pPr>
+        <w:pStyle w:val="ListParagraph"/>
+      </w:pPr>
+      <w:r>
+        <w:t> </w:t>
+      </w:r>
+    </w:p>
+    <w:p>
+      <w:pPr>
+        <w:pStyle w:val="ListParagraph"/>
+      </w:pPr>
+      <w:r>
+        <w:t>If you want, I can also show:</w:t>
+      </w:r>
+    </w:p>
+    <w:p>
+      <w:pPr>
+        <w:pStyle w:val="ListParagraph"/>
+      </w:pPr>
+      <w:r>
+        <w:rPr>
+          <w:rFonts w:ascii="Segoe UI Emoji" w:hAnsi="Segoe UI Emoji" w:cs="Segoe UI Emoji"/>
+        </w:rPr>
+        <w:t>✅</w:t>
+      </w:r>
+      <w:r>
+        <w:t xml:space="preserve"> How to fine-tune your own sentence transformer</w:t>
+      </w:r>
+    </w:p>
+    <w:p>
+      <w:pPr>
+        <w:pStyle w:val="ListParagraph"/>
+      </w:pPr>
+      <w:r>
+        <w:rPr>
+          <w:rFonts w:ascii="Segoe UI Emoji" w:hAnsi="Segoe UI Emoji" w:cs="Segoe UI Emoji"/>
+        </w:rPr>
+        <w:lastRenderedPageBreak/>
+        <w:t>✅</w:t>
+      </w:r>
+      <w:r>
+        <w:t xml:space="preserve"> How to store embeddings in FAISS or a vector DB</w:t>
+      </w:r>
+    </w:p>
+    <w:p>
+      <w:pPr>
+        <w:pStyle w:val="ListParagraph"/>
+      </w:pPr>
+      <w:r>
+        <w:rPr>
+          <w:rFonts w:ascii="Segoe UI Emoji" w:hAnsi="Segoe UI Emoji" w:cs="Segoe UI Emoji"/>
+        </w:rPr>
+        <w:t>✅</w:t>
+      </w:r>
+      <w:r>
+        <w:t xml:space="preserve"> How to visualize embedding clusters</w:t>
+      </w:r>
+    </w:p>
+    <w:p>
+      <w:pPr>
+        <w:pStyle w:val="ListParagraph"/>
+      </w:pPr>
+      <w:r>
+        <w:t> </w:t>
+      </w:r>
+    </w:p>
+    <w:p>
+      <w:pPr>
+        <w:pStyle w:val="ListParagraph"/>
+      </w:pPr>
+      <w:r>
+        <w:t xml:space="preserve">Just say “Show me more!” and I’ll expand! </w:t>
+      </w:r>
+      <w:r>
+        <w:rPr>
+          <w:rFonts w:ascii="Segoe UI Emoji" w:hAnsi="Segoe UI Emoji" w:cs="Segoe UI Emoji"/>
+        </w:rPr>
+        <w:t>🚀</w:t>
+      </w:r>
+    </w:p>
+    <w:p>
+      <w:pPr>
+        <w:pStyle w:val="ListParagraph"/>
+        <w:rPr>
+          <w:lang w:val="en-US"/>
+        </w:rPr>
+      </w:pPr>
+    </w:p>
+    <w:p>
+      <w:pPr>
+        <w:pStyle w:val="ListParagraph"/>
+        <w:rPr>
+          <w:lang w:val="en-US"/>
+        </w:rPr>
+      </w:pPr>
+    </w:p>
+    <w:p>
+      <w:pPr>
+        <w:pStyle w:val="ListParagraph"/>
+        <w:rPr>
+          <w:b/>
+          <w:bCs/>
+          <w:sz w:val="28"/>
+          <w:szCs w:val="28"/>
+        </w:rPr>
+      </w:pPr>
+      <w:r>
+        <w:rPr>
+          <w:b/>
+          <w:bCs/>
+          <w:sz w:val="28"/>
+          <w:szCs w:val="28"/>
+        </w:rPr>
+        <w:t>What is PyPDF2?</w:t>
+      </w:r>
+    </w:p>
+    <w:p>
+      <w:pPr>
+        <w:pStyle w:val="ListParagraph"/>
+      </w:pPr>
+      <w:r>
+        <w:t>PyPDF2 is a popular Python library used for reading, manipulating, and writing PDF files.</w:t>
+      </w:r>
+    </w:p>
+    <w:p>
+      <w:pPr>
+        <w:pStyle w:val="ListParagraph"/>
+      </w:pPr>
+      <w:r>
+        <w:t> </w:t>
+      </w:r>
+    </w:p>
+    <w:p>
+      <w:pPr>
+        <w:pStyle w:val="ListParagraph"/>
+      </w:pPr>
+      <w:r>
+        <w:rPr>
+          <w:rFonts w:ascii="Segoe UI Emoji" w:hAnsi="Segoe UI Emoji" w:cs="Segoe UI Emoji"/>
+        </w:rPr>
+        <w:t>📄</w:t>
+      </w:r>
+      <w:r>
+        <w:t xml:space="preserve"> What can you do with PyPDF2?</w:t>
+      </w:r>
+    </w:p>
+    <w:p>
+      <w:pPr>
+        <w:pStyle w:val="ListParagraph"/>
+      </w:pPr>
+      <w:r>
+        <w:t>Here are the core things PyPDF2 can do:</w:t>
+      </w:r>
+    </w:p>
+    <w:p>
+      <w:pPr>
+        <w:pStyle w:val="ListParagraph"/>
+      </w:pPr>
+      <w:r>
+        <w:t> </w:t>
+      </w:r>
+    </w:p>
+    <w:p>
+      <w:pPr>
+        <w:pStyle w:val="ListParagraph"/>
+      </w:pPr>
+      <w:r>
+        <w:rPr>
+          <w:rFonts w:ascii="Segoe UI Emoji" w:hAnsi="Segoe UI Emoji" w:cs="Segoe UI Emoji"/>
+        </w:rPr>
+        <w:t>✅</w:t>
+      </w:r>
+      <w:r>
+        <w:t xml:space="preserve"> Extract text from PDF pages (like resumes)</w:t>
+      </w:r>
+    </w:p>
+    <w:p>
+      <w:pPr>
+        <w:pStyle w:val="ListParagraph"/>
+      </w:pPr>
+      <w:r>
+        <w:rPr>
+          <w:rFonts w:ascii="Segoe UI Emoji" w:hAnsi="Segoe UI Emoji" w:cs="Segoe UI Emoji"/>
+        </w:rPr>
+        <w:t>✅</w:t>
+      </w:r>
+      <w:r>
+        <w:t xml:space="preserve"> Merge multiple PDFs into one file</w:t>
+      </w:r>
+    </w:p>
+    <w:p>
+      <w:pPr>
+        <w:pStyle w:val="ListParagraph"/>
+      </w:pPr>
+      <w:r>
+        <w:rPr>
+          <w:rFonts w:ascii="Segoe UI Emoji" w:hAnsi="Segoe UI Emoji" w:cs="Segoe UI Emoji"/>
+        </w:rPr>
+        <w:t>✅</w:t>
+      </w:r>
+      <w:r>
+        <w:t xml:space="preserve"> Split a PDF into individual pages</w:t>
+      </w:r>
+    </w:p>
+    <w:p>
+      <w:pPr>
+        <w:pStyle w:val="ListParagraph"/>
+      </w:pPr>
+      <w:r>
+        <w:rPr>
+          <w:rFonts w:ascii="Segoe UI Emoji" w:hAnsi="Segoe UI Emoji" w:cs="Segoe UI Emoji"/>
+        </w:rPr>
+        <w:t>✅</w:t>
+      </w:r>
+      <w:r>
+        <w:t xml:space="preserve"> Rotate or reorder pages</w:t>
+      </w:r>
+    </w:p>
+    <w:p>
+      <w:pPr>
+        <w:pStyle w:val="ListParagraph"/>
+      </w:pPr>
+      <w:r>
+        <w:rPr>
+          <w:rFonts w:ascii="Segoe UI Emoji" w:hAnsi="Segoe UI Emoji" w:cs="Segoe UI Emoji"/>
+        </w:rPr>
+        <w:t>✅</w:t>
+      </w:r>
+      <w:r>
+        <w:t xml:space="preserve"> Encrypt or decrypt PDF files</w:t>
+      </w:r>
+    </w:p>
+    <w:p>
+      <w:pPr>
+        <w:pStyle w:val="ListParagraph"/>
+      </w:pPr>
+      <w:r>
+        <w:t> </w:t>
+      </w:r>
+    </w:p>
+    <w:p>
+      <w:pPr>
+        <w:pStyle w:val="ListParagraph"/>
+      </w:pPr>
+      <w:r>
+        <w:rPr>
+          <w:rFonts w:ascii="Segoe UI Emoji" w:hAnsi="Segoe UI Emoji" w:cs="Segoe UI Emoji"/>
+        </w:rPr>
+        <w:t>📄</w:t>
+      </w:r>
+      <w:r>
+        <w:t xml:space="preserve"> In your project</w:t>
+      </w:r>
+    </w:p>
+    <w:p>
+      <w:pPr>
+        <w:pStyle w:val="ListParagraph"/>
+      </w:pPr>
+      <w:r>
+        <w:t>You use PyPDF2 to:</w:t>
+      </w:r>
+    </w:p>
+    <w:p>
+      <w:pPr>
+        <w:pStyle w:val="ListParagraph"/>
+      </w:pPr>
+      <w:r>
+        <w:t> </w:t>
+      </w:r>
+    </w:p>
+    <w:p>
+      <w:pPr>
+        <w:pStyle w:val="ListParagraph"/>
+      </w:pPr>
+      <w:r>
+        <w:t>Open the resume PDF</w:t>
+      </w:r>
+    </w:p>
+    <w:p>
+      <w:pPr>
+        <w:pStyle w:val="ListParagraph"/>
+      </w:pPr>
+      <w:r>
+        <w:t> </w:t>
+      </w:r>
+    </w:p>
+    <w:p>
+      <w:pPr>
+        <w:pStyle w:val="ListParagraph"/>
+      </w:pPr>
+      <w:r>
+        <w:t>Extract the text from each page</w:t>
+      </w:r>
+    </w:p>
+    <w:p>
+      <w:pPr>
+        <w:pStyle w:val="ListParagraph"/>
+      </w:pPr>
+      <w:r>
+        <w:t> </w:t>
+      </w:r>
+    </w:p>
+    <w:p>
+      <w:pPr>
+        <w:pStyle w:val="ListParagraph"/>
+      </w:pPr>
+      <w:r>
+        <w:t>Combine all the text into a single string</w:t>
+      </w:r>
+    </w:p>
+    <w:p>
+      <w:pPr>
+        <w:pStyle w:val="ListParagraph"/>
+      </w:pPr>
+      <w:r>
+        <w:t> </w:t>
+      </w:r>
+    </w:p>
+    <w:p>
+      <w:pPr>
+        <w:pStyle w:val="ListParagraph"/>
+      </w:pPr>
+      <w:r>
+        <w:t>Pass that text into your embedding model for similarity scoring.</w:t>
+      </w:r>
+    </w:p>
+    <w:p>
+      <w:pPr>
+        <w:pStyle w:val="ListParagraph"/>
+      </w:pPr>
+      <w:r>
+        <w:t> </w:t>
+      </w:r>
+    </w:p>
+    <w:p>
+      <w:pPr>
+        <w:pStyle w:val="ListParagraph"/>
+      </w:pPr>
+      <w:r>
+        <w:rPr>
+          <w:rFonts w:ascii="Segoe UI Emoji" w:hAnsi="Segoe UI Emoji" w:cs="Segoe UI Emoji"/>
+        </w:rPr>
+        <w:t>🗂️</w:t>
+      </w:r>
+      <w:r>
+        <w:t xml:space="preserve"> How does it work? (Your code example)</w:t>
+      </w:r>
+    </w:p>
+    <w:p>
+      <w:pPr>
+        <w:pStyle w:val="ListParagraph"/>
+      </w:pPr>
+      <w:r>
+        <w:t>python</w:t>
+      </w:r>
+    </w:p>
+    <w:p>
+      <w:pPr>
+        <w:pStyle w:val="ListParagraph"/>
+      </w:pPr>
+      <w:r>
+        <w:t>Copy code</w:t>
+      </w:r>
+    </w:p>
+    <w:p>
+      <w:pPr>
+        <w:pStyle w:val="ListParagraph"/>
+      </w:pPr>
+      <w:r>
+        <w:t>import PyPDF2</w:t>
+      </w:r>
+    </w:p>
+    <w:p>
+      <w:pPr>
+        <w:pStyle w:val="ListParagraph"/>
+      </w:pPr>
+      <w:r>
+        <w:t> </w:t>
+      </w:r>
+    </w:p>
+    <w:p>
+      <w:pPr>
+        <w:pStyle w:val="ListParagraph"/>
+      </w:pPr>
+      <w:r>
+        <w:t xml:space="preserve">def </w:t>
+      </w:r>
+      <w:proofErr w:type="spellStart"/>
+      <w:r>
+        <w:t>extract_text_from_pdf</w:t>
+      </w:r>
+      <w:proofErr w:type="spellEnd"/>
+      <w:r>
+        <w:t>(</w:t>
+      </w:r>
+      <w:proofErr w:type="spellStart"/>
+      <w:r>
+        <w:t>pdf_path</w:t>
+      </w:r>
+      <w:proofErr w:type="spellEnd"/>
+      <w:r>
+        <w:t>):</w:t>
+      </w:r>
+    </w:p>
+    <w:p>
+      <w:pPr>
+        <w:pStyle w:val="ListParagraph"/>
+      </w:pPr>
+      <w:r>
+        <w:t>    text = ""</w:t>
+      </w:r>
+    </w:p>
+    <w:p>
+      <w:pPr>
+        <w:pStyle w:val="ListParagraph"/>
+      </w:pPr>
+      <w:r>
+        <w:t xml:space="preserve">    with </w:t>
+      </w:r>
+      <w:proofErr w:type="gramStart"/>
+      <w:r>
+        <w:t>open(</w:t>
+      </w:r>
+      <w:proofErr w:type="spellStart"/>
+      <w:proofErr w:type="gramEnd"/>
+      <w:r>
+        <w:t>pdf_path</w:t>
+      </w:r>
+      <w:proofErr w:type="spellEnd"/>
+      <w:r>
+        <w:t>, '</w:t>
+      </w:r>
+      <w:proofErr w:type="spellStart"/>
+      <w:r>
+        <w:t>rb</w:t>
+      </w:r>
+      <w:proofErr w:type="spellEnd"/>
+      <w:r>
+        <w:t>') as file:</w:t>
+      </w:r>
+    </w:p>
+    <w:p>
+      <w:pPr>
+        <w:pStyle w:val="ListParagraph"/>
+      </w:pPr>
+      <w:r>
+        <w:t>        reader = PyPDF2.PdfReader(</w:t>
+      </w:r>
+      <w:proofErr w:type="gramStart"/>
+      <w:r>
+        <w:t>file)  #</w:t>
+      </w:r>
+      <w:proofErr w:type="gramEnd"/>
+      <w:r>
+        <w:t xml:space="preserve"> Create a PDF reader object</w:t>
+      </w:r>
+    </w:p>
+    <w:p>
+      <w:pPr>
+        <w:pStyle w:val="ListParagraph"/>
+      </w:pPr>
+      <w:r>
+        <w:t xml:space="preserve">        for page in </w:t>
+      </w:r>
+      <w:proofErr w:type="spellStart"/>
+      <w:r>
+        <w:t>reader.pages</w:t>
+      </w:r>
+      <w:proofErr w:type="spellEnd"/>
+      <w:r>
+        <w:t>:</w:t>
+      </w:r>
+    </w:p>
+    <w:p>
+      <w:pPr>
+        <w:pStyle w:val="ListParagraph"/>
+      </w:pPr>
+      <w:r>
+        <w:t xml:space="preserve">            text += </w:t>
+      </w:r>
+      <w:proofErr w:type="spellStart"/>
+      <w:proofErr w:type="gramStart"/>
+      <w:r>
+        <w:t>page.extract</w:t>
+      </w:r>
+      <w:proofErr w:type="gramEnd"/>
+      <w:r>
+        <w:t>_text</w:t>
+      </w:r>
+      <w:proofErr w:type="spellEnd"/>
+      <w:r>
+        <w:t>()  # Extract text from each page</w:t>
+      </w:r>
+    </w:p>
+    <w:p>
+      <w:pPr>
+        <w:pStyle w:val="ListParagraph"/>
+      </w:pPr>
+      <w:r>
+        <w:t>    return text</w:t>
+      </w:r>
+    </w:p>
+    <w:p>
+      <w:pPr>
+        <w:pStyle w:val="ListParagraph"/>
+      </w:pPr>
+      <w:r>
+        <w:t>Line-by-line:</w:t>
+      </w:r>
+    </w:p>
+    <w:p>
+      <w:pPr>
+        <w:pStyle w:val="ListParagraph"/>
+      </w:pPr>
+      <w:r>
+        <w:lastRenderedPageBreak/>
+        <w:t> </w:t>
+      </w:r>
+    </w:p>
+    <w:p>
+      <w:pPr>
+        <w:pStyle w:val="ListParagraph"/>
+      </w:pPr>
+      <w:r>
+        <w:t xml:space="preserve">with </w:t>
+      </w:r>
+      <w:proofErr w:type="gramStart"/>
+      <w:r>
+        <w:t>open(</w:t>
+      </w:r>
+      <w:proofErr w:type="spellStart"/>
+      <w:proofErr w:type="gramEnd"/>
+      <w:r>
+        <w:t>pdf_path</w:t>
+      </w:r>
+      <w:proofErr w:type="spellEnd"/>
+      <w:r>
+        <w:t>, '</w:t>
+      </w:r>
+      <w:proofErr w:type="spellStart"/>
+      <w:r>
+        <w:t>rb</w:t>
+      </w:r>
+      <w:proofErr w:type="spellEnd"/>
+      <w:r>
+        <w:t>') → Open the PDF in binary mode (PDFs are not plain text files).</w:t>
+      </w:r>
+    </w:p>
+    <w:p>
+      <w:pPr>
+        <w:pStyle w:val="ListParagraph"/>
+      </w:pPr>
+      <w:r>
+        <w:t> </w:t>
+      </w:r>
+    </w:p>
+    <w:p>
+      <w:pPr>
+        <w:pStyle w:val="ListParagraph"/>
+      </w:pPr>
+      <w:r>
+        <w:t>PyPDF2.PdfReader(file) → Loads the PDF and lets you work with its pages.</w:t>
+      </w:r>
+    </w:p>
+    <w:p>
+      <w:pPr>
+        <w:pStyle w:val="ListParagraph"/>
+      </w:pPr>
+      <w:r>
+        <w:t> </w:t>
+      </w:r>
+    </w:p>
+    <w:p>
+      <w:pPr>
+        <w:pStyle w:val="ListParagraph"/>
+      </w:pPr>
+      <w:proofErr w:type="spellStart"/>
+      <w:r>
+        <w:t>reader.pages</w:t>
+      </w:r>
+      <w:proofErr w:type="spellEnd"/>
+      <w:r>
+        <w:t xml:space="preserve"> → A list of all pages in the PDF.</w:t>
+      </w:r>
+    </w:p>
+    <w:p>
+      <w:pPr>
+        <w:pStyle w:val="ListParagraph"/>
+      </w:pPr>
+      <w:r>
+        <w:t> </w:t>
+      </w:r>
+    </w:p>
+    <w:p>
+      <w:pPr>
+        <w:pStyle w:val="ListParagraph"/>
+      </w:pPr>
+      <w:proofErr w:type="spellStart"/>
+      <w:proofErr w:type="gramStart"/>
+      <w:r>
+        <w:t>page.extract</w:t>
+      </w:r>
+      <w:proofErr w:type="gramEnd"/>
+      <w:r>
+        <w:t>_text</w:t>
+      </w:r>
+      <w:proofErr w:type="spellEnd"/>
+      <w:r>
+        <w:t>() → Grabs the raw text from that page.</w:t>
+      </w:r>
+    </w:p>
+    <w:p>
+      <w:pPr>
+        <w:pStyle w:val="ListParagraph"/>
+      </w:pPr>
+      <w:r>
+        <w:t> </w:t>
+      </w:r>
+    </w:p>
+    <w:p>
+      <w:pPr>
+        <w:pStyle w:val="ListParagraph"/>
+      </w:pPr>
+      <w:r>
+        <w:t>Combine it all: text += ... → Builds the full resume text.</w:t>
+      </w:r>
+    </w:p>
+    <w:p>
+      <w:pPr>
+        <w:pStyle w:val="ListParagraph"/>
+      </w:pPr>
+      <w:r>
+        <w:t> </w:t>
+      </w:r>
+    </w:p>
+    <w:p>
+      <w:pPr>
+        <w:pStyle w:val="ListParagraph"/>
+      </w:pPr>
+      <w:r>
+        <w:rPr>
+          <w:rFonts w:ascii="Segoe UI Emoji" w:hAnsi="Segoe UI Emoji" w:cs="Segoe UI Emoji"/>
+        </w:rPr>
+        <w:t>✅</w:t>
+      </w:r>
+      <w:r>
+        <w:t xml:space="preserve"> Why use PyPDF2?</w:t>
+      </w:r>
+    </w:p>
+    <w:p>
+      <w:pPr>
+        <w:pStyle w:val="ListParagraph"/>
+      </w:pPr>
+      <w:r>
+        <w:t>Advantages:</w:t>
+      </w:r>
+    </w:p>
+    <w:p>
+      <w:pPr>
+        <w:pStyle w:val="ListParagraph"/>
+      </w:pPr>
+      <w:r>
+        <w:t> </w:t>
+      </w:r>
+    </w:p>
+    <w:p>
+      <w:pPr>
+        <w:pStyle w:val="ListParagraph"/>
+      </w:pPr>
+      <w:r>
+        <w:t>Simple and free for basic PDF tasks.</w:t>
+      </w:r>
+    </w:p>
+    <w:p>
+      <w:pPr>
+        <w:pStyle w:val="ListParagraph"/>
+      </w:pPr>
+      <w:r>
+        <w:t> </w:t>
+      </w:r>
+    </w:p>
+    <w:p>
+      <w:pPr>
+        <w:pStyle w:val="ListParagraph"/>
+      </w:pPr>
+      <w:r>
+        <w:t>Works well for extracting text from mostly text-based PDFs (like resumes).</w:t>
+      </w:r>
+    </w:p>
+    <w:p>
+      <w:pPr>
+        <w:pStyle w:val="ListParagraph"/>
+      </w:pPr>
+      <w:r>
+        <w:t> </w:t>
+      </w:r>
+    </w:p>
+    <w:p>
+      <w:pPr>
+        <w:pStyle w:val="ListParagraph"/>
+      </w:pPr>
+      <w:r>
+        <w:t>No external tools needed.</w:t>
+      </w:r>
+    </w:p>
+    <w:p>
+      <w:pPr>
+        <w:pStyle w:val="ListParagraph"/>
+      </w:pPr>
+      <w:r>
+        <w:t> </w:t>
+      </w:r>
+    </w:p>
+    <w:p>
+      <w:pPr>
+        <w:pStyle w:val="ListParagraph"/>
+      </w:pPr>
+      <w:r>
+        <w:rPr>
+          <w:rFonts w:ascii="Segoe UI Emoji" w:hAnsi="Segoe UI Emoji" w:cs="Segoe UI Emoji"/>
+        </w:rPr>
+        <w:t>⚡</w:t>
+      </w:r>
+      <w:r>
+        <w:t xml:space="preserve"> Limitations</w:t>
+      </w:r>
+    </w:p>
+    <w:p>
+      <w:pPr>
+        <w:pStyle w:val="ListParagraph"/>
+      </w:pPr>
+      <w:r>
+        <w:t>It struggles with PDFs that are scanned images — because those aren’t real text, they’re images.</w:t>
+      </w:r>
+    </w:p>
+    <w:p>
+      <w:pPr>
+        <w:pStyle w:val="ListParagraph"/>
+      </w:pPr>
+      <w:r>
+        <w:t> </w:t>
+      </w:r>
+    </w:p>
+    <w:p>
+      <w:pPr>
+        <w:pStyle w:val="ListParagraph"/>
+      </w:pPr>
+      <w:r>
+        <w:t xml:space="preserve">For scanned PDFs, you’d need an OCR tool like </w:t>
+      </w:r>
+      <w:proofErr w:type="spellStart"/>
+      <w:r>
+        <w:t>pytesseract</w:t>
+      </w:r>
+      <w:proofErr w:type="spellEnd"/>
+      <w:r>
+        <w:t xml:space="preserve"> to convert images to text.</w:t>
+      </w:r>
+    </w:p>
+    <w:p>
+      <w:pPr>
+        <w:pStyle w:val="ListParagraph"/>
+      </w:pPr>
+      <w:r>
+        <w:t> </w:t>
+      </w:r>
+    </w:p>
+    <w:p>
+      <w:pPr>
+        <w:pStyle w:val="ListParagraph"/>
+      </w:pPr>
+      <w:r>
+        <w:rPr>
+          <w:rFonts w:ascii="Segoe UI Emoji" w:hAnsi="Segoe UI Emoji" w:cs="Segoe UI Emoji"/>
+        </w:rPr>
+        <w:t>📦</w:t>
+      </w:r>
+      <w:r>
+        <w:t xml:space="preserve"> Install it</w:t>
+      </w:r>
+    </w:p>
+    <w:p>
+      <w:pPr>
+        <w:pStyle w:val="ListParagraph"/>
+      </w:pPr>
+      <w:r>
+        <w:t>bash</w:t>
+      </w:r>
+    </w:p>
+    <w:p>
+      <w:pPr>
+        <w:pStyle w:val="ListParagraph"/>
+      </w:pPr>
+      <w:r>
+        <w:t>Copy code</w:t>
+      </w:r>
+    </w:p>
+    <w:p>
+      <w:pPr>
+        <w:pStyle w:val="ListParagraph"/>
+      </w:pPr>
+      <w:r>
+        <w:t>pip install PyPDF2</w:t>
+      </w:r>
+    </w:p>
+    <w:p>
+      <w:pPr>
+        <w:pStyle w:val="ListParagraph"/>
+      </w:pPr>
+      <w:r>
+        <w:rPr>
+          <w:rFonts w:ascii="Segoe UI Emoji" w:hAnsi="Segoe UI Emoji" w:cs="Segoe UI Emoji"/>
+        </w:rPr>
+        <w:t>📝</w:t>
+      </w:r>
+      <w:r>
+        <w:t xml:space="preserve"> Summary</w:t>
+      </w:r>
+    </w:p>
+    <w:p>
+      <w:pPr>
+        <w:pStyle w:val="ListParagraph"/>
+      </w:pPr>
+      <w:r>
+        <w:t>Aspect PyPDF2 Does</w:t>
+      </w:r>
+    </w:p>
+    <w:p>
+      <w:pPr>
+        <w:pStyle w:val="ListParagraph"/>
+      </w:pPr>
+      <w:r>
+        <w:t xml:space="preserve">Extract text </w:t>
+      </w:r>
+      <w:r>
+        <w:rPr>
+          <w:rFonts w:ascii="Segoe UI Emoji" w:hAnsi="Segoe UI Emoji" w:cs="Segoe UI Emoji"/>
+        </w:rPr>
+        <w:t>✅</w:t>
+      </w:r>
+      <w:r>
+        <w:t xml:space="preserve"> Good for text-based PDFs</w:t>
+      </w:r>
+    </w:p>
+    <w:p>
+      <w:pPr>
+        <w:pStyle w:val="ListParagraph"/>
+      </w:pPr>
+      <w:r>
+        <w:t xml:space="preserve">Merge/Split </w:t>
+      </w:r>
+      <w:r>
+        <w:rPr>
+          <w:rFonts w:ascii="Segoe UI Emoji" w:hAnsi="Segoe UI Emoji" w:cs="Segoe UI Emoji"/>
+        </w:rPr>
+        <w:t>✅</w:t>
+      </w:r>
+      <w:r>
+        <w:t xml:space="preserve"> Combine or split PDF files</w:t>
+      </w:r>
+    </w:p>
+    <w:p>
+      <w:pPr>
+        <w:pStyle w:val="ListParagraph"/>
+      </w:pPr>
+      <w:r>
+        <w:t xml:space="preserve">Rotate/Reorder </w:t>
+      </w:r>
+      <w:r>
+        <w:rPr>
+          <w:rFonts w:ascii="Segoe UI Emoji" w:hAnsi="Segoe UI Emoji" w:cs="Segoe UI Emoji"/>
+        </w:rPr>
+        <w:t>✅</w:t>
+      </w:r>
+      <w:r>
+        <w:t xml:space="preserve"> Fix page order or orientation</w:t>
+      </w:r>
+    </w:p>
+    <w:p>
+      <w:pPr>
+        <w:pStyle w:val="ListParagraph"/>
+      </w:pPr>
+      <w:r>
+        <w:t xml:space="preserve">Secure files </w:t>
+      </w:r>
+      <w:r>
+        <w:rPr>
+          <w:rFonts w:ascii="Segoe UI Emoji" w:hAnsi="Segoe UI Emoji" w:cs="Segoe UI Emoji"/>
+        </w:rPr>
+        <w:t>✅</w:t>
+      </w:r>
+      <w:r>
+        <w:t xml:space="preserve"> Add/remove passwords</w:t>
+      </w:r>
+    </w:p>
+    <w:p>
+      <w:pPr>
+        <w:pStyle w:val="ListParagraph"/>
+      </w:pPr>
+      <w:r>
+        <w:t xml:space="preserve">OCR </w:t>
+      </w:r>
+      <w:r>
+        <w:rPr>
+          <w:rFonts w:ascii="Segoe UI Emoji" w:hAnsi="Segoe UI Emoji" w:cs="Segoe UI Emoji"/>
+        </w:rPr>
+        <w:t>❌</w:t>
+      </w:r>
+      <w:r>
+        <w:t xml:space="preserve"> Not built-in (need </w:t>
+      </w:r>
+      <w:proofErr w:type="spellStart"/>
+      <w:r>
+        <w:t>pytesseract</w:t>
+      </w:r>
+      <w:proofErr w:type="spellEnd"/>
+      <w:r>
+        <w:t xml:space="preserve"> for images)</w:t>
+      </w:r>
+    </w:p>
+    <w:p>
+      <w:pPr>
+        <w:pStyle w:val="ListParagraph"/>
+      </w:pPr>
+      <w:r>
+        <w:t> </w:t>
+      </w:r>
+    </w:p>
+    <w:p>
+      <w:pPr>
+        <w:pStyle w:val="ListParagraph"/>
+      </w:pPr>
+      <w:r>
+        <w:t>If you’d like, I can show you:</w:t>
+      </w:r>
+    </w:p>
+    <w:p>
+      <w:pPr>
+        <w:pStyle w:val="ListParagraph"/>
+      </w:pPr>
+      <w:r>
+        <w:rPr>
+          <w:rFonts w:ascii="Segoe UI Emoji" w:hAnsi="Segoe UI Emoji" w:cs="Segoe UI Emoji"/>
+        </w:rPr>
+        <w:t>✅</w:t>
+      </w:r>
+      <w:r>
+        <w:t xml:space="preserve"> How to use OCR for scanned resumes</w:t>
+      </w:r>
+    </w:p>
+    <w:p>
+      <w:pPr>
+        <w:pStyle w:val="ListParagraph"/>
+      </w:pPr>
+      <w:r>
+        <w:rPr>
+          <w:rFonts w:ascii="Segoe UI Emoji" w:hAnsi="Segoe UI Emoji" w:cs="Segoe UI Emoji"/>
+        </w:rPr>
+        <w:t>✅</w:t>
+      </w:r>
+      <w:r>
+        <w:t xml:space="preserve"> How to merge or split PDF files with PyPDF2</w:t>
+      </w:r>
+    </w:p>
+    <w:p>
+      <w:pPr>
+        <w:pStyle w:val="ListParagraph"/>
+      </w:pPr>
+      <w:r>
+        <w:rPr>
+          <w:rFonts w:ascii="Segoe UI Emoji" w:hAnsi="Segoe UI Emoji" w:cs="Segoe UI Emoji"/>
+        </w:rPr>
+        <w:t>✅</w:t>
+      </w:r>
+      <w:r>
+        <w:t xml:space="preserve"> Or a better library for advanced PDF tasks</w:t>
+      </w:r>
+    </w:p>
+    <w:p>
+      <w:pPr>
+        <w:pStyle w:val="ListParagraph"/>
+      </w:pPr>
+      <w:r>
+        <w:lastRenderedPageBreak/>
+        <w:t> </w:t>
+      </w:r>
+    </w:p>
+    <w:p>
+      <w:pPr>
+        <w:pStyle w:val="ListParagraph"/>
+      </w:pPr>
+      <w:r>
+        <w:t xml:space="preserve">Just say “Show me OCR” or “Show me split/merge!” and I’ll write you an example! </w:t>
+      </w:r>
+      <w:r>
+        <w:rPr>
+          <w:rFonts w:ascii="Segoe UI Emoji" w:hAnsi="Segoe UI Emoji" w:cs="Segoe UI Emoji"/>
+        </w:rPr>
+        <w:t>🚀</w:t>
+      </w:r>
+    </w:p>
+    <w:p>
+      <w:pPr>
+        <w:pStyle w:val="ListParagraph"/>
+      </w:pPr>
+      <w:r>
+        <w:t> </w:t>
+      </w:r>
+    </w:p>
+    <w:p>
+      <w:pPr>
+        <w:pStyle w:val="ListParagraph"/>
+      </w:pPr>
+      <w:r>
+        <w:t> </w:t>
+      </w:r>
+    </w:p>
+    <w:p>
+      <w:pPr>
+        <w:pStyle w:val="ListParagraph"/>
+      </w:pPr>
+      <w:r>
+        <w:t> </w:t>
+      </w:r>
+    </w:p>
+    <w:p>
+      <w:pPr>
+        <w:pStyle w:val="ListParagraph"/>
+      </w:pPr>
+      <w:r>
+        <w:t> </w:t>
+      </w:r>
+    </w:p>
+    <w:p>
+      <w:pPr>
+        <w:pStyle w:val="ListParagraph"/>
+      </w:pPr>
+      <w:r>
+        <w:t> </w:t>
+      </w:r>
+    </w:p>
+    <w:p>
+      <w:pPr>
+        <w:pStyle w:val="ListParagraph"/>
+      </w:pPr>
+      <w:r>
+        <w:t> </w:t>
+      </w:r>
+    </w:p>
+    <w:p>
+      <w:pPr>
+        <w:pStyle w:val="ListParagraph"/>
+      </w:pPr>
+      <w:r>
+        <w:t> </w:t>
+      </w:r>
+    </w:p>
+    <w:p>
+      <w:pPr>
+        <w:pStyle w:val="ListParagraph"/>
+      </w:pPr>
+      <w:r>
+        <w:t>You said:</w:t>
+      </w:r>
+    </w:p>
+    <w:p>
+      <w:pPr>
+        <w:pStyle w:val="ListParagraph"/>
+      </w:pPr>
+      <w:r>
+        <w:t>Give some sample code</w:t>
+      </w:r>
+    </w:p>
+    <w:p>
+      <w:pPr>
+        <w:pStyle w:val="ListParagraph"/>
+      </w:pPr>
+      <w:r>
+        <w:t> </w:t>
+      </w:r>
+    </w:p>
+    <w:p>
+      <w:pPr>
+        <w:pStyle w:val="ListParagraph"/>
+      </w:pPr>
+      <w:r>
+        <w:t> </w:t>
+      </w:r>
+    </w:p>
+    <w:p>
+      <w:pPr>
+        <w:pStyle w:val="ListParagraph"/>
+      </w:pPr>
+      <w:r>
+        <w:t>ChatGPT said:</w:t>
+      </w:r>
+    </w:p>
+    <w:p>
+      <w:pPr>
+        <w:pStyle w:val="ListParagraph"/>
+      </w:pPr>
+      <w:r>
+        <w:t>Absolutely! Here’s a handy collection of PyPDF2 examples — short and clear — so you can see how it works for different tasks.</w:t>
+      </w:r>
+    </w:p>
+    <w:p>
+      <w:pPr>
+        <w:pStyle w:val="ListParagraph"/>
+      </w:pPr>
+      <w:r>
+        <w:t> </w:t>
+      </w:r>
+    </w:p>
+    <w:p>
+      <w:pPr>
+        <w:pStyle w:val="ListParagraph"/>
+      </w:pPr>
+      <w:r>
+        <w:rPr>
+          <w:rFonts w:ascii="Segoe UI Emoji" w:hAnsi="Segoe UI Emoji" w:cs="Segoe UI Emoji"/>
+        </w:rPr>
+        <w:t>✅</w:t>
+      </w:r>
+      <w:r>
+        <w:t xml:space="preserve"> 1️</w:t>
+      </w:r>
+      <w:r>
+        <w:rPr>
+          <w:rFonts w:ascii="Segoe UI Symbol" w:hAnsi="Segoe UI Symbol" w:cs="Segoe UI Symbol"/>
+        </w:rPr>
+        <w:t>⃣</w:t>
+      </w:r>
+      <w:r>
+        <w:t xml:space="preserve"> Extract text from a PDF (like a resume)</w:t>
+      </w:r>
+    </w:p>
+    <w:p>
+      <w:pPr>
+        <w:pStyle w:val="ListParagraph"/>
+      </w:pPr>
+      <w:r>
+        <w:t>python</w:t>
+      </w:r>
+    </w:p>
+    <w:p>
+      <w:pPr>
+        <w:pStyle w:val="ListParagraph"/>
+      </w:pPr>
+      <w:r>
+        <w:t>Copy code</w:t>
+      </w:r>
+    </w:p>
+    <w:p>
+      <w:pPr>
+        <w:pStyle w:val="ListParagraph"/>
+      </w:pPr>
+      <w:r>
+        <w:t>import PyPDF2</w:t>
+      </w:r>
+    </w:p>
+    <w:p>
+      <w:pPr>
+        <w:pStyle w:val="ListParagraph"/>
+      </w:pPr>
+      <w:r>
+        <w:t> </w:t>
+      </w:r>
+    </w:p>
+    <w:p>
+      <w:pPr>
+        <w:pStyle w:val="ListParagraph"/>
+      </w:pPr>
+      <w:r>
+        <w:t xml:space="preserve">def </w:t>
+      </w:r>
+      <w:proofErr w:type="spellStart"/>
+      <w:r>
+        <w:t>extract_text_from_pdf</w:t>
+      </w:r>
+      <w:proofErr w:type="spellEnd"/>
+      <w:r>
+        <w:t>(</w:t>
+      </w:r>
+      <w:proofErr w:type="spellStart"/>
+      <w:r>
+        <w:t>pdf_path</w:t>
+      </w:r>
+      <w:proofErr w:type="spellEnd"/>
+      <w:r>
+        <w:t>):</w:t>
+      </w:r>
+    </w:p>
+    <w:p>
+      <w:pPr>
+        <w:pStyle w:val="ListParagraph"/>
+      </w:pPr>
+      <w:r>
+        <w:t>    text = ""</w:t>
+      </w:r>
+    </w:p>
+    <w:p>
+      <w:pPr>
+        <w:pStyle w:val="ListParagraph"/>
+      </w:pPr>
+      <w:r>
+        <w:t xml:space="preserve">    with </w:t>
+      </w:r>
+      <w:proofErr w:type="gramStart"/>
+      <w:r>
+        <w:t>open(</w:t>
+      </w:r>
+      <w:proofErr w:type="spellStart"/>
+      <w:proofErr w:type="gramEnd"/>
+      <w:r>
+        <w:t>pdf_path</w:t>
+      </w:r>
+      <w:proofErr w:type="spellEnd"/>
+      <w:r>
+        <w:t>, '</w:t>
+      </w:r>
+      <w:proofErr w:type="spellStart"/>
+      <w:r>
+        <w:t>rb</w:t>
+      </w:r>
+      <w:proofErr w:type="spellEnd"/>
+      <w:r>
+        <w:t>') as file:</w:t>
+      </w:r>
+    </w:p>
+    <w:p>
+      <w:pPr>
+        <w:pStyle w:val="ListParagraph"/>
+      </w:pPr>
+      <w:r>
+        <w:t>        reader = PyPDF2.PdfReader(file)</w:t>
+      </w:r>
+    </w:p>
+    <w:p>
+      <w:pPr>
+        <w:pStyle w:val="ListParagraph"/>
+      </w:pPr>
+      <w:r>
+        <w:t xml:space="preserve">        for page in </w:t>
+      </w:r>
+      <w:proofErr w:type="spellStart"/>
+      <w:r>
+        <w:t>reader.pages</w:t>
+      </w:r>
+      <w:proofErr w:type="spellEnd"/>
+      <w:r>
+        <w:t>:</w:t>
+      </w:r>
+    </w:p>
+    <w:p>
+      <w:pPr>
+        <w:pStyle w:val="ListParagraph"/>
+      </w:pPr>
+      <w:r>
+        <w:t>            </w:t>
+      </w:r>
+      <w:proofErr w:type="spellStart"/>
+      <w:r>
+        <w:t>page_text</w:t>
+      </w:r>
+      <w:proofErr w:type="spellEnd"/>
+      <w:r>
+        <w:t xml:space="preserve"> = </w:t>
+      </w:r>
+      <w:proofErr w:type="spellStart"/>
+      <w:proofErr w:type="gramStart"/>
+      <w:r>
+        <w:t>page.extract</w:t>
+      </w:r>
+      <w:proofErr w:type="gramEnd"/>
+      <w:r>
+        <w:t>_text</w:t>
+      </w:r>
+      <w:proofErr w:type="spellEnd"/>
+      <w:r>
+        <w:t>()</w:t>
+      </w:r>
+    </w:p>
+    <w:p>
+      <w:pPr>
+        <w:pStyle w:val="ListParagraph"/>
+      </w:pPr>
+      <w:r>
+        <w:t xml:space="preserve">            if </w:t>
+      </w:r>
+      <w:proofErr w:type="spellStart"/>
+      <w:r>
+        <w:t>page_text</w:t>
+      </w:r>
+      <w:proofErr w:type="spellEnd"/>
+      <w:r>
+        <w:t>:</w:t>
+      </w:r>
+    </w:p>
+    <w:p>
+      <w:pPr>
+        <w:pStyle w:val="ListParagraph"/>
+      </w:pPr>
+      <w:r>
+        <w:t xml:space="preserve">                text += </w:t>
+      </w:r>
+      <w:proofErr w:type="spellStart"/>
+      <w:r>
+        <w:t>page_text</w:t>
+      </w:r>
+      <w:proofErr w:type="spellEnd"/>
+    </w:p>
+    <w:p>
+      <w:pPr>
+        <w:pStyle w:val="ListParagraph"/>
+      </w:pPr>
+      <w:r>
+        <w:t>    return text</w:t>
+      </w:r>
+    </w:p>
+    <w:p>
+      <w:pPr>
+        <w:pStyle w:val="ListParagraph"/>
+      </w:pPr>
+      <w:r>
+        <w:t> </w:t>
+      </w:r>
+    </w:p>
+    <w:p>
+      <w:pPr>
+        <w:pStyle w:val="ListParagraph"/>
+      </w:pPr>
+      <w:r>
+        <w:t># Example usage:</w:t>
+      </w:r>
+    </w:p>
+    <w:p>
+      <w:pPr>
+        <w:pStyle w:val="ListParagraph"/>
+      </w:pPr>
+      <w:proofErr w:type="spellStart"/>
+      <w:r>
+        <w:t>pdf_path</w:t>
+      </w:r>
+      <w:proofErr w:type="spellEnd"/>
+      <w:r>
+        <w:t xml:space="preserve"> = "example_resume.pdf"</w:t>
+      </w:r>
+    </w:p>
+    <w:p>
+      <w:pPr>
+        <w:pStyle w:val="ListParagraph"/>
+      </w:pPr>
+      <w:proofErr w:type="spellStart"/>
+      <w:r>
+        <w:t>resume_text</w:t>
+      </w:r>
+      <w:proofErr w:type="spellEnd"/>
+      <w:r>
+        <w:t xml:space="preserve"> = </w:t>
+      </w:r>
+      <w:proofErr w:type="spellStart"/>
+      <w:r>
+        <w:t>extract_text_from_pdf</w:t>
+      </w:r>
+      <w:proofErr w:type="spellEnd"/>
+      <w:r>
+        <w:t>(</w:t>
+      </w:r>
+      <w:proofErr w:type="spellStart"/>
+      <w:r>
+        <w:t>pdf_path</w:t>
+      </w:r>
+      <w:proofErr w:type="spellEnd"/>
+      <w:r>
+        <w:t>)</w:t>
+      </w:r>
+    </w:p>
+    <w:p>
+      <w:pPr>
+        <w:pStyle w:val="ListParagraph"/>
+      </w:pPr>
+      <w:r>
+        <w:t>print(</w:t>
+      </w:r>
+      <w:proofErr w:type="spellStart"/>
+      <w:r>
+        <w:t>resume_text</w:t>
+      </w:r>
+      <w:proofErr w:type="spellEnd"/>
+      <w:r>
+        <w:t>)</w:t>
+      </w:r>
+    </w:p>
+    <w:p>
+      <w:pPr>
+        <w:pStyle w:val="ListParagraph"/>
+      </w:pPr>
+      <w:r>
+        <w:rPr>
+          <w:rFonts w:ascii="Segoe UI Emoji" w:hAnsi="Segoe UI Emoji" w:cs="Segoe UI Emoji"/>
+        </w:rPr>
+        <w:t>✅</w:t>
+      </w:r>
+      <w:r>
+        <w:t xml:space="preserve"> 2️</w:t>
+      </w:r>
+      <w:r>
+        <w:rPr>
+          <w:rFonts w:ascii="Segoe UI Symbol" w:hAnsi="Segoe UI Symbol" w:cs="Segoe UI Symbol"/>
+        </w:rPr>
+        <w:t>⃣</w:t>
+      </w:r>
+      <w:r>
+        <w:t xml:space="preserve"> Merge multiple PDFs into one</w:t>
+      </w:r>
+    </w:p>
+    <w:p>
+      <w:pPr>
+        <w:pStyle w:val="ListParagraph"/>
+      </w:pPr>
+      <w:r>
+        <w:t>python</w:t>
+      </w:r>
+    </w:p>
+    <w:p>
+      <w:pPr>
+        <w:pStyle w:val="ListParagraph"/>
+      </w:pPr>
+      <w:r>
+        <w:t>Copy code</w:t>
+      </w:r>
+    </w:p>
+    <w:p>
+      <w:pPr>
+        <w:pStyle w:val="ListParagraph"/>
+      </w:pPr>
+      <w:r>
+        <w:t xml:space="preserve">from PyPDF2 import </w:t>
+      </w:r>
+      <w:proofErr w:type="spellStart"/>
+      <w:r>
+        <w:t>PdfMerger</w:t>
+      </w:r>
+      <w:proofErr w:type="spellEnd"/>
+    </w:p>
+    <w:p>
+      <w:pPr>
+        <w:pStyle w:val="ListParagraph"/>
+      </w:pPr>
+      <w:r>
+        <w:t> </w:t>
+      </w:r>
+    </w:p>
+    <w:p>
+      <w:pPr>
+        <w:pStyle w:val="ListParagraph"/>
+      </w:pPr>
+      <w:r>
+        <w:t xml:space="preserve">def </w:t>
+      </w:r>
+      <w:proofErr w:type="spellStart"/>
+      <w:r>
+        <w:t>merge_</w:t>
+      </w:r>
+      <w:proofErr w:type="gramStart"/>
+      <w:r>
+        <w:t>pdfs</w:t>
+      </w:r>
+      <w:proofErr w:type="spellEnd"/>
+      <w:r>
+        <w:t>(</w:t>
+      </w:r>
+      <w:proofErr w:type="spellStart"/>
+      <w:proofErr w:type="gramEnd"/>
+      <w:r>
+        <w:t>pdf_list</w:t>
+      </w:r>
+      <w:proofErr w:type="spellEnd"/>
+      <w:r>
+        <w:t xml:space="preserve">, </w:t>
+      </w:r>
+      <w:proofErr w:type="spellStart"/>
+      <w:r>
+        <w:t>output_name</w:t>
+      </w:r>
+      <w:proofErr w:type="spellEnd"/>
+      <w:r>
+        <w:t>):</w:t>
+      </w:r>
+    </w:p>
+    <w:p>
+      <w:pPr>
+        <w:pStyle w:val="ListParagraph"/>
+      </w:pPr>
+      <w:r>
+        <w:t xml:space="preserve">    merger = </w:t>
+      </w:r>
+      <w:proofErr w:type="spellStart"/>
+      <w:proofErr w:type="gramStart"/>
+      <w:r>
+        <w:t>PdfMerger</w:t>
+      </w:r>
+      <w:proofErr w:type="spellEnd"/>
+      <w:r>
+        <w:t>(</w:t>
+      </w:r>
+      <w:proofErr w:type="gramEnd"/>
+      <w:r>
+        <w:t>)</w:t>
+      </w:r>
+    </w:p>
+    <w:p>
+      <w:pPr>
+        <w:pStyle w:val="ListParagraph"/>
+      </w:pPr>
+      <w:r>
+        <w:lastRenderedPageBreak/>
+        <w:t xml:space="preserve">    for pdf in </w:t>
+      </w:r>
+      <w:proofErr w:type="spellStart"/>
+      <w:r>
+        <w:t>pdf_list</w:t>
+      </w:r>
+      <w:proofErr w:type="spellEnd"/>
+      <w:r>
+        <w:t>:</w:t>
+      </w:r>
+    </w:p>
+    <w:p>
+      <w:pPr>
+        <w:pStyle w:val="ListParagraph"/>
+      </w:pPr>
+      <w:r>
+        <w:t>        </w:t>
+      </w:r>
+      <w:proofErr w:type="spellStart"/>
+      <w:proofErr w:type="gramStart"/>
+      <w:r>
+        <w:t>merger.append</w:t>
+      </w:r>
+      <w:proofErr w:type="spellEnd"/>
+      <w:proofErr w:type="gramEnd"/>
+      <w:r>
+        <w:t>(pdf)</w:t>
+      </w:r>
+    </w:p>
+    <w:p>
+      <w:pPr>
+        <w:pStyle w:val="ListParagraph"/>
+      </w:pPr>
+      <w:r>
+        <w:t>    </w:t>
+      </w:r>
+      <w:proofErr w:type="spellStart"/>
+      <w:proofErr w:type="gramStart"/>
+      <w:r>
+        <w:t>merger.write</w:t>
+      </w:r>
+      <w:proofErr w:type="spellEnd"/>
+      <w:proofErr w:type="gramEnd"/>
+      <w:r>
+        <w:t>(</w:t>
+      </w:r>
+      <w:proofErr w:type="spellStart"/>
+      <w:r>
+        <w:t>output_name</w:t>
+      </w:r>
+      <w:proofErr w:type="spellEnd"/>
+      <w:r>
+        <w:t>)</w:t>
+      </w:r>
+    </w:p>
+    <w:p>
+      <w:pPr>
+        <w:pStyle w:val="ListParagraph"/>
+      </w:pPr>
+      <w:r>
+        <w:t>    </w:t>
+      </w:r>
+      <w:proofErr w:type="spellStart"/>
+      <w:proofErr w:type="gramStart"/>
+      <w:r>
+        <w:t>merger.close</w:t>
+      </w:r>
+      <w:proofErr w:type="spellEnd"/>
+      <w:proofErr w:type="gramEnd"/>
+      <w:r>
+        <w:t>()</w:t>
+      </w:r>
+    </w:p>
+    <w:p>
+      <w:pPr>
+        <w:pStyle w:val="ListParagraph"/>
+      </w:pPr>
+      <w:r>
+        <w:t> </w:t>
+      </w:r>
+    </w:p>
+    <w:p>
+      <w:pPr>
+        <w:pStyle w:val="ListParagraph"/>
+      </w:pPr>
+      <w:r>
+        <w:t># Example usage:</w:t>
+      </w:r>
+    </w:p>
+    <w:p>
+      <w:pPr>
+        <w:pStyle w:val="ListParagraph"/>
+      </w:pPr>
+      <w:proofErr w:type="spellStart"/>
+      <w:r>
+        <w:t>pdf_files</w:t>
+      </w:r>
+      <w:proofErr w:type="spellEnd"/>
+      <w:r>
+        <w:t xml:space="preserve"> = ["resume_part1.pdf", "resume_part2.pdf"]</w:t>
+      </w:r>
+    </w:p>
+    <w:p>
+      <w:pPr>
+        <w:pStyle w:val="ListParagraph"/>
+      </w:pPr>
+      <w:proofErr w:type="spellStart"/>
+      <w:r>
+        <w:t>merge_</w:t>
+      </w:r>
+      <w:proofErr w:type="gramStart"/>
+      <w:r>
+        <w:t>pdfs</w:t>
+      </w:r>
+      <w:proofErr w:type="spellEnd"/>
+      <w:r>
+        <w:t>(</w:t>
+      </w:r>
+      <w:proofErr w:type="spellStart"/>
+      <w:proofErr w:type="gramEnd"/>
+      <w:r>
+        <w:t>pdf_files</w:t>
+      </w:r>
+      <w:proofErr w:type="spellEnd"/>
+      <w:r>
+        <w:t>, "merged_resume.pdf")</w:t>
+      </w:r>
+    </w:p>
+    <w:p>
+      <w:pPr>
+        <w:pStyle w:val="ListParagraph"/>
+      </w:pPr>
+      <w:r>
+        <w:rPr>
+          <w:rFonts w:ascii="Segoe UI Emoji" w:hAnsi="Segoe UI Emoji" w:cs="Segoe UI Emoji"/>
+        </w:rPr>
+        <w:t>✅</w:t>
+      </w:r>
+      <w:r>
+        <w:t xml:space="preserve"> 3️</w:t>
+      </w:r>
+      <w:r>
+        <w:rPr>
+          <w:rFonts w:ascii="Segoe UI Symbol" w:hAnsi="Segoe UI Symbol" w:cs="Segoe UI Symbol"/>
+        </w:rPr>
+        <w:t>⃣</w:t>
+      </w:r>
+      <w:r>
+        <w:t xml:space="preserve"> Split a PDF into separate pages</w:t>
+      </w:r>
+    </w:p>
+    <w:p>
+      <w:pPr>
+        <w:pStyle w:val="ListParagraph"/>
+      </w:pPr>
+      <w:r>
+        <w:t>python</w:t>
+      </w:r>
+    </w:p>
+    <w:p>
+      <w:pPr>
+        <w:pStyle w:val="ListParagraph"/>
+      </w:pPr>
+      <w:r>
+        <w:t>Copy code</w:t>
+      </w:r>
+    </w:p>
+    <w:p>
+      <w:pPr>
+        <w:pStyle w:val="ListParagraph"/>
+      </w:pPr>
+      <w:r>
+        <w:t xml:space="preserve">from PyPDF2 import </w:t>
+      </w:r>
+      <w:proofErr w:type="spellStart"/>
+      <w:r>
+        <w:t>PdfReader</w:t>
+      </w:r>
+      <w:proofErr w:type="spellEnd"/>
+      <w:r>
+        <w:t xml:space="preserve">, </w:t>
+      </w:r>
+      <w:proofErr w:type="spellStart"/>
+      <w:r>
+        <w:t>PdfWriter</w:t>
+      </w:r>
+      <w:proofErr w:type="spellEnd"/>
+    </w:p>
+    <w:p>
+      <w:pPr>
+        <w:pStyle w:val="ListParagraph"/>
+      </w:pPr>
+      <w:r>
+        <w:t> </w:t>
+      </w:r>
+    </w:p>
+    <w:p>
+      <w:pPr>
+        <w:pStyle w:val="ListParagraph"/>
+      </w:pPr>
+      <w:r>
+        <w:t xml:space="preserve">def </w:t>
+      </w:r>
+      <w:proofErr w:type="spellStart"/>
+      <w:r>
+        <w:t>split_pdf</w:t>
+      </w:r>
+      <w:proofErr w:type="spellEnd"/>
+      <w:r>
+        <w:t>(</w:t>
+      </w:r>
+      <w:proofErr w:type="spellStart"/>
+      <w:r>
+        <w:t>pdf_path</w:t>
+      </w:r>
+      <w:proofErr w:type="spellEnd"/>
+      <w:r>
+        <w:t>):</w:t>
+      </w:r>
+    </w:p>
+    <w:p>
+      <w:pPr>
+        <w:pStyle w:val="ListParagraph"/>
+      </w:pPr>
+      <w:r>
+        <w:t xml:space="preserve">    reader = </w:t>
+      </w:r>
+      <w:proofErr w:type="spellStart"/>
+      <w:r>
+        <w:t>PdfReader</w:t>
+      </w:r>
+      <w:proofErr w:type="spellEnd"/>
+      <w:r>
+        <w:t>(</w:t>
+      </w:r>
+      <w:proofErr w:type="spellStart"/>
+      <w:r>
+        <w:t>pdf_path</w:t>
+      </w:r>
+      <w:proofErr w:type="spellEnd"/>
+      <w:r>
+        <w:t>)</w:t>
+      </w:r>
+    </w:p>
+    <w:p>
+      <w:pPr>
+        <w:pStyle w:val="ListParagraph"/>
+      </w:pPr>
+      <w:r>
+        <w:t xml:space="preserve">    for </w:t>
+      </w:r>
+      <w:proofErr w:type="spellStart"/>
+      <w:r>
+        <w:t>i</w:t>
+      </w:r>
+      <w:proofErr w:type="spellEnd"/>
+      <w:r>
+        <w:t>, page in enumerate(</w:t>
+      </w:r>
+      <w:proofErr w:type="spellStart"/>
+      <w:r>
+        <w:t>reader.pages</w:t>
+      </w:r>
+      <w:proofErr w:type="spellEnd"/>
+      <w:r>
+        <w:t>):</w:t>
+      </w:r>
+    </w:p>
+    <w:p>
+      <w:pPr>
+        <w:pStyle w:val="ListParagraph"/>
+      </w:pPr>
+      <w:r>
+        <w:t xml:space="preserve">        writer = </w:t>
+      </w:r>
+      <w:proofErr w:type="spellStart"/>
+      <w:proofErr w:type="gramStart"/>
+      <w:r>
+        <w:t>PdfWriter</w:t>
+      </w:r>
+      <w:proofErr w:type="spellEnd"/>
+      <w:r>
+        <w:t>(</w:t>
+      </w:r>
+      <w:proofErr w:type="gramEnd"/>
+      <w:r>
+        <w:t>)</w:t>
+      </w:r>
+    </w:p>
+    <w:p>
+      <w:pPr>
+        <w:pStyle w:val="ListParagraph"/>
+      </w:pPr>
+      <w:r>
+        <w:t>        </w:t>
+      </w:r>
+      <w:proofErr w:type="spellStart"/>
+      <w:r>
+        <w:t>writer.add_page</w:t>
+      </w:r>
+      <w:proofErr w:type="spellEnd"/>
+      <w:r>
+        <w:t>(page)</w:t>
+      </w:r>
+    </w:p>
+    <w:p>
+      <w:pPr>
+        <w:pStyle w:val="ListParagraph"/>
+      </w:pPr>
+      <w:r>
+        <w:t>        </w:t>
+      </w:r>
+      <w:proofErr w:type="spellStart"/>
+      <w:r>
+        <w:t>output_filename</w:t>
+      </w:r>
+      <w:proofErr w:type="spellEnd"/>
+      <w:r>
+        <w:t xml:space="preserve"> = </w:t>
+      </w:r>
+      <w:proofErr w:type="spellStart"/>
+      <w:r>
+        <w:t>f"page</w:t>
+      </w:r>
+      <w:proofErr w:type="spellEnd"/>
+      <w:r>
+        <w:t>_{i+1}.pdf"</w:t>
+      </w:r>
+    </w:p>
+    <w:p>
+      <w:pPr>
+        <w:pStyle w:val="ListParagraph"/>
+      </w:pPr>
+      <w:r>
+        <w:t xml:space="preserve">        with </w:t>
+      </w:r>
+      <w:proofErr w:type="gramStart"/>
+      <w:r>
+        <w:t>open(</w:t>
+      </w:r>
+      <w:proofErr w:type="spellStart"/>
+      <w:proofErr w:type="gramEnd"/>
+      <w:r>
+        <w:t>output_filename</w:t>
+      </w:r>
+      <w:proofErr w:type="spellEnd"/>
+      <w:r>
+        <w:t>, "</w:t>
+      </w:r>
+      <w:proofErr w:type="spellStart"/>
+      <w:r>
+        <w:t>wb</w:t>
+      </w:r>
+      <w:proofErr w:type="spellEnd"/>
+      <w:r>
+        <w:t xml:space="preserve">") as </w:t>
+      </w:r>
+      <w:proofErr w:type="spellStart"/>
+      <w:r>
+        <w:t>output_pdf</w:t>
+      </w:r>
+      <w:proofErr w:type="spellEnd"/>
+      <w:r>
+        <w:t>:</w:t>
+      </w:r>
+    </w:p>
+    <w:p>
+      <w:pPr>
+        <w:pStyle w:val="ListParagraph"/>
+      </w:pPr>
+      <w:r>
+        <w:t>            </w:t>
+      </w:r>
+      <w:proofErr w:type="spellStart"/>
+      <w:proofErr w:type="gramStart"/>
+      <w:r>
+        <w:t>writer.write</w:t>
+      </w:r>
+      <w:proofErr w:type="spellEnd"/>
+      <w:proofErr w:type="gramEnd"/>
+      <w:r>
+        <w:t>(</w:t>
+      </w:r>
+      <w:proofErr w:type="spellStart"/>
+      <w:r>
+        <w:t>output_pdf</w:t>
+      </w:r>
+      <w:proofErr w:type="spellEnd"/>
+      <w:r>
+        <w:t>)</w:t>
+      </w:r>
+    </w:p>
+    <w:p>
+      <w:pPr>
+        <w:pStyle w:val="ListParagraph"/>
+      </w:pPr>
+      <w:r>
+        <w:t> </w:t>
+      </w:r>
+    </w:p>
+    <w:p>
+      <w:pPr>
+        <w:pStyle w:val="ListParagraph"/>
+      </w:pPr>
+      <w:r>
+        <w:t># Example usage:</w:t>
+      </w:r>
+    </w:p>
+    <w:p>
+      <w:pPr>
+        <w:pStyle w:val="ListParagraph"/>
+      </w:pPr>
+      <w:proofErr w:type="spellStart"/>
+      <w:r>
+        <w:t>split_pdf</w:t>
+      </w:r>
+      <w:proofErr w:type="spellEnd"/>
+      <w:r>
+        <w:t>("example_resume.pdf")</w:t>
+      </w:r>
+    </w:p>
+    <w:p>
+      <w:pPr>
+        <w:pStyle w:val="ListParagraph"/>
+      </w:pPr>
+      <w:r>
+        <w:rPr>
+          <w:rFonts w:ascii="Segoe UI Emoji" w:hAnsi="Segoe UI Emoji" w:cs="Segoe UI Emoji"/>
+        </w:rPr>
+        <w:t>✅</w:t>
+      </w:r>
+      <w:r>
+        <w:t xml:space="preserve"> 4️</w:t>
+      </w:r>
+      <w:r>
+        <w:rPr>
+          <w:rFonts w:ascii="Segoe UI Symbol" w:hAnsi="Segoe UI Symbol" w:cs="Segoe UI Symbol"/>
+        </w:rPr>
+        <w:t>⃣</w:t>
+      </w:r>
+      <w:r>
+        <w:t xml:space="preserve"> Rotate pages (e.g., fix upside-down scans)</w:t>
+      </w:r>
+    </w:p>
+    <w:p>
+      <w:pPr>
+        <w:pStyle w:val="ListParagraph"/>
+      </w:pPr>
+      <w:r>
+        <w:t>python</w:t>
+      </w:r>
+    </w:p>
+    <w:p>
+      <w:pPr>
+        <w:pStyle w:val="ListParagraph"/>
+      </w:pPr>
+      <w:r>
+        <w:t>Copy code</w:t>
+      </w:r>
+    </w:p>
+    <w:p>
+      <w:pPr>
+        <w:pStyle w:val="ListParagraph"/>
+      </w:pPr>
+      <w:r>
+        <w:t xml:space="preserve">from PyPDF2 import </w:t>
+      </w:r>
+      <w:proofErr w:type="spellStart"/>
+      <w:r>
+        <w:t>PdfReader</w:t>
+      </w:r>
+      <w:proofErr w:type="spellEnd"/>
+      <w:r>
+        <w:t xml:space="preserve">, </w:t>
+      </w:r>
+      <w:proofErr w:type="spellStart"/>
+      <w:r>
+        <w:t>PdfWriter</w:t>
+      </w:r>
+      <w:proofErr w:type="spellEnd"/>
+    </w:p>
+    <w:p>
+      <w:pPr>
+        <w:pStyle w:val="ListParagraph"/>
+      </w:pPr>
+      <w:r>
+        <w:t> </w:t>
+      </w:r>
+    </w:p>
+    <w:p>
+      <w:pPr>
+        <w:pStyle w:val="ListParagraph"/>
+      </w:pPr>
+      <w:r>
+        <w:t xml:space="preserve">def </w:t>
+      </w:r>
+      <w:proofErr w:type="spellStart"/>
+      <w:r>
+        <w:t>rotate_</w:t>
+      </w:r>
+      <w:proofErr w:type="gramStart"/>
+      <w:r>
+        <w:t>pdf</w:t>
+      </w:r>
+      <w:proofErr w:type="spellEnd"/>
+      <w:r>
+        <w:t>(</w:t>
+      </w:r>
+      <w:proofErr w:type="spellStart"/>
+      <w:proofErr w:type="gramEnd"/>
+      <w:r>
+        <w:t>pdf_path</w:t>
+      </w:r>
+      <w:proofErr w:type="spellEnd"/>
+      <w:r>
+        <w:t xml:space="preserve">, </w:t>
+      </w:r>
+      <w:proofErr w:type="spellStart"/>
+      <w:r>
+        <w:t>output_path</w:t>
+      </w:r>
+      <w:proofErr w:type="spellEnd"/>
+      <w:r>
+        <w:t xml:space="preserve">, </w:t>
+      </w:r>
+      <w:proofErr w:type="spellStart"/>
+      <w:r>
+        <w:t>rotation_angle</w:t>
+      </w:r>
+      <w:proofErr w:type="spellEnd"/>
+      <w:r>
+        <w:t>=90):</w:t>
+      </w:r>
+    </w:p>
+    <w:p>
+      <w:pPr>
+        <w:pStyle w:val="ListParagraph"/>
+      </w:pPr>
+      <w:r>
+        <w:t xml:space="preserve">    reader = </w:t>
+      </w:r>
+      <w:proofErr w:type="spellStart"/>
+      <w:r>
+        <w:t>PdfReader</w:t>
+      </w:r>
+      <w:proofErr w:type="spellEnd"/>
+      <w:r>
+        <w:t>(</w:t>
+      </w:r>
+      <w:proofErr w:type="spellStart"/>
+      <w:r>
+        <w:t>pdf_path</w:t>
+      </w:r>
+      <w:proofErr w:type="spellEnd"/>
+      <w:r>
+        <w:t>)</w:t>
+      </w:r>
+    </w:p>
+    <w:p>
+      <w:pPr>
+        <w:pStyle w:val="ListParagraph"/>
+      </w:pPr>
+      <w:r>
+        <w:t xml:space="preserve">    writer = </w:t>
+      </w:r>
+      <w:proofErr w:type="spellStart"/>
+      <w:proofErr w:type="gramStart"/>
+      <w:r>
+        <w:t>PdfWriter</w:t>
+      </w:r>
+      <w:proofErr w:type="spellEnd"/>
+      <w:r>
+        <w:t>(</w:t>
+      </w:r>
+      <w:proofErr w:type="gramEnd"/>
+      <w:r>
+        <w:t>)</w:t>
+      </w:r>
+    </w:p>
+    <w:p>
+      <w:pPr>
+        <w:pStyle w:val="ListParagraph"/>
+      </w:pPr>
+      <w:r>
+        <w:t> </w:t>
+      </w:r>
+    </w:p>
+    <w:p>
+      <w:pPr>
+        <w:pStyle w:val="ListParagraph"/>
+      </w:pPr>
+      <w:r>
+        <w:t xml:space="preserve">    for page in </w:t>
+      </w:r>
+      <w:proofErr w:type="spellStart"/>
+      <w:r>
+        <w:t>reader.pages</w:t>
+      </w:r>
+      <w:proofErr w:type="spellEnd"/>
+      <w:r>
+        <w:t>:</w:t>
+      </w:r>
+    </w:p>
+    <w:p>
+      <w:pPr>
+        <w:pStyle w:val="ListParagraph"/>
+      </w:pPr>
+      <w:r>
+        <w:t>        </w:t>
+      </w:r>
+      <w:proofErr w:type="spellStart"/>
+      <w:proofErr w:type="gramStart"/>
+      <w:r>
+        <w:t>page.rotate</w:t>
+      </w:r>
+      <w:proofErr w:type="spellEnd"/>
+      <w:proofErr w:type="gramEnd"/>
+      <w:r>
+        <w:t>(90)  # Rotate by 90 degrees clockwise</w:t>
+      </w:r>
+    </w:p>
+    <w:p>
+      <w:pPr>
+        <w:pStyle w:val="ListParagraph"/>
+      </w:pPr>
+      <w:r>
+        <w:t>        </w:t>
+      </w:r>
+      <w:proofErr w:type="spellStart"/>
+      <w:r>
+        <w:t>writer.add_page</w:t>
+      </w:r>
+      <w:proofErr w:type="spellEnd"/>
+      <w:r>
+        <w:t>(page)</w:t>
+      </w:r>
+    </w:p>
+    <w:p>
+      <w:pPr>
+        <w:pStyle w:val="ListParagraph"/>
+      </w:pPr>
+      <w:r>
+        <w:t> </w:t>
+      </w:r>
+    </w:p>
+    <w:p>
+      <w:pPr>
+        <w:pStyle w:val="ListParagraph"/>
+      </w:pPr>
+      <w:r>
+        <w:t xml:space="preserve">    with </w:t>
+      </w:r>
+      <w:proofErr w:type="gramStart"/>
+      <w:r>
+        <w:t>open(</w:t>
+      </w:r>
+      <w:proofErr w:type="spellStart"/>
+      <w:proofErr w:type="gramEnd"/>
+      <w:r>
+        <w:t>output_path</w:t>
+      </w:r>
+      <w:proofErr w:type="spellEnd"/>
+      <w:r>
+        <w:t>, "</w:t>
+      </w:r>
+      <w:proofErr w:type="spellStart"/>
+      <w:r>
+        <w:t>wb</w:t>
+      </w:r>
+      <w:proofErr w:type="spellEnd"/>
+      <w:r>
+        <w:t>") as f:</w:t>
+      </w:r>
+    </w:p>
+    <w:p>
+      <w:pPr>
+        <w:pStyle w:val="ListParagraph"/>
+      </w:pPr>
+      <w:r>
+        <w:t>        </w:t>
+      </w:r>
+      <w:proofErr w:type="spellStart"/>
+      <w:proofErr w:type="gramStart"/>
+      <w:r>
+        <w:t>writer.write</w:t>
+      </w:r>
+      <w:proofErr w:type="spellEnd"/>
+      <w:proofErr w:type="gramEnd"/>
+      <w:r>
+        <w:t>(f)</w:t>
+      </w:r>
+    </w:p>
+    <w:p>
+      <w:pPr>
+        <w:pStyle w:val="ListParagraph"/>
+      </w:pPr>
+      <w:r>
+        <w:t> </w:t>
+      </w:r>
+    </w:p>
+    <w:p>
+      <w:pPr>
+        <w:pStyle w:val="ListParagraph"/>
+      </w:pPr>
+      <w:r>
+        <w:t># Example usage:</w:t>
+      </w:r>
+    </w:p>
+    <w:p>
+      <w:pPr>
+        <w:pStyle w:val="ListParagraph"/>
+      </w:pPr>
+      <w:proofErr w:type="spellStart"/>
+      <w:r>
+        <w:t>rotate_</w:t>
+      </w:r>
+      <w:proofErr w:type="gramStart"/>
+      <w:r>
+        <w:t>pdf</w:t>
+      </w:r>
+      <w:proofErr w:type="spellEnd"/>
+      <w:r>
+        <w:t>(</w:t>
+      </w:r>
+      <w:proofErr w:type="gramEnd"/>
+      <w:r>
+        <w:t>"example_resume.pdf", "rotated_resume.pdf")</w:t>
+      </w:r>
+    </w:p>
+    <w:p>
+      <w:pPr>
+        <w:pStyle w:val="ListParagraph"/>
+      </w:pPr>
+      <w:r>
+        <w:rPr>
+          <w:rFonts w:ascii="Segoe UI Emoji" w:hAnsi="Segoe UI Emoji" w:cs="Segoe UI Emoji"/>
+        </w:rPr>
+        <w:t>✅</w:t>
+      </w:r>
+      <w:r>
+        <w:t xml:space="preserve"> 5️</w:t>
+      </w:r>
+      <w:r>
+        <w:rPr>
+          <w:rFonts w:ascii="Segoe UI Symbol" w:hAnsi="Segoe UI Symbol" w:cs="Segoe UI Symbol"/>
+        </w:rPr>
+        <w:t>⃣</w:t>
+      </w:r>
+      <w:r>
+        <w:t xml:space="preserve"> Add a password to a PDF</w:t>
+      </w:r>
+    </w:p>
+    <w:p>
+      <w:pPr>
+        <w:pStyle w:val="ListParagraph"/>
+      </w:pPr>
+      <w:r>
+        <w:lastRenderedPageBreak/>
+        <w:t>python</w:t>
+      </w:r>
+    </w:p>
+    <w:p>
+      <w:pPr>
+        <w:pStyle w:val="ListParagraph"/>
+      </w:pPr>
+      <w:r>
+        <w:t>Copy code</w:t>
+      </w:r>
+    </w:p>
+    <w:p>
+      <w:pPr>
+        <w:pStyle w:val="ListParagraph"/>
+      </w:pPr>
+      <w:r>
+        <w:t xml:space="preserve">from PyPDF2 import </w:t>
+      </w:r>
+      <w:proofErr w:type="spellStart"/>
+      <w:r>
+        <w:t>PdfReader</w:t>
+      </w:r>
+      <w:proofErr w:type="spellEnd"/>
+      <w:r>
+        <w:t xml:space="preserve">, </w:t>
+      </w:r>
+      <w:proofErr w:type="spellStart"/>
+      <w:r>
+        <w:t>PdfWriter</w:t>
+      </w:r>
+      <w:proofErr w:type="spellEnd"/>
+    </w:p>
+    <w:p>
+      <w:pPr>
+        <w:pStyle w:val="ListParagraph"/>
+      </w:pPr>
+      <w:r>
+        <w:t> </w:t>
+      </w:r>
+    </w:p>
+    <w:p>
+      <w:pPr>
+        <w:pStyle w:val="ListParagraph"/>
+      </w:pPr>
+      <w:r>
+        <w:t xml:space="preserve">def </w:t>
+      </w:r>
+      <w:proofErr w:type="spellStart"/>
+      <w:r>
+        <w:t>encrypt_</w:t>
+      </w:r>
+      <w:proofErr w:type="gramStart"/>
+      <w:r>
+        <w:t>pdf</w:t>
+      </w:r>
+      <w:proofErr w:type="spellEnd"/>
+      <w:r>
+        <w:t>(</w:t>
+      </w:r>
+      <w:proofErr w:type="spellStart"/>
+      <w:proofErr w:type="gramEnd"/>
+      <w:r>
+        <w:t>input_pdf</w:t>
+      </w:r>
+      <w:proofErr w:type="spellEnd"/>
+      <w:r>
+        <w:t xml:space="preserve">, </w:t>
+      </w:r>
+      <w:proofErr w:type="spellStart"/>
+      <w:r>
+        <w:t>output_pdf</w:t>
+      </w:r>
+      <w:proofErr w:type="spellEnd"/>
+      <w:r>
+        <w:t>, password):</w:t>
+      </w:r>
+    </w:p>
+    <w:p>
+      <w:pPr>
+        <w:pStyle w:val="ListParagraph"/>
+      </w:pPr>
+      <w:r>
+        <w:t xml:space="preserve">    reader = </w:t>
+      </w:r>
+      <w:proofErr w:type="spellStart"/>
+      <w:r>
+        <w:t>PdfReader</w:t>
+      </w:r>
+      <w:proofErr w:type="spellEnd"/>
+      <w:r>
+        <w:t>(</w:t>
+      </w:r>
+      <w:proofErr w:type="spellStart"/>
+      <w:r>
+        <w:t>input_pdf</w:t>
+      </w:r>
+      <w:proofErr w:type="spellEnd"/>
+      <w:r>
+        <w:t>)</w:t>
+      </w:r>
+    </w:p>
+    <w:p>
+      <w:pPr>
+        <w:pStyle w:val="ListParagraph"/>
+      </w:pPr>
+      <w:r>
+        <w:t xml:space="preserve">    writer = </w:t>
+      </w:r>
+      <w:proofErr w:type="spellStart"/>
+      <w:proofErr w:type="gramStart"/>
+      <w:r>
+        <w:t>PdfWriter</w:t>
+      </w:r>
+      <w:proofErr w:type="spellEnd"/>
+      <w:r>
+        <w:t>(</w:t>
+      </w:r>
+      <w:proofErr w:type="gramEnd"/>
+      <w:r>
+        <w:t>)</w:t>
+      </w:r>
+    </w:p>
+    <w:p>
+      <w:pPr>
+        <w:pStyle w:val="ListParagraph"/>
+      </w:pPr>
+      <w:r>
+        <w:t> </w:t>
+      </w:r>
+    </w:p>
+    <w:p>
+      <w:pPr>
+        <w:pStyle w:val="ListParagraph"/>
+      </w:pPr>
+      <w:r>
+        <w:t xml:space="preserve">    for page in </w:t>
+      </w:r>
+      <w:proofErr w:type="spellStart"/>
+      <w:r>
+        <w:t>reader.pages</w:t>
+      </w:r>
+      <w:proofErr w:type="spellEnd"/>
+      <w:r>
+        <w:t>:</w:t>
+      </w:r>
+    </w:p>
+    <w:p>
+      <w:pPr>
+        <w:pStyle w:val="ListParagraph"/>
+      </w:pPr>
+      <w:r>
+        <w:t>        </w:t>
+      </w:r>
+      <w:proofErr w:type="spellStart"/>
+      <w:r>
+        <w:t>writer.add_page</w:t>
+      </w:r>
+      <w:proofErr w:type="spellEnd"/>
+      <w:r>
+        <w:t>(page)</w:t>
+      </w:r>
+    </w:p>
+    <w:p>
+      <w:pPr>
+        <w:pStyle w:val="ListParagraph"/>
+      </w:pPr>
+      <w:r>
+        <w:t> </w:t>
+      </w:r>
+    </w:p>
+    <w:p>
+      <w:pPr>
+        <w:pStyle w:val="ListParagraph"/>
+      </w:pPr>
+      <w:r>
+        <w:t>    </w:t>
+      </w:r>
+      <w:proofErr w:type="spellStart"/>
+      <w:proofErr w:type="gramStart"/>
+      <w:r>
+        <w:t>writer.encrypt</w:t>
+      </w:r>
+      <w:proofErr w:type="spellEnd"/>
+      <w:proofErr w:type="gramEnd"/>
+      <w:r>
+        <w:t>(password)</w:t>
+      </w:r>
+    </w:p>
+    <w:p>
+      <w:pPr>
+        <w:pStyle w:val="ListParagraph"/>
+      </w:pPr>
+      <w:r>
+        <w:t> </w:t>
+      </w:r>
+    </w:p>
+    <w:p>
+      <w:pPr>
+        <w:pStyle w:val="ListParagraph"/>
+      </w:pPr>
+      <w:r>
+        <w:t xml:space="preserve">    with </w:t>
+      </w:r>
+      <w:proofErr w:type="gramStart"/>
+      <w:r>
+        <w:t>open(</w:t>
+      </w:r>
+      <w:proofErr w:type="spellStart"/>
+      <w:proofErr w:type="gramEnd"/>
+      <w:r>
+        <w:t>output_pdf</w:t>
+      </w:r>
+      <w:proofErr w:type="spellEnd"/>
+      <w:r>
+        <w:t>, "</w:t>
+      </w:r>
+      <w:proofErr w:type="spellStart"/>
+      <w:r>
+        <w:t>wb</w:t>
+      </w:r>
+      <w:proofErr w:type="spellEnd"/>
+      <w:r>
+        <w:t>") as f:</w:t>
+      </w:r>
+    </w:p>
+    <w:p>
+      <w:pPr>
+        <w:pStyle w:val="ListParagraph"/>
+      </w:pPr>
+      <w:r>
+        <w:t>        </w:t>
+      </w:r>
+      <w:proofErr w:type="spellStart"/>
+      <w:proofErr w:type="gramStart"/>
+      <w:r>
+        <w:t>writer.write</w:t>
+      </w:r>
+      <w:proofErr w:type="spellEnd"/>
+      <w:proofErr w:type="gramEnd"/>
+      <w:r>
+        <w:t>(f)</w:t>
+      </w:r>
+    </w:p>
+    <w:p>
+      <w:pPr>
+        <w:pStyle w:val="ListParagraph"/>
+      </w:pPr>
+      <w:r>
+        <w:t> </w:t>
+      </w:r>
+    </w:p>
+    <w:p>
+      <w:pPr>
+        <w:pStyle w:val="ListParagraph"/>
+      </w:pPr>
+      <w:r>
+        <w:t># Example usage:</w:t>
+      </w:r>
+    </w:p>
+    <w:p>
+      <w:pPr>
+        <w:pStyle w:val="ListParagraph"/>
+      </w:pPr>
+      <w:proofErr w:type="spellStart"/>
+      <w:r>
+        <w:t>encrypt_</w:t>
+      </w:r>
+      <w:proofErr w:type="gramStart"/>
+      <w:r>
+        <w:t>pdf</w:t>
+      </w:r>
+      <w:proofErr w:type="spellEnd"/>
+      <w:r>
+        <w:t>(</w:t>
+      </w:r>
+      <w:proofErr w:type="gramEnd"/>
+      <w:r>
+        <w:t>"example_resume.pdf", "protected_resume.pdf", "</w:t>
+      </w:r>
+      <w:proofErr w:type="spellStart"/>
+      <w:r>
+        <w:t>mysecretpassword</w:t>
+      </w:r>
+      <w:proofErr w:type="spellEnd"/>
+      <w:r>
+        <w:t>")</w:t>
+      </w:r>
+    </w:p>
+    <w:p>
+      <w:pPr>
+        <w:pStyle w:val="ListParagraph"/>
+      </w:pPr>
+      <w:r>
+        <w:rPr>
+          <w:rFonts w:ascii="Segoe UI Emoji" w:hAnsi="Segoe UI Emoji" w:cs="Segoe UI Emoji"/>
+        </w:rPr>
+        <w:t>⚡</w:t>
+      </w:r>
+      <w:r>
+        <w:t xml:space="preserve"> Quick Notes</w:t>
+      </w:r>
+    </w:p>
+    <w:p>
+      <w:pPr>
+        <w:pStyle w:val="ListParagraph"/>
+      </w:pPr>
+      <w:r>
+        <w:rPr>
+          <w:rFonts w:ascii="Segoe UI Emoji" w:hAnsi="Segoe UI Emoji" w:cs="Segoe UI Emoji"/>
+        </w:rPr>
+        <w:t>📄</w:t>
+      </w:r>
+      <w:r>
+        <w:t xml:space="preserve"> </w:t>
+      </w:r>
+      <w:proofErr w:type="spellStart"/>
+      <w:r>
+        <w:t>PdfReader</w:t>
+      </w:r>
+      <w:proofErr w:type="spellEnd"/>
+      <w:r>
+        <w:t xml:space="preserve"> → Loads an existing PDF.</w:t>
+      </w:r>
+    </w:p>
+    <w:p>
+      <w:pPr>
+        <w:pStyle w:val="ListParagraph"/>
+      </w:pPr>
+      <w:r>
+        <w:t> </w:t>
+      </w:r>
+    </w:p>
+    <w:p>
+      <w:pPr>
+        <w:pStyle w:val="ListParagraph"/>
+      </w:pPr>
+      <w:r>
+        <w:rPr>
+          <w:rFonts w:ascii="Segoe UI Emoji" w:hAnsi="Segoe UI Emoji" w:cs="Segoe UI Emoji"/>
+        </w:rPr>
+        <w:t>🖊️</w:t>
+      </w:r>
+      <w:r>
+        <w:t xml:space="preserve"> </w:t>
+      </w:r>
+      <w:proofErr w:type="spellStart"/>
+      <w:r>
+        <w:t>PdfWriter</w:t>
+      </w:r>
+      <w:proofErr w:type="spellEnd"/>
+      <w:r>
+        <w:t xml:space="preserve"> → Writes new PDFs.</w:t>
+      </w:r>
+    </w:p>
+    <w:p>
+      <w:pPr>
+        <w:pStyle w:val="ListParagraph"/>
+      </w:pPr>
+      <w:r>
+        <w:t> </w:t>
+      </w:r>
+    </w:p>
+    <w:p>
+      <w:pPr>
+        <w:pStyle w:val="ListParagraph"/>
+      </w:pPr>
+      <w:r>
+        <w:rPr>
+          <w:rFonts w:ascii="Aptos" w:hAnsi="Aptos" w:cs="Aptos"/>
+        </w:rPr>
+        <w:t>🪢</w:t>
+      </w:r>
+      <w:r>
+        <w:t xml:space="preserve"> </w:t>
+      </w:r>
+      <w:proofErr w:type="spellStart"/>
+      <w:r>
+        <w:t>PdfMerger</w:t>
+      </w:r>
+      <w:proofErr w:type="spellEnd"/>
+      <w:r>
+        <w:t xml:space="preserve"> → Combines multiple PDFs.</w:t>
+      </w:r>
+    </w:p>
+    <w:p>
+      <w:pPr>
+        <w:pStyle w:val="ListParagraph"/>
+      </w:pPr>
+      <w:r>
+        <w:t> </w:t>
+      </w:r>
+    </w:p>
+    <w:p>
+      <w:pPr>
+        <w:pStyle w:val="ListParagraph"/>
+      </w:pPr>
+      <w:r>
+        <w:rPr>
+          <w:rFonts w:ascii="Segoe UI Emoji" w:hAnsi="Segoe UI Emoji" w:cs="Segoe UI Emoji"/>
+        </w:rPr>
+        <w:t>🔑</w:t>
+      </w:r>
+      <w:r>
+        <w:t xml:space="preserve"> Encryption → Adds simple password protection.</w:t>
+      </w:r>
+    </w:p>
+    <w:p>
+      <w:pPr>
+        <w:pStyle w:val="ListParagraph"/>
+      </w:pPr>
+      <w:r>
+        <w:t> </w:t>
+      </w:r>
+    </w:p>
+    <w:p>
+      <w:pPr>
+        <w:pStyle w:val="ListParagraph"/>
+      </w:pPr>
+      <w:r>
+        <w:rPr>
+          <w:rFonts w:ascii="Segoe UI Emoji" w:hAnsi="Segoe UI Emoji" w:cs="Segoe UI Emoji"/>
+        </w:rPr>
+        <w:t>🚫</w:t>
+      </w:r>
+      <w:r>
+        <w:t xml:space="preserve"> OCR → PyPDF2 can’t read scanned images — you’d need </w:t>
+      </w:r>
+      <w:proofErr w:type="spellStart"/>
+      <w:r>
+        <w:t>pytesseract</w:t>
+      </w:r>
+      <w:proofErr w:type="spellEnd"/>
+      <w:r>
+        <w:t xml:space="preserve"> for that.</w:t>
+      </w:r>
+    </w:p>
+    <w:p>
+      <w:pPr>
+        <w:pStyle w:val="ListParagraph"/>
+      </w:pPr>
+      <w:r>
+        <w:t> </w:t>
+      </w:r>
+    </w:p>
+    <w:p>
+      <w:pPr>
+        <w:pStyle w:val="ListParagraph"/>
+      </w:pPr>
+      <w:r>
+        <w:t>If you’d like, I can show:</w:t>
+      </w:r>
+    </w:p>
+    <w:p>
+      <w:pPr>
+        <w:pStyle w:val="ListParagraph"/>
+      </w:pPr>
+      <w:r>
+        <w:rPr>
+          <w:rFonts w:ascii="Segoe UI Emoji" w:hAnsi="Segoe UI Emoji" w:cs="Segoe UI Emoji"/>
+        </w:rPr>
+        <w:t>✅</w:t>
+      </w:r>
+      <w:r>
+        <w:t xml:space="preserve"> An example for OCR with scanned PDFs</w:t>
+      </w:r>
+    </w:p>
+    <w:p>
+      <w:pPr>
+        <w:pStyle w:val="ListParagraph"/>
+      </w:pPr>
+      <w:r>
+        <w:rPr>
+          <w:rFonts w:ascii="Segoe UI Emoji" w:hAnsi="Segoe UI Emoji" w:cs="Segoe UI Emoji"/>
+        </w:rPr>
+        <w:t>✅</w:t>
+      </w:r>
+      <w:r>
+        <w:t xml:space="preserve"> Or wrap any of these in a console app like your resume shortlisting!</w:t>
+      </w:r>
+    </w:p>
+    <w:p>
+      <w:pPr>
+        <w:pStyle w:val="ListParagraph"/>
+      </w:pPr>
+      <w:r>
+        <w:t> </w:t>
+      </w:r>
+    </w:p>
+    <w:p>
+      <w:pPr>
+        <w:pStyle w:val="ListParagraph"/>
+      </w:pPr>
+      <w:r>
+        <w:t xml:space="preserve">Just say “Show me OCR version!” and I’ll build it for you. </w:t>
+      </w:r>
+      <w:r>
+        <w:rPr>
+          <w:rFonts w:ascii="Segoe UI Emoji" w:hAnsi="Segoe UI Emoji" w:cs="Segoe UI Emoji"/>
+        </w:rPr>
+        <w:t>📚✨</w:t>
+      </w:r>
+    </w:p>
+    <w:p>
+      <w:pPr>
+        <w:pStyle w:val="ListParagraph"/>
+        <w:rPr>
+          <w:lang w:val="en-US"/>
+        </w:rPr>
+      </w:pPr>
     </w:p>
     <w:p>
       <w:pPr>
@@ -6064,7 +10284,6 @@
   <w:style w:type="character" w:default="1" w:styleId="DefaultParagraphFont">
     <w:name w:val="Default Paragraph Font"/>
     <w:uiPriority w:val="1"/>
-    <w:semiHidden/>
     <w:unhideWhenUsed/>
   </w:style>
   <w:style w:type="table" w:default="1" w:styleId="TableNormal">

</xml_diff>

<commit_message>
Dspy notes added in doc
</commit_message>
<xml_diff>
--- a/Learning_material.docx
+++ b/Learning_material.docx
@@ -7593,13 +7593,1444 @@
         </w:rPr>
       </w:pPr>
     </w:p>
+    <w:p>
+      <w:pPr>
+        <w:pStyle w:val="ListParagraph"/>
+        <w:rPr>
+          <w:lang w:val="en-US"/>
+        </w:rPr>
+      </w:pPr>
+    </w:p>
+    <w:p>
+      <w:pPr>
+        <w:pStyle w:val="ListParagraph"/>
+        <w:rPr>
+          <w:lang w:val="en-US"/>
+        </w:rPr>
+      </w:pPr>
+    </w:p>
+    <w:p>
+      <w:pPr>
+        <w:pStyle w:val="ListParagraph"/>
+        <w:rPr>
+          <w:lang w:val="en-US"/>
+        </w:rPr>
+      </w:pPr>
+    </w:p>
+    <w:p>
+      <w:pPr>
+        <w:pStyle w:val="ListParagraph"/>
+        <w:rPr>
+          <w:lang w:val="en-US"/>
+        </w:rPr>
+      </w:pPr>
+    </w:p>
+    <w:p>
+      <w:pPr>
+        <w:pStyle w:val="ListParagraph"/>
+        <w:rPr>
+          <w:lang w:val="en-US"/>
+        </w:rPr>
+      </w:pPr>
+    </w:p>
+    <w:p>
+      <w:pPr>
+        <w:pStyle w:val="ListParagraph"/>
+        <w:rPr>
+          <w:lang w:val="en-US"/>
+        </w:rPr>
+      </w:pPr>
+    </w:p>
+    <w:p>
+      <w:pPr>
+        <w:pStyle w:val="ListParagraph"/>
+        <w:rPr>
+          <w:lang w:val="en-US"/>
+        </w:rPr>
+      </w:pPr>
+    </w:p>
+    <w:p>
+      <w:pPr>
+        <w:pStyle w:val="ListParagraph"/>
+      </w:pPr>
+      <w:r>
+        <w:rPr>
+          <w:b/>
+          <w:bCs/>
+          <w:sz w:val="28"/>
+          <w:szCs w:val="28"/>
+          <w:lang w:val="en-US"/>
+        </w:rPr>
+        <w:t>Agent</w:t>
+      </w:r>
+      <w:r>
+        <w:rPr>
+          <w:b/>
+          <w:bCs/>
+          <w:sz w:val="28"/>
+          <w:szCs w:val="28"/>
+          <w:lang w:val="en-US"/>
+        </w:rPr>
+        <w:br/>
+      </w:r>
+      <w:r>
+        <w:t>In Agentic AI, an agent is a software entity (often powered by a large language model like GPT) that can:</w:t>
+      </w:r>
+    </w:p>
+    <w:p>
+      <w:pPr>
+        <w:pStyle w:val="ListParagraph"/>
+      </w:pPr>
+      <w:r>
+        <w:t> </w:t>
+      </w:r>
+    </w:p>
+    <w:p>
+      <w:pPr>
+        <w:pStyle w:val="ListParagraph"/>
+      </w:pPr>
+      <w:r>
+        <w:t>Perceive tasks or goals,</w:t>
+      </w:r>
+    </w:p>
+    <w:p>
+      <w:pPr>
+        <w:pStyle w:val="ListParagraph"/>
+      </w:pPr>
+      <w:r>
+        <w:t> </w:t>
+      </w:r>
+    </w:p>
+    <w:p>
+      <w:pPr>
+        <w:pStyle w:val="ListParagraph"/>
+      </w:pPr>
+      <w:r>
+        <w:t>Reason about what to do,</w:t>
+      </w:r>
+    </w:p>
+    <w:p>
+      <w:pPr>
+        <w:pStyle w:val="ListParagraph"/>
+      </w:pPr>
+      <w:r>
+        <w:t> </w:t>
+      </w:r>
+    </w:p>
+    <w:p>
+      <w:pPr>
+        <w:pStyle w:val="ListParagraph"/>
+      </w:pPr>
+      <w:r>
+        <w:t>Take actions in tools or environments,</w:t>
+      </w:r>
+    </w:p>
+    <w:p>
+      <w:pPr>
+        <w:pStyle w:val="ListParagraph"/>
+      </w:pPr>
+      <w:r>
+        <w:t> </w:t>
+      </w:r>
+    </w:p>
+    <w:p>
+      <w:pPr>
+        <w:pStyle w:val="ListParagraph"/>
+      </w:pPr>
+      <w:r>
+        <w:t>Learn or adapt, and</w:t>
+      </w:r>
+    </w:p>
+    <w:p>
+      <w:pPr>
+        <w:pStyle w:val="ListParagraph"/>
+      </w:pPr>
+      <w:r>
+        <w:t> </w:t>
+      </w:r>
+    </w:p>
+    <w:p>
+      <w:pPr>
+        <w:pStyle w:val="ListParagraph"/>
+      </w:pPr>
+      <w:r>
+        <w:t>Execute sequences of steps—all while maintaining autonomy.</w:t>
+      </w:r>
+    </w:p>
+    <w:p>
+      <w:pPr>
+        <w:pStyle w:val="ListParagraph"/>
+      </w:pPr>
+      <w:r>
+        <w:t> </w:t>
+      </w:r>
+    </w:p>
+    <w:p>
+      <w:pPr>
+        <w:pStyle w:val="ListParagraph"/>
+      </w:pPr>
+      <w:r>
+        <w:t>Key Idea: Unlike traditional LLMs that answer questions one-by-one, agentic AI systems behave like digital workers or assistants who can plan, act, observe outcomes, and adapt.</w:t>
+      </w:r>
+    </w:p>
+    <w:p>
+      <w:pPr>
+        <w:pStyle w:val="ListParagraph"/>
+      </w:pPr>
+      <w:r>
+        <w:t> </w:t>
+      </w:r>
+    </w:p>
+    <w:p>
+      <w:pPr>
+        <w:pStyle w:val="ListParagraph"/>
+      </w:pPr>
+      <w:r>
+        <w:rPr>
+          <w:rFonts w:ascii="Segoe UI Emoji" w:hAnsi="Segoe UI Emoji" w:cs="Segoe UI Emoji"/>
+        </w:rPr>
+        <w:t>🧭</w:t>
+      </w:r>
+      <w:r>
+        <w:t xml:space="preserve"> Core Architecture of an Agent in Agentic AI</w:t>
+      </w:r>
+    </w:p>
+    <w:p>
+      <w:pPr>
+        <w:pStyle w:val="ListParagraph"/>
+      </w:pPr>
+      <w:r>
+        <w:t>Here's a diagram of an Agent Loop (often used in Agentic AI frameworks):</w:t>
+      </w:r>
+    </w:p>
+    <w:p>
+      <w:pPr>
+        <w:pStyle w:val="ListParagraph"/>
+      </w:pPr>
+      <w:r>
+        <w:t> </w:t>
+      </w:r>
+    </w:p>
+    <w:p>
+      <w:pPr>
+        <w:pStyle w:val="ListParagraph"/>
+      </w:pPr>
+      <w:proofErr w:type="spellStart"/>
+      <w:r>
+        <w:t>vbnet</w:t>
+      </w:r>
+      <w:proofErr w:type="spellEnd"/>
+    </w:p>
+    <w:p>
+      <w:pPr>
+        <w:pStyle w:val="ListParagraph"/>
+      </w:pPr>
+      <w:r>
+        <w:t>      ┌────────────────────┐</w:t>
+      </w:r>
+    </w:p>
+    <w:p>
+      <w:pPr>
+        <w:pStyle w:val="ListParagraph"/>
+      </w:pPr>
+      <w:r>
+        <w:t>      │    User Prompt     │</w:t>
+      </w:r>
+    </w:p>
+    <w:p>
+      <w:pPr>
+        <w:pStyle w:val="ListParagraph"/>
+      </w:pPr>
+      <w:r>
+        <w:t>      └────────</w:t>
+      </w:r>
+      <w:r>
+        <w:rPr>
+          <w:rFonts w:ascii="Arial" w:hAnsi="Arial" w:cs="Arial"/>
+        </w:rPr>
+        <w:t>┬</w:t>
+      </w:r>
+      <w:r>
+        <w:rPr>
+          <w:rFonts w:ascii="Aptos" w:hAnsi="Aptos" w:cs="Aptos"/>
+        </w:rPr>
+        <w:t>───────────┘</w:t>
+      </w:r>
+    </w:p>
+    <w:p>
+      <w:pPr>
+        <w:pStyle w:val="ListParagraph"/>
+      </w:pPr>
+      <w:r>
+        <w:t>               │</w:t>
+      </w:r>
+    </w:p>
+    <w:p>
+      <w:pPr>
+        <w:pStyle w:val="ListParagraph"/>
+      </w:pPr>
+      <w:r>
+        <w:t>               </w:t>
+      </w:r>
+      <w:r>
+        <w:rPr>
+          <w:rFonts w:ascii="Arial" w:hAnsi="Arial" w:cs="Arial"/>
+        </w:rPr>
+        <w:t>▼</w:t>
+      </w:r>
+    </w:p>
+    <w:p>
+      <w:pPr>
+        <w:pStyle w:val="ListParagraph"/>
+      </w:pPr>
+      <w:r>
+        <w:t>        ┌──────────────┐</w:t>
+      </w:r>
+    </w:p>
+    <w:p>
+      <w:pPr>
+        <w:pStyle w:val="ListParagraph"/>
+      </w:pPr>
+      <w:r>
+        <w:t>        │   Planning   │</w:t>
+      </w:r>
+      <w:r>
+        <w:rPr>
+          <w:rFonts w:ascii="Arial" w:hAnsi="Arial" w:cs="Arial"/>
+        </w:rPr>
+        <w:t>◄</w:t>
+      </w:r>
+      <w:r>
+        <w:rPr>
+          <w:rFonts w:ascii="Aptos" w:hAnsi="Aptos" w:cs="Aptos"/>
+        </w:rPr>
+        <w:t>───┐</w:t>
+      </w:r>
+    </w:p>
+    <w:p>
+      <w:pPr>
+        <w:pStyle w:val="ListParagraph"/>
+      </w:pPr>
+      <w:r>
+        <w:t>        └─────</w:t>
+      </w:r>
+      <w:r>
+        <w:rPr>
+          <w:rFonts w:ascii="Arial" w:hAnsi="Arial" w:cs="Arial"/>
+        </w:rPr>
+        <w:t>┬</w:t>
+      </w:r>
+      <w:r>
+        <w:rPr>
+          <w:rFonts w:ascii="Aptos" w:hAnsi="Aptos" w:cs="Aptos"/>
+        </w:rPr>
+        <w:t>────────┘    │</w:t>
+      </w:r>
+    </w:p>
+    <w:p>
+      <w:pPr>
+        <w:pStyle w:val="ListParagraph"/>
+      </w:pPr>
+      <w:r>
+        <w:t>              </w:t>
+      </w:r>
+      <w:r>
+        <w:rPr>
+          <w:rFonts w:ascii="Arial" w:hAnsi="Arial" w:cs="Arial"/>
+        </w:rPr>
+        <w:t>▼</w:t>
+      </w:r>
+      <w:r>
+        <w:rPr>
+          <w:rFonts w:ascii="Aptos" w:hAnsi="Aptos" w:cs="Aptos"/>
+        </w:rPr>
+        <w:t>             │</w:t>
+      </w:r>
+    </w:p>
+    <w:p>
+      <w:pPr>
+        <w:pStyle w:val="ListParagraph"/>
+      </w:pPr>
+      <w:r>
+        <w:t>        ┌──────────────┐    │</w:t>
+      </w:r>
+    </w:p>
+    <w:p>
+      <w:pPr>
+        <w:pStyle w:val="ListParagraph"/>
+      </w:pPr>
+      <w:r>
+        <w:t>        │   </w:t>
+      </w:r>
+      <w:proofErr w:type="gramStart"/>
+      <w:r>
+        <w:t>Execution  │</w:t>
+      </w:r>
+      <w:proofErr w:type="gramEnd"/>
+      <w:r>
+        <w:t>────┘</w:t>
+      </w:r>
+    </w:p>
+    <w:p>
+      <w:pPr>
+        <w:pStyle w:val="ListParagraph"/>
+      </w:pPr>
+      <w:r>
+        <w:t>        └─────</w:t>
+      </w:r>
+      <w:r>
+        <w:rPr>
+          <w:rFonts w:ascii="Arial" w:hAnsi="Arial" w:cs="Arial"/>
+        </w:rPr>
+        <w:t>┬</w:t>
+      </w:r>
+      <w:r>
+        <w:rPr>
+          <w:rFonts w:ascii="Aptos" w:hAnsi="Aptos" w:cs="Aptos"/>
+        </w:rPr>
+        <w:t>────────┘</w:t>
+      </w:r>
+    </w:p>
+    <w:p>
+      <w:pPr>
+        <w:pStyle w:val="ListParagraph"/>
+      </w:pPr>
+      <w:r>
+        <w:t>              </w:t>
+      </w:r>
+      <w:r>
+        <w:rPr>
+          <w:rFonts w:ascii="Arial" w:hAnsi="Arial" w:cs="Arial"/>
+        </w:rPr>
+        <w:t>▼</w:t>
+      </w:r>
+    </w:p>
+    <w:p>
+      <w:pPr>
+        <w:pStyle w:val="ListParagraph"/>
+      </w:pPr>
+      <w:r>
+        <w:t>        ┌──────────────┐</w:t>
+      </w:r>
+    </w:p>
+    <w:p>
+      <w:pPr>
+        <w:pStyle w:val="ListParagraph"/>
+      </w:pPr>
+      <w:r>
+        <w:t xml:space="preserve">        │ </w:t>
+      </w:r>
+      <w:proofErr w:type="gramStart"/>
+      <w:r>
+        <w:t>Observation  │</w:t>
+      </w:r>
+      <w:proofErr w:type="gramEnd"/>
+    </w:p>
+    <w:p>
+      <w:pPr>
+        <w:pStyle w:val="ListParagraph"/>
+      </w:pPr>
+      <w:r>
+        <w:t>        └─────</w:t>
+      </w:r>
+      <w:r>
+        <w:rPr>
+          <w:rFonts w:ascii="Arial" w:hAnsi="Arial" w:cs="Arial"/>
+        </w:rPr>
+        <w:t>┬</w:t>
+      </w:r>
+      <w:r>
+        <w:rPr>
+          <w:rFonts w:ascii="Aptos" w:hAnsi="Aptos" w:cs="Aptos"/>
+        </w:rPr>
+        <w:t>────────┘</w:t>
+      </w:r>
+    </w:p>
+    <w:p>
+      <w:pPr>
+        <w:pStyle w:val="ListParagraph"/>
+      </w:pPr>
+      <w:r>
+        <w:t>              </w:t>
+      </w:r>
+      <w:r>
+        <w:rPr>
+          <w:rFonts w:ascii="Arial" w:hAnsi="Arial" w:cs="Arial"/>
+        </w:rPr>
+        <w:t>▼</w:t>
+      </w:r>
+    </w:p>
+    <w:p>
+      <w:pPr>
+        <w:pStyle w:val="ListParagraph"/>
+      </w:pPr>
+      <w:r>
+        <w:t>        ┌──────────────┐</w:t>
+      </w:r>
+    </w:p>
+    <w:p>
+      <w:pPr>
+        <w:pStyle w:val="ListParagraph"/>
+      </w:pPr>
+      <w:r>
+        <w:t>        │   Reflection │</w:t>
+      </w:r>
+    </w:p>
+    <w:p>
+      <w:pPr>
+        <w:pStyle w:val="ListParagraph"/>
+      </w:pPr>
+      <w:r>
+        <w:t>        └─────</w:t>
+      </w:r>
+      <w:r>
+        <w:rPr>
+          <w:rFonts w:ascii="Arial" w:hAnsi="Arial" w:cs="Arial"/>
+        </w:rPr>
+        <w:t>┬</w:t>
+      </w:r>
+      <w:r>
+        <w:rPr>
+          <w:rFonts w:ascii="Aptos" w:hAnsi="Aptos" w:cs="Aptos"/>
+        </w:rPr>
+        <w:t>────────┘</w:t>
+      </w:r>
+    </w:p>
+    <w:p>
+      <w:pPr>
+        <w:pStyle w:val="ListParagraph"/>
+      </w:pPr>
+      <w:r>
+        <w:t>              │</w:t>
+      </w:r>
+    </w:p>
+    <w:p>
+      <w:pPr>
+        <w:pStyle w:val="ListParagraph"/>
+      </w:pPr>
+      <w:r>
+        <w:lastRenderedPageBreak/>
+        <w:t>              </w:t>
+      </w:r>
+      <w:r>
+        <w:rPr>
+          <w:rFonts w:ascii="Arial" w:hAnsi="Arial" w:cs="Arial"/>
+        </w:rPr>
+        <w:t>▼</w:t>
+      </w:r>
+    </w:p>
+    <w:p>
+      <w:pPr>
+        <w:pStyle w:val="ListParagraph"/>
+      </w:pPr>
+      <w:r>
+        <w:t>        ┌──────────────┐</w:t>
+      </w:r>
+    </w:p>
+    <w:p>
+      <w:pPr>
+        <w:pStyle w:val="ListParagraph"/>
+      </w:pPr>
+      <w:r>
+        <w:t>        │ Next Action? │─No─</w:t>
+      </w:r>
+      <w:r>
+        <w:rPr>
+          <w:rFonts w:ascii="Cambria Math" w:hAnsi="Cambria Math" w:cs="Cambria Math"/>
+        </w:rPr>
+        <w:t>▶</w:t>
+      </w:r>
+      <w:r>
+        <w:t xml:space="preserve"> Stop</w:t>
+      </w:r>
+    </w:p>
+    <w:p>
+      <w:pPr>
+        <w:pStyle w:val="ListParagraph"/>
+      </w:pPr>
+      <w:r>
+        <w:t>        └─────</w:t>
+      </w:r>
+      <w:r>
+        <w:rPr>
+          <w:rFonts w:ascii="Arial" w:hAnsi="Arial" w:cs="Arial"/>
+        </w:rPr>
+        <w:t>┬</w:t>
+      </w:r>
+      <w:r>
+        <w:rPr>
+          <w:rFonts w:ascii="Aptos" w:hAnsi="Aptos" w:cs="Aptos"/>
+        </w:rPr>
+        <w:t>────────┘</w:t>
+      </w:r>
+    </w:p>
+    <w:p>
+      <w:pPr>
+        <w:pStyle w:val="ListParagraph"/>
+      </w:pPr>
+      <w:r>
+        <w:t>              </w:t>
+      </w:r>
+      <w:r>
+        <w:rPr>
+          <w:rFonts w:ascii="Arial" w:hAnsi="Arial" w:cs="Arial"/>
+        </w:rPr>
+        <w:t>▼</w:t>
+      </w:r>
+      <w:r>
+        <w:t xml:space="preserve"> Yes</w:t>
+      </w:r>
+    </w:p>
+    <w:p>
+      <w:pPr>
+        <w:pStyle w:val="ListParagraph"/>
+      </w:pPr>
+      <w:r>
+        <w:t>           Repeat loop</w:t>
+      </w:r>
+    </w:p>
+    <w:p>
+      <w:pPr>
+        <w:pStyle w:val="ListParagraph"/>
+      </w:pPr>
+      <w:r>
+        <w:t>This loop allows the agent to:</w:t>
+      </w:r>
+    </w:p>
+    <w:p>
+      <w:pPr>
+        <w:pStyle w:val="ListParagraph"/>
+      </w:pPr>
+      <w:r>
+        <w:t> </w:t>
+      </w:r>
+    </w:p>
+    <w:p>
+      <w:pPr>
+        <w:pStyle w:val="ListParagraph"/>
+      </w:pPr>
+      <w:r>
+        <w:t>Plan what needs to be done</w:t>
+      </w:r>
+    </w:p>
+    <w:p>
+      <w:pPr>
+        <w:pStyle w:val="ListParagraph"/>
+      </w:pPr>
+      <w:r>
+        <w:t> </w:t>
+      </w:r>
+    </w:p>
+    <w:p>
+      <w:pPr>
+        <w:pStyle w:val="ListParagraph"/>
+      </w:pPr>
+      <w:r>
+        <w:t>Act (call APIs, code, browse, etc.)</w:t>
+      </w:r>
+    </w:p>
+    <w:p>
+      <w:pPr>
+        <w:pStyle w:val="ListParagraph"/>
+      </w:pPr>
+      <w:r>
+        <w:t> </w:t>
+      </w:r>
+    </w:p>
+    <w:p>
+      <w:pPr>
+        <w:pStyle w:val="ListParagraph"/>
+      </w:pPr>
+      <w:r>
+        <w:t>Observe the results</w:t>
+      </w:r>
+    </w:p>
+    <w:p>
+      <w:pPr>
+        <w:pStyle w:val="ListParagraph"/>
+      </w:pPr>
+      <w:r>
+        <w:t> </w:t>
+      </w:r>
+    </w:p>
+    <w:p>
+      <w:pPr>
+        <w:pStyle w:val="ListParagraph"/>
+      </w:pPr>
+      <w:r>
+        <w:t>Reflect on progress</w:t>
+      </w:r>
+    </w:p>
+    <w:p>
+      <w:pPr>
+        <w:pStyle w:val="ListParagraph"/>
+      </w:pPr>
+      <w:r>
+        <w:t> </w:t>
+      </w:r>
+    </w:p>
+    <w:p>
+      <w:pPr>
+        <w:pStyle w:val="ListParagraph"/>
+      </w:pPr>
+      <w:r>
+        <w:t>Adapt future actions</w:t>
+      </w:r>
+    </w:p>
+    <w:p>
+      <w:pPr>
+        <w:pStyle w:val="ListParagraph"/>
+      </w:pPr>
+      <w:r>
+        <w:t> </w:t>
+      </w:r>
+    </w:p>
+    <w:p>
+      <w:pPr>
+        <w:pStyle w:val="ListParagraph"/>
+        <w:rPr>
+          <w:b/>
+          <w:bCs/>
+        </w:rPr>
+      </w:pPr>
+      <w:r>
+        <w:rPr>
+          <w:rFonts w:ascii="Segoe UI Emoji" w:hAnsi="Segoe UI Emoji" w:cs="Segoe UI Emoji"/>
+          <w:b/>
+          <w:bCs/>
+        </w:rPr>
+        <w:t>🧩</w:t>
+      </w:r>
+      <w:r>
+        <w:rPr>
+          <w:b/>
+          <w:bCs/>
+        </w:rPr>
+        <w:t xml:space="preserve"> Types of Agents in Agentic AI</w:t>
+      </w:r>
+    </w:p>
+    <w:p>
+      <w:pPr>
+        <w:pStyle w:val="ListParagraph"/>
+      </w:pPr>
+      <w:r>
+        <w:t>Here are common types of agents used in agentic systems:</w:t>
+      </w:r>
+    </w:p>
+    <w:p>
+      <w:pPr>
+        <w:pStyle w:val="ListParagraph"/>
+      </w:pPr>
+      <w:r>
+        <w:t> </w:t>
+      </w:r>
+    </w:p>
+    <w:p>
+      <w:pPr>
+        <w:pStyle w:val="ListParagraph"/>
+      </w:pPr>
+      <w:r>
+        <w:t>Type Description Example</w:t>
+      </w:r>
+    </w:p>
+    <w:p>
+      <w:pPr>
+        <w:pStyle w:val="ListParagraph"/>
+      </w:pPr>
+      <w:r>
+        <w:rPr>
+          <w:b/>
+          <w:bCs/>
+        </w:rPr>
+        <w:t>Task Agents</w:t>
+      </w:r>
+      <w:r>
+        <w:t xml:space="preserve"> Focus on completing a defined task Fill out a form, send emails</w:t>
+      </w:r>
+    </w:p>
+    <w:p>
+      <w:pPr>
+        <w:pStyle w:val="ListParagraph"/>
+      </w:pPr>
+      <w:r>
+        <w:t>Tool-Using Agents Use external tools or APIs to perform tasks Code interpreter, web browser, SQL executor</w:t>
+      </w:r>
+    </w:p>
+    <w:p>
+      <w:pPr>
+        <w:pStyle w:val="ListParagraph"/>
+      </w:pPr>
+      <w:r>
+        <w:t>Multi-Agent Systems Multiple agents collaborating Research assistant + data cleaner + visualizer</w:t>
+      </w:r>
+    </w:p>
+    <w:p>
+      <w:pPr>
+        <w:pStyle w:val="ListParagraph"/>
+      </w:pPr>
+      <w:r>
+        <w:t>Memory-Enhanced Agents Retain past context to reason better Long-running assistants</w:t>
+      </w:r>
+    </w:p>
+    <w:p>
+      <w:pPr>
+        <w:pStyle w:val="ListParagraph"/>
+      </w:pPr>
+      <w:r>
+        <w:rPr>
+          <w:b/>
+          <w:bCs/>
+        </w:rPr>
+        <w:t>Autonomous Agents</w:t>
+      </w:r>
+      <w:r>
+        <w:t xml:space="preserve"> Run without step-by-step instructions "Plan a marketing campaign end-to-end"</w:t>
+      </w:r>
+    </w:p>
+    <w:p>
+      <w:pPr>
+        <w:pStyle w:val="ListParagraph"/>
+      </w:pPr>
+      <w:r>
+        <w:t> </w:t>
+      </w:r>
+    </w:p>
+    <w:p>
+      <w:pPr>
+        <w:pStyle w:val="ListParagraph"/>
+      </w:pPr>
+      <w:r>
+        <w:rPr>
+          <w:rFonts w:ascii="Segoe UI Emoji" w:hAnsi="Segoe UI Emoji" w:cs="Segoe UI Emoji"/>
+        </w:rPr>
+        <w:t>🔍</w:t>
+      </w:r>
+      <w:r>
+        <w:t xml:space="preserve"> What is an Autonomous Agent in Agentic AI?</w:t>
+      </w:r>
+    </w:p>
+    <w:p>
+      <w:pPr>
+        <w:pStyle w:val="ListParagraph"/>
+      </w:pPr>
+      <w:r>
+        <w:t>An Autonomous Agent is one that can:</w:t>
+      </w:r>
+    </w:p>
+    <w:p>
+      <w:pPr>
+        <w:pStyle w:val="ListParagraph"/>
+      </w:pPr>
+      <w:r>
+        <w:t> </w:t>
+      </w:r>
+    </w:p>
+    <w:p>
+      <w:pPr>
+        <w:pStyle w:val="ListParagraph"/>
+      </w:pPr>
+      <w:r>
+        <w:t>Understand a goal from high-level input</w:t>
+      </w:r>
+    </w:p>
+    <w:p>
+      <w:pPr>
+        <w:pStyle w:val="ListParagraph"/>
+      </w:pPr>
+      <w:r>
+        <w:t> </w:t>
+      </w:r>
+    </w:p>
+    <w:p>
+      <w:pPr>
+        <w:pStyle w:val="ListParagraph"/>
+      </w:pPr>
+      <w:r>
+        <w:t>Break it down into subtasks</w:t>
+      </w:r>
+    </w:p>
+    <w:p>
+      <w:pPr>
+        <w:pStyle w:val="ListParagraph"/>
+      </w:pPr>
+      <w:r>
+        <w:t> </w:t>
+      </w:r>
+    </w:p>
+    <w:p>
+      <w:pPr>
+        <w:pStyle w:val="ListParagraph"/>
+      </w:pPr>
+      <w:r>
+        <w:t>Use tools (e.g., Python, Web, File I/O)</w:t>
+      </w:r>
+    </w:p>
+    <w:p>
+      <w:pPr>
+        <w:pStyle w:val="ListParagraph"/>
+      </w:pPr>
+      <w:r>
+        <w:t> </w:t>
+      </w:r>
+    </w:p>
+    <w:p>
+      <w:pPr>
+        <w:pStyle w:val="ListParagraph"/>
+      </w:pPr>
+      <w:r>
+        <w:t>Execute plans step-by-step</w:t>
+      </w:r>
+    </w:p>
+    <w:p>
+      <w:pPr>
+        <w:pStyle w:val="ListParagraph"/>
+      </w:pPr>
+      <w:r>
+        <w:t> </w:t>
+      </w:r>
+    </w:p>
+    <w:p>
+      <w:pPr>
+        <w:pStyle w:val="ListParagraph"/>
+      </w:pPr>
+      <w:r>
+        <w:t>Track progress and revise plans if needed</w:t>
+      </w:r>
+    </w:p>
+    <w:p>
+      <w:pPr>
+        <w:pStyle w:val="ListParagraph"/>
+      </w:pPr>
+      <w:r>
+        <w:lastRenderedPageBreak/>
+        <w:t> </w:t>
+      </w:r>
+    </w:p>
+    <w:p>
+      <w:pPr>
+        <w:pStyle w:val="ListParagraph"/>
+      </w:pPr>
+      <w:r>
+        <w:t>Finish the task with little or no human supervision</w:t>
+      </w:r>
+    </w:p>
+    <w:p>
+      <w:pPr>
+        <w:pStyle w:val="ListParagraph"/>
+      </w:pPr>
+      <w:r>
+        <w:t> </w:t>
+      </w:r>
+    </w:p>
+    <w:p>
+      <w:pPr>
+        <w:pStyle w:val="ListParagraph"/>
+      </w:pPr>
+      <w:r>
+        <w:rPr>
+          <w:rFonts w:ascii="Segoe UI Emoji" w:hAnsi="Segoe UI Emoji" w:cs="Segoe UI Emoji"/>
+        </w:rPr>
+        <w:t>🔁</w:t>
+      </w:r>
+      <w:r>
+        <w:t xml:space="preserve"> Think of it as a self-directed AI worker.</w:t>
+      </w:r>
+    </w:p>
+    <w:p>
+      <w:pPr>
+        <w:pStyle w:val="ListParagraph"/>
+      </w:pPr>
+      <w:r>
+        <w:t> </w:t>
+      </w:r>
+    </w:p>
+    <w:p>
+      <w:pPr>
+        <w:pStyle w:val="ListParagraph"/>
+      </w:pPr>
+      <w:r>
+        <w:rPr>
+          <w:rFonts w:ascii="Segoe UI Emoji" w:hAnsi="Segoe UI Emoji" w:cs="Segoe UI Emoji"/>
+        </w:rPr>
+        <w:t>✅</w:t>
+      </w:r>
+      <w:r>
+        <w:t xml:space="preserve"> Real Example: GPT-Based Autonomous Agent for Data Analysis</w:t>
+      </w:r>
+    </w:p>
+    <w:p>
+      <w:pPr>
+        <w:pStyle w:val="ListParagraph"/>
+      </w:pPr>
+      <w:r>
+        <w:t>Component Function</w:t>
+      </w:r>
+    </w:p>
+    <w:p>
+      <w:pPr>
+        <w:pStyle w:val="ListParagraph"/>
+      </w:pPr>
+      <w:r>
+        <w:t>Goal Input “</w:t>
+      </w:r>
+      <w:proofErr w:type="spellStart"/>
+      <w:r>
+        <w:t>Analyze</w:t>
+      </w:r>
+      <w:proofErr w:type="spellEnd"/>
+      <w:r>
+        <w:t xml:space="preserve"> sales data and summarize trends”</w:t>
+      </w:r>
+    </w:p>
+    <w:p>
+      <w:pPr>
+        <w:pStyle w:val="ListParagraph"/>
+      </w:pPr>
+      <w:r>
+        <w:t xml:space="preserve">Planning Module Breaks task into: Load Data → Clean → </w:t>
+      </w:r>
+      <w:proofErr w:type="spellStart"/>
+      <w:r>
+        <w:t>Analyze</w:t>
+      </w:r>
+      <w:proofErr w:type="spellEnd"/>
+      <w:r>
+        <w:t xml:space="preserve"> → Plot → Report</w:t>
+      </w:r>
+    </w:p>
+    <w:p>
+      <w:pPr>
+        <w:pStyle w:val="ListParagraph"/>
+      </w:pPr>
+      <w:r>
+        <w:t>Tool Use Uses Python/Matplotlib to clean and plot</w:t>
+      </w:r>
+    </w:p>
+    <w:p>
+      <w:pPr>
+        <w:pStyle w:val="ListParagraph"/>
+      </w:pPr>
+      <w:r>
+        <w:t>Execution Performs each step in sequence</w:t>
+      </w:r>
+    </w:p>
+    <w:p>
+      <w:pPr>
+        <w:pStyle w:val="ListParagraph"/>
+      </w:pPr>
+      <w:r>
+        <w:t>Reflection Notices missing data → retries or adjusts</w:t>
+      </w:r>
+    </w:p>
+    <w:p>
+      <w:pPr>
+        <w:pStyle w:val="ListParagraph"/>
+      </w:pPr>
+      <w:r>
+        <w:t>Final Output Returns plots + insights</w:t>
+      </w:r>
+    </w:p>
+    <w:p>
+      <w:pPr>
+        <w:pStyle w:val="ListParagraph"/>
+      </w:pPr>
+      <w:r>
+        <w:t> </w:t>
+      </w:r>
+    </w:p>
+    <w:p>
+      <w:pPr>
+        <w:pStyle w:val="ListParagraph"/>
+      </w:pPr>
+      <w:r>
+        <w:rPr>
+          <w:rFonts w:ascii="Segoe UI Emoji" w:hAnsi="Segoe UI Emoji" w:cs="Segoe UI Emoji"/>
+        </w:rPr>
+        <w:t>✅</w:t>
+      </w:r>
+      <w:r>
+        <w:t xml:space="preserve"> Summary Table</w:t>
+      </w:r>
+    </w:p>
+    <w:p>
+      <w:pPr>
+        <w:pStyle w:val="ListParagraph"/>
+      </w:pPr>
+      <w:r>
+        <w:t>Term Meaning</w:t>
+      </w:r>
+    </w:p>
+    <w:p>
+      <w:pPr>
+        <w:pStyle w:val="ListParagraph"/>
+      </w:pPr>
+      <w:r>
+        <w:t>Agent (Agentic AI) Software that can plan, act, and adapt</w:t>
+      </w:r>
+    </w:p>
+    <w:p>
+      <w:pPr>
+        <w:pStyle w:val="ListParagraph"/>
+      </w:pPr>
+      <w:r>
+        <w:t>Types Task-based, Tool-using, Multi-agent, Memory agents</w:t>
+      </w:r>
+    </w:p>
+    <w:p>
+      <w:pPr>
+        <w:pStyle w:val="ListParagraph"/>
+      </w:pPr>
+      <w:r>
+        <w:t>Autonomous Agent Self-directed agent that completes tasks end-to-end</w:t>
+      </w:r>
+    </w:p>
+    <w:p>
+      <w:pPr>
+        <w:pStyle w:val="ListParagraph"/>
+      </w:pPr>
+      <w:r>
+        <w:t>Agent Loop Plan → Execute → Observe → Reflect → Repeat</w:t>
+      </w:r>
+    </w:p>
+    <w:p>
+      <w:pPr>
+        <w:pStyle w:val="ListParagraph"/>
+        <w:rPr>
+          <w:lang w:val="en-US"/>
+        </w:rPr>
+      </w:pPr>
+    </w:p>
+    <w:p>
+      <w:pPr>
+        <w:pStyle w:val="ListParagraph"/>
+        <w:rPr>
+          <w:lang w:val="en-US"/>
+        </w:rPr>
+      </w:pPr>
+    </w:p>
+    <w:p>
+      <w:pPr>
+        <w:pStyle w:val="ListParagraph"/>
+        <w:rPr>
+          <w:b/>
+          <w:bCs/>
+          <w:sz w:val="28"/>
+          <w:szCs w:val="28"/>
+        </w:rPr>
+      </w:pPr>
+      <w:proofErr w:type="spellStart"/>
+      <w:r>
+        <w:rPr>
+          <w:b/>
+          <w:bCs/>
+          <w:sz w:val="28"/>
+          <w:szCs w:val="28"/>
+        </w:rPr>
+        <w:t>DSPy</w:t>
+      </w:r>
+      <w:proofErr w:type="spellEnd"/>
+      <w:r>
+        <w:rPr>
+          <w:b/>
+          <w:bCs/>
+          <w:sz w:val="28"/>
+          <w:szCs w:val="28"/>
+        </w:rPr>
+        <w:t xml:space="preserve"> (Declarative Self-improving Python) – Notes</w:t>
+      </w:r>
+    </w:p>
+    <w:p>
+      <w:pPr>
+        <w:pStyle w:val="ListParagraph"/>
+      </w:pPr>
+      <w:r>
+        <w:t> </w:t>
+      </w:r>
+    </w:p>
+    <w:p>
+      <w:pPr>
+        <w:pStyle w:val="ListParagraph"/>
+      </w:pPr>
+      <w:r>
+        <w:rPr>
+          <w:rFonts w:ascii="Segoe UI Emoji" w:hAnsi="Segoe UI Emoji" w:cs="Segoe UI Emoji"/>
+        </w:rPr>
+        <w:t>🧠</w:t>
+      </w:r>
+      <w:r>
+        <w:t xml:space="preserve"> What is </w:t>
+      </w:r>
+      <w:proofErr w:type="spellStart"/>
+      <w:r>
+        <w:t>DSPy</w:t>
+      </w:r>
+      <w:proofErr w:type="spellEnd"/>
+      <w:r>
+        <w:t>?</w:t>
+      </w:r>
+    </w:p>
+    <w:p>
+      <w:pPr>
+        <w:pStyle w:val="ListParagraph"/>
+      </w:pPr>
+      <w:r>
+        <w:t> </w:t>
+      </w:r>
+    </w:p>
+    <w:p>
+      <w:pPr>
+        <w:pStyle w:val="ListParagraph"/>
+      </w:pPr>
+      <w:proofErr w:type="spellStart"/>
+      <w:r>
+        <w:t>DSPy</w:t>
+      </w:r>
+      <w:proofErr w:type="spellEnd"/>
+      <w:r>
+        <w:t xml:space="preserve"> is a Python framework to build modular, declarative, and self-improving workflows using large language models (LLMs).</w:t>
+      </w:r>
+    </w:p>
+    <w:p>
+      <w:pPr>
+        <w:pStyle w:val="ListParagraph"/>
+      </w:pPr>
+      <w:r>
+        <w:t> </w:t>
+      </w:r>
+    </w:p>
+    <w:p>
+      <w:pPr>
+        <w:pStyle w:val="ListParagraph"/>
+      </w:pPr>
+      <w:r>
+        <w:t>It allows you to define prompts and logic in a structured way, much like defining functions.</w:t>
+      </w:r>
+    </w:p>
+    <w:p>
+      <w:pPr>
+        <w:pStyle w:val="ListParagraph"/>
+      </w:pPr>
+      <w:r>
+        <w:t> </w:t>
+      </w:r>
+    </w:p>
+    <w:p>
+      <w:pPr>
+        <w:pStyle w:val="ListParagraph"/>
+      </w:pPr>
+      <w:r>
+        <w:t>Think of it as a bridge between traditional Python programming and LLM prompt engineering.</w:t>
+      </w:r>
+    </w:p>
+    <w:p>
+      <w:pPr>
+        <w:pStyle w:val="ListParagraph"/>
+      </w:pPr>
+      <w:r>
+        <w:t xml:space="preserve">Link </w:t>
+      </w:r>
+      <w:r>
+        <w:t xml:space="preserve">about </w:t>
+      </w:r>
+      <w:proofErr w:type="spellStart"/>
+      <w:proofErr w:type="gramStart"/>
+      <w:r>
+        <w:t>Dspy</w:t>
+      </w:r>
+      <w:proofErr w:type="spellEnd"/>
+      <w:r>
+        <w:t xml:space="preserve"> </w:t>
+      </w:r>
+      <w:r>
+        <w:t>:</w:t>
+      </w:r>
+      <w:proofErr w:type="gramEnd"/>
+      <w:r>
+        <w:t xml:space="preserve"> </w:t>
+      </w:r>
+      <w:r>
+        <w:t xml:space="preserve"> </w:t>
+      </w:r>
+      <w:hyperlink r:id="rId7" w:history="1">
+        <w:r>
+          <w:rPr>
+            <w:rStyle w:val="Hyperlink"/>
+          </w:rPr>
+          <w:t>https://dspy.ai/#__tabbed_1_5</w:t>
+        </w:r>
+      </w:hyperlink>
+    </w:p>
+    <w:p>
+      <w:pPr>
+        <w:pStyle w:val="ListParagraph"/>
+      </w:pPr>
+    </w:p>
+    <w:p>
+      <w:pPr>
+        <w:pStyle w:val="ListParagraph"/>
+      </w:pPr>
+      <w:r>
+        <w:t> </w:t>
+      </w:r>
+    </w:p>
+    <w:p>
+      <w:pPr>
+        <w:pStyle w:val="ListParagraph"/>
+      </w:pPr>
+      <w:r>
+        <w:rPr>
+          <w:rFonts w:ascii="Segoe UI Emoji" w:hAnsi="Segoe UI Emoji" w:cs="Segoe UI Emoji"/>
+        </w:rPr>
+        <w:t>🔧</w:t>
+      </w:r>
+      <w:r>
+        <w:t xml:space="preserve"> Key Concepts</w:t>
+      </w:r>
+    </w:p>
+    <w:p>
+      <w:pPr>
+        <w:pStyle w:val="ListParagraph"/>
+      </w:pPr>
+      <w:r>
+        <w:t> </w:t>
+      </w:r>
+    </w:p>
+    <w:p>
+      <w:pPr>
+        <w:pStyle w:val="ListParagraph"/>
+      </w:pPr>
+      <w:r>
+        <w:t>Concept Description</w:t>
+      </w:r>
+    </w:p>
+    <w:p>
+      <w:pPr>
+        <w:pStyle w:val="ListParagraph"/>
+      </w:pPr>
+      <w:r>
+        <w:t> </w:t>
+      </w:r>
+    </w:p>
+    <w:p>
+      <w:pPr>
+        <w:pStyle w:val="ListParagraph"/>
+      </w:pPr>
+      <w:proofErr w:type="spellStart"/>
+      <w:proofErr w:type="gramStart"/>
+      <w:r>
+        <w:t>dspy.Predict</w:t>
+      </w:r>
+      <w:proofErr w:type="spellEnd"/>
+      <w:proofErr w:type="gramEnd"/>
+      <w:r>
+        <w:t xml:space="preserve"> A base class to define a module that takes inputs and generates outputs using an LLM.</w:t>
+      </w:r>
+    </w:p>
+    <w:p>
+      <w:pPr>
+        <w:pStyle w:val="ListParagraph"/>
+      </w:pPr>
+      <w:r>
+        <w:t>signature Declares what the model should expect as inputs and what it should return.</w:t>
+      </w:r>
+    </w:p>
+    <w:p>
+      <w:pPr>
+        <w:pStyle w:val="ListParagraph"/>
+      </w:pPr>
+      <w:proofErr w:type="gramStart"/>
+      <w:r>
+        <w:t>forward(</w:t>
+      </w:r>
+      <w:proofErr w:type="gramEnd"/>
+      <w:r>
+        <w:t>) method Implements how the output is generated using the inputs.</w:t>
+      </w:r>
+    </w:p>
+    <w:p>
+      <w:pPr>
+        <w:pStyle w:val="ListParagraph"/>
+      </w:pPr>
+      <w:r>
+        <w:lastRenderedPageBreak/>
+        <w:t>Compiler Optimizes and compiles multiple modules into a pipeline.</w:t>
+      </w:r>
+    </w:p>
+    <w:p>
+      <w:pPr>
+        <w:pStyle w:val="ListParagraph"/>
+        <w:rPr>
+          <w:lang w:val="en-US"/>
+        </w:rPr>
+      </w:pPr>
+    </w:p>
+    <w:p>
+      <w:pPr>
+        <w:pStyle w:val="ListParagraph"/>
+        <w:rPr>
+          <w:lang w:val="en-US"/>
+        </w:rPr>
+      </w:pPr>
+      <w:proofErr w:type="spellStart"/>
+      <w:proofErr w:type="gramStart"/>
+      <w:r>
+        <w:rPr>
+          <w:lang w:val="en-US"/>
+        </w:rPr>
+        <w:t>Cmd</w:t>
+      </w:r>
+      <w:proofErr w:type="spellEnd"/>
+      <w:r>
+        <w:rPr>
+          <w:lang w:val="en-US"/>
+        </w:rPr>
+        <w:t xml:space="preserve"> :</w:t>
+      </w:r>
+      <w:proofErr w:type="gramEnd"/>
+    </w:p>
+    <w:p>
+      <w:pPr>
+        <w:pStyle w:val="ListParagraph"/>
+        <w:rPr>
+          <w:lang w:val="en-US"/>
+        </w:rPr>
+      </w:pPr>
+    </w:p>
+    <w:p>
+      <w:pPr>
+        <w:pStyle w:val="ListParagraph"/>
+        <w:rPr>
+          <w:lang w:val="en-US"/>
+        </w:rPr>
+      </w:pPr>
+      <w:r>
+        <w:rPr>
+          <w:lang w:val="en-US"/>
+        </w:rPr>
+        <w:t xml:space="preserve">pip install </w:t>
+      </w:r>
+      <w:proofErr w:type="spellStart"/>
+      <w:r>
+        <w:rPr>
+          <w:lang w:val="en-US"/>
+        </w:rPr>
+        <w:t>dspy</w:t>
+      </w:r>
+      <w:proofErr w:type="spellEnd"/>
+      <w:r>
+        <w:rPr>
+          <w:lang w:val="en-US"/>
+        </w:rPr>
+        <w:t>-ai</w:t>
+      </w:r>
+    </w:p>
     <w:sectPr>
-      <w:headerReference w:type="even" r:id="rId7"/>
-      <w:headerReference w:type="default" r:id="rId8"/>
-      <w:footerReference w:type="even" r:id="rId9"/>
-      <w:footerReference w:type="default" r:id="rId10"/>
-      <w:headerReference w:type="first" r:id="rId11"/>
-      <w:footerReference w:type="first" r:id="rId12"/>
+      <w:headerReference w:type="even" r:id="rId8"/>
+      <w:headerReference w:type="default" r:id="rId9"/>
+      <w:footerReference w:type="even" r:id="rId10"/>
+      <w:footerReference w:type="default" r:id="rId11"/>
+      <w:headerReference w:type="first" r:id="rId12"/>
+      <w:footerReference w:type="first" r:id="rId13"/>
       <w:pgSz w:w="11906" w:h="16838"/>
       <w:pgMar w:top="720" w:right="720" w:bottom="720" w:left="720" w:header="708" w:footer="708" w:gutter="0"/>
       <w:pgBorders w:offsetFrom="page">
@@ -10652,6 +12083,29 @@
     <w:uiPriority w:val="99"/>
     <w:rsid w:val="00C1662B"/>
   </w:style>
+  <w:style w:type="character" w:styleId="Hyperlink">
+    <w:name w:val="Hyperlink"/>
+    <w:basedOn w:val="DefaultParagraphFont"/>
+    <w:uiPriority w:val="99"/>
+    <w:unhideWhenUsed/>
+    <w:rsid w:val="00E9141B"/>
+    <w:rPr>
+      <w:color w:val="467886" w:themeColor="hyperlink"/>
+      <w:u w:val="single"/>
+    </w:rPr>
+  </w:style>
+  <w:style w:type="character" w:styleId="UnresolvedMention">
+    <w:name w:val="Unresolved Mention"/>
+    <w:basedOn w:val="DefaultParagraphFont"/>
+    <w:uiPriority w:val="99"/>
+    <w:semiHidden/>
+    <w:unhideWhenUsed/>
+    <w:rsid w:val="00E9141B"/>
+    <w:rPr>
+      <w:color w:val="605E5C"/>
+      <w:shd w:val="clear" w:color="auto" w:fill="E1DFDD"/>
+    </w:rPr>
+  </w:style>
 </w:styles>
 </file>
 

</xml_diff>

<commit_message>
Langchain Notes Added in Document
</commit_message>
<xml_diff>
--- a/Learning_material.docx
+++ b/Learning_material.docx
@@ -8851,7 +8851,7 @@
       <w:r>
         <w:t xml:space="preserve"> </w:t>
       </w:r>
-      <w:hyperlink r:id="rId7" w:history="1">
+      <w:hyperlink r:id="rId7" w:anchor="__tabbed_1_5" w:history="1">
         <w:r>
           <w:rPr>
             <w:rStyle w:val="Hyperlink"/>
@@ -9023,6 +9023,895 @@
         </w:rPr>
         <w:t>-ai</w:t>
       </w:r>
+    </w:p>
+    <w:p>
+      <w:pPr>
+        <w:pStyle w:val="ListParagraph"/>
+        <w:rPr>
+          <w:lang w:val="en-US"/>
+        </w:rPr>
+      </w:pPr>
+    </w:p>
+    <w:p>
+      <w:pPr>
+        <w:pStyle w:val="ListParagraph"/>
+        <w:rPr>
+          <w:lang w:val="en-US"/>
+        </w:rPr>
+      </w:pPr>
+      <w:r>
+        <w:rPr>
+          <w:lang w:val="en-US"/>
+        </w:rPr>
+        <w:t>pip install "</w:t>
+      </w:r>
+      <w:proofErr w:type="spellStart"/>
+      <w:r>
+        <w:rPr>
+          <w:lang w:val="en-US"/>
+        </w:rPr>
+        <w:t>dspy</w:t>
+      </w:r>
+      <w:proofErr w:type="spellEnd"/>
+      <w:r>
+        <w:rPr>
+          <w:lang w:val="en-US"/>
+        </w:rPr>
+        <w:t>-ai[</w:t>
+      </w:r>
+      <w:proofErr w:type="spellStart"/>
+      <w:r>
+        <w:rPr>
+          <w:lang w:val="en-US"/>
+        </w:rPr>
+        <w:t>openai</w:t>
+      </w:r>
+      <w:proofErr w:type="spellEnd"/>
+      <w:r>
+        <w:rPr>
+          <w:lang w:val="en-US"/>
+        </w:rPr>
+        <w:t>]"</w:t>
+      </w:r>
+    </w:p>
+    <w:p>
+      <w:pPr>
+        <w:pStyle w:val="ListParagraph"/>
+        <w:rPr>
+          <w:lang w:val="en-US"/>
+        </w:rPr>
+      </w:pPr>
+      <w:proofErr w:type="gramStart"/>
+      <w:r>
+        <w:rPr>
+          <w:lang w:val="en-US"/>
+        </w:rPr>
+        <w:t>Code :</w:t>
+      </w:r>
+      <w:proofErr w:type="gramEnd"/>
+      <w:r>
+        <w:rPr>
+          <w:lang w:val="en-US"/>
+        </w:rPr>
+        <w:t xml:space="preserve"> </w:t>
+      </w:r>
+    </w:p>
+    <w:p>
+      <w:pPr>
+        <w:pStyle w:val="ListParagraph"/>
+      </w:pPr>
+      <w:r>
+        <w:t xml:space="preserve">import </w:t>
+      </w:r>
+      <w:proofErr w:type="spellStart"/>
+      <w:r>
+        <w:t>dspy</w:t>
+      </w:r>
+      <w:proofErr w:type="spellEnd"/>
+    </w:p>
+    <w:p>
+      <w:pPr>
+        <w:pStyle w:val="ListParagraph"/>
+      </w:pPr>
+    </w:p>
+    <w:p>
+      <w:pPr>
+        <w:pStyle w:val="ListParagraph"/>
+      </w:pPr>
+      <w:r>
+        <w:t xml:space="preserve">class </w:t>
+      </w:r>
+      <w:proofErr w:type="spellStart"/>
+      <w:r>
+        <w:t>Helloworld</w:t>
+      </w:r>
+      <w:proofErr w:type="spellEnd"/>
+      <w:r>
+        <w:t>(</w:t>
+      </w:r>
+      <w:proofErr w:type="spellStart"/>
+      <w:proofErr w:type="gramStart"/>
+      <w:r>
+        <w:t>dspy.Predict</w:t>
+      </w:r>
+      <w:proofErr w:type="spellEnd"/>
+      <w:proofErr w:type="gramEnd"/>
+      <w:r>
+        <w:t>):</w:t>
+      </w:r>
+    </w:p>
+    <w:p>
+      <w:pPr>
+        <w:pStyle w:val="ListParagraph"/>
+      </w:pPr>
+      <w:r>
+        <w:t>    def __</w:t>
+      </w:r>
+      <w:proofErr w:type="spellStart"/>
+      <w:r>
+        <w:t>init</w:t>
+      </w:r>
+      <w:proofErr w:type="spellEnd"/>
+      <w:r>
+        <w:t>__(self):</w:t>
+      </w:r>
+    </w:p>
+    <w:p>
+      <w:pPr>
+        <w:pStyle w:val="ListParagraph"/>
+      </w:pPr>
+      <w:r>
+        <w:t>        super(</w:t>
+      </w:r>
+      <w:proofErr w:type="gramStart"/>
+      <w:r>
+        <w:t>)._</w:t>
+      </w:r>
+      <w:proofErr w:type="gramEnd"/>
+      <w:r>
+        <w:t>_</w:t>
+      </w:r>
+      <w:proofErr w:type="spellStart"/>
+      <w:r>
+        <w:t>init</w:t>
+      </w:r>
+      <w:proofErr w:type="spellEnd"/>
+      <w:r>
+        <w:t>__(signature="username-&gt;message")</w:t>
+      </w:r>
+    </w:p>
+    <w:p>
+      <w:pPr>
+        <w:pStyle w:val="ListParagraph"/>
+      </w:pPr>
+    </w:p>
+    <w:p>
+      <w:pPr>
+        <w:pStyle w:val="ListParagraph"/>
+      </w:pPr>
+      <w:r>
+        <w:t>    def forward(</w:t>
+      </w:r>
+      <w:proofErr w:type="spellStart"/>
+      <w:proofErr w:type="gramStart"/>
+      <w:r>
+        <w:t>self,name</w:t>
+      </w:r>
+      <w:proofErr w:type="gramEnd"/>
+      <w:r>
+        <w:t>:str</w:t>
+      </w:r>
+      <w:proofErr w:type="spellEnd"/>
+      <w:r>
+        <w:t>)-&gt;str:</w:t>
+      </w:r>
+    </w:p>
+    <w:p>
+      <w:pPr>
+        <w:pStyle w:val="ListParagraph"/>
+      </w:pPr>
+      <w:r>
+        <w:t xml:space="preserve">        return </w:t>
+      </w:r>
+      <w:proofErr w:type="spellStart"/>
+      <w:r>
+        <w:t>f"Hello</w:t>
+      </w:r>
+      <w:proofErr w:type="spellEnd"/>
+      <w:r>
+        <w:t xml:space="preserve"> {name} welcome to </w:t>
+      </w:r>
+      <w:proofErr w:type="spellStart"/>
+      <w:r>
+        <w:t>Dspy</w:t>
+      </w:r>
+      <w:proofErr w:type="spellEnd"/>
+      <w:r>
+        <w:t>"</w:t>
+      </w:r>
+    </w:p>
+    <w:p>
+      <w:pPr>
+        <w:pStyle w:val="ListParagraph"/>
+      </w:pPr>
+      <w:r>
+        <w:t xml:space="preserve">    </w:t>
+      </w:r>
+    </w:p>
+    <w:p>
+      <w:pPr>
+        <w:pStyle w:val="ListParagraph"/>
+      </w:pPr>
+    </w:p>
+    <w:p>
+      <w:pPr>
+        <w:pStyle w:val="ListParagraph"/>
+      </w:pPr>
+      <w:r>
+        <w:t xml:space="preserve">predictor = </w:t>
+      </w:r>
+      <w:proofErr w:type="spellStart"/>
+      <w:proofErr w:type="gramStart"/>
+      <w:r>
+        <w:t>Helloworld</w:t>
+      </w:r>
+      <w:proofErr w:type="spellEnd"/>
+      <w:r>
+        <w:t>(</w:t>
+      </w:r>
+      <w:proofErr w:type="gramEnd"/>
+      <w:r>
+        <w:t>)</w:t>
+      </w:r>
+    </w:p>
+    <w:p>
+      <w:pPr>
+        <w:pStyle w:val="ListParagraph"/>
+      </w:pPr>
+    </w:p>
+    <w:p>
+      <w:pPr>
+        <w:pStyle w:val="ListParagraph"/>
+      </w:pPr>
+      <w:r>
+        <w:t>print(predictor(name="Voonna"))</w:t>
+      </w:r>
+    </w:p>
+    <w:p>
+      <w:pPr>
+        <w:pStyle w:val="ListParagraph"/>
+        <w:rPr>
+          <w:lang w:val="en-US"/>
+        </w:rPr>
+      </w:pPr>
+    </w:p>
+    <w:p>
+      <w:pPr>
+        <w:pStyle w:val="ListParagraph"/>
+        <w:rPr>
+          <w:lang w:val="en-US"/>
+        </w:rPr>
+      </w:pPr>
+    </w:p>
+    <w:p>
+      <w:pPr>
+        <w:pStyle w:val="ListParagraph"/>
+        <w:rPr>
+          <w:lang w:val="en-US"/>
+        </w:rPr>
+      </w:pPr>
+    </w:p>
+    <w:p>
+      <w:pPr>
+        <w:pStyle w:val="ListParagraph"/>
+        <w:rPr>
+          <w:b/>
+          <w:bCs/>
+          <w:sz w:val="28"/>
+          <w:szCs w:val="28"/>
+        </w:rPr>
+      </w:pPr>
+      <w:r>
+        <w:rPr>
+          <w:rFonts w:ascii="Segoe UI Emoji" w:hAnsi="Segoe UI Emoji" w:cs="Segoe UI Emoji"/>
+          <w:b/>
+          <w:bCs/>
+          <w:sz w:val="28"/>
+          <w:szCs w:val="28"/>
+        </w:rPr>
+        <w:t>📘</w:t>
+      </w:r>
+      <w:r>
+        <w:rPr>
+          <w:b/>
+          <w:bCs/>
+          <w:sz w:val="28"/>
+          <w:szCs w:val="28"/>
+        </w:rPr>
+        <w:t xml:space="preserve"> </w:t>
+      </w:r>
+      <w:proofErr w:type="spellStart"/>
+      <w:r>
+        <w:rPr>
+          <w:b/>
+          <w:bCs/>
+          <w:sz w:val="28"/>
+          <w:szCs w:val="28"/>
+        </w:rPr>
+        <w:t>LangChain</w:t>
+      </w:r>
+      <w:proofErr w:type="spellEnd"/>
+      <w:r>
+        <w:rPr>
+          <w:b/>
+          <w:bCs/>
+          <w:sz w:val="28"/>
+          <w:szCs w:val="28"/>
+        </w:rPr>
+        <w:t xml:space="preserve"> Notes</w:t>
+      </w:r>
+    </w:p>
+    <w:p>
+      <w:pPr>
+        <w:pStyle w:val="ListParagraph"/>
+        <w:rPr>
+          <w:b/>
+          <w:bCs/>
+          <w:sz w:val="28"/>
+          <w:szCs w:val="28"/>
+        </w:rPr>
+      </w:pPr>
+      <w:r>
+        <w:rPr>
+          <w:b/>
+          <w:bCs/>
+          <w:sz w:val="28"/>
+          <w:szCs w:val="28"/>
+        </w:rPr>
+        <w:t> </w:t>
+      </w:r>
+    </w:p>
+    <w:p>
+      <w:pPr>
+        <w:pStyle w:val="ListParagraph"/>
+      </w:pPr>
+      <w:r>
+        <w:rPr>
+          <w:rFonts w:ascii="Segoe UI Emoji" w:hAnsi="Segoe UI Emoji" w:cs="Segoe UI Emoji"/>
+        </w:rPr>
+        <w:t>🔹</w:t>
+      </w:r>
+      <w:r>
+        <w:t xml:space="preserve"> </w:t>
+      </w:r>
+      <w:r>
+        <w:rPr>
+          <w:b/>
+          <w:bCs/>
+        </w:rPr>
+        <w:t xml:space="preserve">What is </w:t>
+      </w:r>
+      <w:proofErr w:type="spellStart"/>
+      <w:r>
+        <w:rPr>
+          <w:b/>
+          <w:bCs/>
+        </w:rPr>
+        <w:t>LangChain</w:t>
+      </w:r>
+      <w:proofErr w:type="spellEnd"/>
+      <w:r>
+        <w:rPr>
+          <w:b/>
+          <w:bCs/>
+        </w:rPr>
+        <w:t>?</w:t>
+      </w:r>
+    </w:p>
+    <w:p>
+      <w:pPr>
+        <w:pStyle w:val="ListParagraph"/>
+      </w:pPr>
+      <w:r>
+        <w:t> </w:t>
+      </w:r>
+    </w:p>
+    <w:p>
+      <w:pPr>
+        <w:pStyle w:val="ListParagraph"/>
+      </w:pPr>
+      <w:proofErr w:type="spellStart"/>
+      <w:r>
+        <w:t>LangChain</w:t>
+      </w:r>
+      <w:proofErr w:type="spellEnd"/>
+      <w:r>
+        <w:t xml:space="preserve"> is an open-source Python framework designed to build applications with Large Language Models (LLMs). It allows developers to create powerful, context-aware, and data-connected AI apps using components like prompts, chains, agents, memory, and retrievers.</w:t>
+      </w:r>
+    </w:p>
+    <w:p>
+      <w:pPr>
+        <w:pStyle w:val="ListParagraph"/>
+      </w:pPr>
+      <w:r>
+        <w:t> </w:t>
+      </w:r>
+    </w:p>
+    <w:p>
+      <w:pPr>
+        <w:pStyle w:val="ListParagraph"/>
+      </w:pPr>
+      <w:r>
+        <w:t> </w:t>
+      </w:r>
+    </w:p>
+    <w:p>
+      <w:pPr>
+        <w:pStyle w:val="ListParagraph"/>
+      </w:pPr>
+      <w:r>
+        <w:t>---</w:t>
+      </w:r>
+    </w:p>
+    <w:p>
+      <w:pPr>
+        <w:pStyle w:val="ListParagraph"/>
+      </w:pPr>
+      <w:r>
+        <w:t> </w:t>
+      </w:r>
+    </w:p>
+    <w:p>
+      <w:pPr>
+        <w:pStyle w:val="ListParagraph"/>
+      </w:pPr>
+      <w:r>
+        <w:rPr>
+          <w:rFonts w:ascii="Segoe UI Emoji" w:hAnsi="Segoe UI Emoji" w:cs="Segoe UI Emoji"/>
+        </w:rPr>
+        <w:t>🔹</w:t>
+      </w:r>
+      <w:r>
+        <w:t xml:space="preserve"> Why Use </w:t>
+      </w:r>
+      <w:proofErr w:type="spellStart"/>
+      <w:r>
+        <w:t>LangChain</w:t>
+      </w:r>
+      <w:proofErr w:type="spellEnd"/>
+      <w:r>
+        <w:t>?</w:t>
+      </w:r>
+    </w:p>
+    <w:p>
+      <w:pPr>
+        <w:pStyle w:val="ListParagraph"/>
+      </w:pPr>
+      <w:r>
+        <w:t> </w:t>
+      </w:r>
+    </w:p>
+    <w:p>
+      <w:pPr>
+        <w:pStyle w:val="ListParagraph"/>
+      </w:pPr>
+      <w:proofErr w:type="spellStart"/>
+      <w:r>
+        <w:t>LangChain</w:t>
+      </w:r>
+      <w:proofErr w:type="spellEnd"/>
+      <w:r>
+        <w:t xml:space="preserve"> simplifies the process of:</w:t>
+      </w:r>
+    </w:p>
+    <w:p>
+      <w:pPr>
+        <w:pStyle w:val="ListParagraph"/>
+      </w:pPr>
+      <w:r>
+        <w:t> </w:t>
+      </w:r>
+    </w:p>
+    <w:p>
+      <w:pPr>
+        <w:pStyle w:val="ListParagraph"/>
+      </w:pPr>
+      <w:r>
+        <w:t>Creating multi-step LLM workflows</w:t>
+      </w:r>
+    </w:p>
+    <w:p>
+      <w:pPr>
+        <w:pStyle w:val="ListParagraph"/>
+      </w:pPr>
+      <w:r>
+        <w:t> </w:t>
+      </w:r>
+    </w:p>
+    <w:p>
+      <w:pPr>
+        <w:pStyle w:val="ListParagraph"/>
+      </w:pPr>
+      <w:r>
+        <w:t>Connecting LLMs with external data (files, web, DBs)</w:t>
+      </w:r>
+    </w:p>
+    <w:p>
+      <w:pPr>
+        <w:pStyle w:val="ListParagraph"/>
+      </w:pPr>
+      <w:r>
+        <w:t> </w:t>
+      </w:r>
+    </w:p>
+    <w:p>
+      <w:pPr>
+        <w:pStyle w:val="ListParagraph"/>
+      </w:pPr>
+      <w:r>
+        <w:lastRenderedPageBreak/>
+        <w:t>Managing conversational memory</w:t>
+      </w:r>
+    </w:p>
+    <w:p>
+      <w:pPr>
+        <w:pStyle w:val="ListParagraph"/>
+      </w:pPr>
+      <w:r>
+        <w:t> </w:t>
+      </w:r>
+    </w:p>
+    <w:p>
+      <w:pPr>
+        <w:pStyle w:val="ListParagraph"/>
+      </w:pPr>
+      <w:r>
+        <w:t>Enabling agents to make decisions and use tools</w:t>
+      </w:r>
+    </w:p>
+    <w:p>
+      <w:pPr>
+        <w:pStyle w:val="ListParagraph"/>
+      </w:pPr>
+      <w:r>
+        <w:t> </w:t>
+      </w:r>
+    </w:p>
+    <w:p>
+      <w:pPr>
+        <w:pStyle w:val="ListParagraph"/>
+      </w:pPr>
+      <w:r>
+        <w:t>Building scalable, production-ready LLM-powered applications</w:t>
+      </w:r>
+    </w:p>
+    <w:p>
+      <w:pPr>
+        <w:pStyle w:val="ListParagraph"/>
+      </w:pPr>
+      <w:r>
+        <w:t> </w:t>
+      </w:r>
+    </w:p>
+    <w:p>
+      <w:pPr>
+        <w:pStyle w:val="ListParagraph"/>
+      </w:pPr>
+      <w:r>
+        <w:t> </w:t>
+      </w:r>
+    </w:p>
+    <w:p>
+      <w:pPr>
+        <w:pStyle w:val="ListParagraph"/>
+      </w:pPr>
+      <w:r>
+        <w:t> </w:t>
+      </w:r>
+    </w:p>
+    <w:p>
+      <w:pPr>
+        <w:pStyle w:val="ListParagraph"/>
+      </w:pPr>
+      <w:r>
+        <w:t>---</w:t>
+      </w:r>
+    </w:p>
+    <w:p>
+      <w:pPr>
+        <w:pStyle w:val="ListParagraph"/>
+      </w:pPr>
+      <w:r>
+        <w:t> </w:t>
+      </w:r>
+    </w:p>
+    <w:p>
+      <w:pPr>
+        <w:pStyle w:val="ListParagraph"/>
+      </w:pPr>
+      <w:r>
+        <w:rPr>
+          <w:rFonts w:ascii="Segoe UI Emoji" w:hAnsi="Segoe UI Emoji" w:cs="Segoe UI Emoji"/>
+        </w:rPr>
+        <w:t>🔹</w:t>
+      </w:r>
+      <w:r>
+        <w:t xml:space="preserve"> Core Components</w:t>
+      </w:r>
+    </w:p>
+    <w:p>
+      <w:pPr>
+        <w:pStyle w:val="ListParagraph"/>
+      </w:pPr>
+      <w:r>
+        <w:t> </w:t>
+      </w:r>
+    </w:p>
+    <w:p>
+      <w:pPr>
+        <w:pStyle w:val="ListParagraph"/>
+      </w:pPr>
+      <w:r>
+        <w:t>Component Description</w:t>
+      </w:r>
+    </w:p>
+    <w:p>
+      <w:pPr>
+        <w:pStyle w:val="ListParagraph"/>
+      </w:pPr>
+      <w:r>
+        <w:t> </w:t>
+      </w:r>
+    </w:p>
+    <w:p>
+      <w:pPr>
+        <w:pStyle w:val="ListParagraph"/>
+      </w:pPr>
+      <w:r>
+        <w:rPr>
+          <w:rFonts w:ascii="Segoe UI Emoji" w:hAnsi="Segoe UI Emoji" w:cs="Segoe UI Emoji"/>
+        </w:rPr>
+        <w:t>🔸</w:t>
+      </w:r>
+      <w:r>
+        <w:t xml:space="preserve"> </w:t>
+      </w:r>
+      <w:proofErr w:type="spellStart"/>
+      <w:r>
+        <w:t>PromptTemplate</w:t>
+      </w:r>
+      <w:proofErr w:type="spellEnd"/>
+      <w:r>
+        <w:t xml:space="preserve"> Used to format dynamic prompts for LLMs</w:t>
+      </w:r>
+    </w:p>
+    <w:p>
+      <w:pPr>
+        <w:pStyle w:val="ListParagraph"/>
+      </w:pPr>
+      <w:r>
+        <w:rPr>
+          <w:rFonts w:ascii="Segoe UI Emoji" w:hAnsi="Segoe UI Emoji" w:cs="Segoe UI Emoji"/>
+        </w:rPr>
+        <w:t>🔸</w:t>
+      </w:r>
+      <w:r>
+        <w:t xml:space="preserve"> </w:t>
+      </w:r>
+      <w:proofErr w:type="spellStart"/>
+      <w:r>
+        <w:t>LLMChain</w:t>
+      </w:r>
+      <w:proofErr w:type="spellEnd"/>
+      <w:r>
+        <w:t xml:space="preserve"> A simple chain that takes a prompt and passes it to the LLM</w:t>
+      </w:r>
+    </w:p>
+    <w:p>
+      <w:pPr>
+        <w:pStyle w:val="ListParagraph"/>
+      </w:pPr>
+      <w:r>
+        <w:rPr>
+          <w:rFonts w:ascii="Segoe UI Emoji" w:hAnsi="Segoe UI Emoji" w:cs="Segoe UI Emoji"/>
+        </w:rPr>
+        <w:t>🔸</w:t>
+      </w:r>
+      <w:r>
+        <w:t xml:space="preserve"> Memory Stores and retrieves past interactions</w:t>
+      </w:r>
+    </w:p>
+    <w:p>
+      <w:pPr>
+        <w:pStyle w:val="ListParagraph"/>
+      </w:pPr>
+      <w:r>
+        <w:rPr>
+          <w:rFonts w:ascii="Segoe UI Emoji" w:hAnsi="Segoe UI Emoji" w:cs="Segoe UI Emoji"/>
+        </w:rPr>
+        <w:t>🔸</w:t>
+      </w:r>
+      <w:r>
+        <w:t xml:space="preserve"> Agent Chooses tools dynamically based on input</w:t>
+      </w:r>
+    </w:p>
+    <w:p>
+      <w:pPr>
+        <w:pStyle w:val="ListParagraph"/>
+      </w:pPr>
+      <w:r>
+        <w:rPr>
+          <w:rFonts w:ascii="Segoe UI Emoji" w:hAnsi="Segoe UI Emoji" w:cs="Segoe UI Emoji"/>
+        </w:rPr>
+        <w:t>🔸</w:t>
+      </w:r>
+      <w:r>
+        <w:t xml:space="preserve"> Tool External functions like web search, calculator, DB access</w:t>
+      </w:r>
+    </w:p>
+    <w:p>
+      <w:pPr>
+        <w:pStyle w:val="ListParagraph"/>
+      </w:pPr>
+      <w:r>
+        <w:rPr>
+          <w:rFonts w:ascii="Segoe UI Emoji" w:hAnsi="Segoe UI Emoji" w:cs="Segoe UI Emoji"/>
+        </w:rPr>
+        <w:t>🔸</w:t>
+      </w:r>
+      <w:r>
+        <w:t xml:space="preserve"> Retriever Fetches relevant info from documents for Q&amp;A</w:t>
+      </w:r>
+    </w:p>
+    <w:p>
+      <w:pPr>
+        <w:pStyle w:val="ListParagraph"/>
+      </w:pPr>
+      <w:r>
+        <w:rPr>
+          <w:rFonts w:ascii="Segoe UI Emoji" w:hAnsi="Segoe UI Emoji" w:cs="Segoe UI Emoji"/>
+        </w:rPr>
+        <w:t>🔸</w:t>
+      </w:r>
+      <w:r>
+        <w:t xml:space="preserve"> Document Loaders Load data from PDFs, web pages, etc.</w:t>
+      </w:r>
+    </w:p>
+    <w:p>
+      <w:pPr>
+        <w:pStyle w:val="ListParagraph"/>
+      </w:pPr>
+      <w:r>
+        <w:t> </w:t>
+      </w:r>
+    </w:p>
+    <w:p>
+      <w:pPr>
+        <w:pStyle w:val="ListParagraph"/>
+      </w:pPr>
+      <w:r>
+        <w:t> </w:t>
+      </w:r>
+    </w:p>
+    <w:p>
+      <w:pPr>
+        <w:pStyle w:val="ListParagraph"/>
+      </w:pPr>
+      <w:r>
+        <w:t> </w:t>
+      </w:r>
+    </w:p>
+    <w:p>
+      <w:pPr>
+        <w:pStyle w:val="ListParagraph"/>
+      </w:pPr>
+      <w:r>
+        <w:t>---</w:t>
+      </w:r>
+    </w:p>
+    <w:p>
+      <w:pPr>
+        <w:pStyle w:val="ListParagraph"/>
+      </w:pPr>
+      <w:r>
+        <w:t> </w:t>
+      </w:r>
+    </w:p>
+    <w:p>
+      <w:pPr>
+        <w:pStyle w:val="ListParagraph"/>
+      </w:pPr>
+      <w:r>
+        <w:rPr>
+          <w:rFonts w:ascii="Segoe UI Emoji" w:hAnsi="Segoe UI Emoji" w:cs="Segoe UI Emoji"/>
+        </w:rPr>
+        <w:t>🔹</w:t>
+      </w:r>
+      <w:r>
+        <w:t xml:space="preserve"> Installation</w:t>
+      </w:r>
+    </w:p>
+    <w:p>
+      <w:pPr>
+        <w:pStyle w:val="ListParagraph"/>
+      </w:pPr>
+      <w:r>
+        <w:t> </w:t>
+      </w:r>
+    </w:p>
+    <w:p>
+      <w:pPr>
+        <w:pStyle w:val="ListParagraph"/>
+      </w:pPr>
+      <w:r>
+        <w:t xml:space="preserve">pip install </w:t>
+      </w:r>
+      <w:proofErr w:type="spellStart"/>
+      <w:r>
+        <w:t>langchain</w:t>
+      </w:r>
+      <w:proofErr w:type="spellEnd"/>
+    </w:p>
+    <w:p>
+      <w:pPr>
+        <w:pStyle w:val="ListParagraph"/>
+      </w:pPr>
+      <w:r>
+        <w:t> </w:t>
+      </w:r>
+    </w:p>
+    <w:p>
+      <w:pPr>
+        <w:pStyle w:val="ListParagraph"/>
+      </w:pPr>
+      <w:r>
+        <w:t>You may also need:</w:t>
+      </w:r>
+    </w:p>
+    <w:p>
+      <w:pPr>
+        <w:pStyle w:val="ListParagraph"/>
+      </w:pPr>
+      <w:r>
+        <w:t> </w:t>
+      </w:r>
+    </w:p>
+    <w:p>
+      <w:pPr>
+        <w:pStyle w:val="ListParagraph"/>
+      </w:pPr>
+      <w:r>
+        <w:t xml:space="preserve">pip install </w:t>
+      </w:r>
+      <w:proofErr w:type="spellStart"/>
+      <w:r>
+        <w:t>openai</w:t>
+      </w:r>
+      <w:proofErr w:type="spellEnd"/>
+      <w:r>
+        <w:t xml:space="preserve"> </w:t>
+      </w:r>
+      <w:proofErr w:type="spellStart"/>
+      <w:r>
+        <w:t>chromadb</w:t>
+      </w:r>
+      <w:proofErr w:type="spellEnd"/>
+      <w:r>
+        <w:t xml:space="preserve"> </w:t>
+      </w:r>
+      <w:proofErr w:type="spellStart"/>
+      <w:r>
+        <w:t>faiss-cpu</w:t>
+      </w:r>
+      <w:proofErr w:type="spellEnd"/>
+    </w:p>
+    <w:p>
+      <w:pPr>
+        <w:pStyle w:val="ListParagraph"/>
+        <w:rPr>
+          <w:lang w:val="en-US"/>
+        </w:rPr>
+      </w:pPr>
     </w:p>
     <w:sectPr>
       <w:headerReference w:type="even" r:id="rId8"/>

</xml_diff>